<commit_message>
Framework: focus on GeoAI models and RGB/LiDAR/hyperspectral data
Co-Authored-By: Claude Opus 5.5 <noreply@anthropic.com>
Claude-Session: https://claude.ai/code/session_0132bxCMLAKTHUnyQV3MmGfs
</commit_message>
<xml_diff>
--- a/thesis/Proposed_Research_Framework_Poudel.docx
+++ b/thesis/Proposed_Research_Framework_Poudel.docx
@@ -56,17 +56,16 @@
           <w:sz w:val="26"/>
           <w:szCs w:val="26"/>
         </w:rPr>
-        <w:t xml:space="preserve">1. Purpose of the Framework</w:t>
-      </w:r>
-    </w:p>
-    <w:p>
-      <w:pPr>
-        <w:spacing w:after="160" w:line="360"/>
-        <w:ind w:firstLine="0"/>
-        <w:jc w:val="both"/>
-      </w:pPr>
-      <w:r>
-        <w:t xml:space="preserve">This framework sets out the ideas that guide my research and shows how they lead to my research questions, methods and expected outcomes. It draws on three bodies of knowledge. Ecology explains what needs to be mapped at LBJ National Grassland and why. Remote sensing explains which measurable signals can tell trees and tree species apart. Artificial intelligence explains how crowns can be extracted from those signals. Bringing the three together produces a single proposition that the study is designed to test, and every research question, dataset and analysis described below can be traced back to it.</w:t>
+        <w:t xml:space="preserve">1. Purpose and Focus of the Framework</w:t>
+      </w:r>
+    </w:p>
+    <w:p>
+      <w:pPr>
+        <w:spacing w:after="160" w:line="360"/>
+        <w:jc w:val="both"/>
+      </w:pPr>
+      <w:r>
+        <w:t xml:space="preserve">This framework explains how GeoAI models and multi-sensor airborne data are combined in my research to delineate individual tree crowns and identify their species. It rests on two pillars. The first is the data: RGB imagery, LiDAR and hyperspectral imagery, each of which measures a different property of a tree. The second is the models: supervised deep learning, vision foundation models and machine learning classifiers, each of which extracts information from images in a different way. The central idea of the framework is that the strengths of each data type can be matched to the needs of each model, so that the combination performs better than any single sensor or model alone. The research questions, methods and expected outcomes described below all follow from this idea.</w:t>
       </w:r>
     </w:p>
     <w:p>
@@ -80,7 +79,49 @@
           <w:sz w:val="26"/>
           <w:szCs w:val="26"/>
         </w:rPr>
-        <w:t xml:space="preserve">2. Theoretical Foundations</w:t>
+        <w:t xml:space="preserve">2. Application Context</w:t>
+      </w:r>
+    </w:p>
+    <w:p>
+      <w:pPr>
+        <w:spacing w:after="160" w:line="360"/>
+        <w:jc w:val="both"/>
+      </w:pPr>
+      <w:r>
+        <w:t xml:space="preserve">The framework is applied at LBJ National Grassland (NEON site CLBJ) in Wise County, Texas, an open Cross Timbers savanna of post oak and blackjack oak woodland mixed with grassland. Eastern redcedar (</w:t>
+      </w:r>
+      <w:r>
+        <w:rPr>
+          <w:i/>
+          <w:iCs/>
+        </w:rPr>
+        <w:t xml:space="preserve">Juniperus virginiana</w:t>
+      </w:r>
+      <w:r>
+        <w:t xml:space="preserve">) has been spreading into grasslands across the southern Great Plains as fire has become less frequent (Van Auken, 2000; Briggs et al., 2005; Twidwell et al., 2013), and its expansion has been mapped over recent decades in neighboring Oklahoma (Wang et al., 2017). The US Forest Service uses prescribed fire at LBJ to limit woody cover, including about 5,635 acres in the Denton Creek project (USDA Forest Service, 2013). This setting gives the framework its target: find every tree crown in an open landscape and tell native oaks apart from encroaching redcedar.</w:t>
+      </w:r>
+    </w:p>
+    <w:p>
+      <w:pPr>
+        <w:spacing w:after="120" w:before="240" w:line="360"/>
+      </w:pPr>
+      <w:r>
+        <w:rPr>
+          <w:b/>
+          <w:bCs/>
+          <w:sz w:val="26"/>
+          <w:szCs w:val="26"/>
+        </w:rPr>
+        <w:t xml:space="preserve">3. Data Foundation: RGB, LiDAR and Hyperspectral Imagery</w:t>
+      </w:r>
+    </w:p>
+    <w:p>
+      <w:pPr>
+        <w:spacing w:after="160" w:line="360"/>
+        <w:jc w:val="both"/>
+      </w:pPr>
+      <w:r>
+        <w:t xml:space="preserve">Individual tree mapping treats each crown, rather than each pixel, as the unit of analysis, because very high-resolution pixels are much smaller than the objects being mapped (Blaschke, 2010; Ke &amp; Quackenbush, 2011). Each of the three NEON sensors describes a crown in a different way, and the framework uses them for different purposes. All three are carried on the same aircraft of NEON’s Airborne Observation Platform and collected in the same flight, so they are closely co-registered (Kampe et al., 2010).</w:t>
       </w:r>
     </w:p>
     <w:p>
@@ -96,37 +137,16 @@
           <w:sz w:val="24"/>
           <w:szCs w:val="24"/>
         </w:rPr>
-        <w:t xml:space="preserve">2.1 Ecological foundation: woody encroachment in the Cross Timbers</w:t>
-      </w:r>
-    </w:p>
-    <w:p>
-      <w:pPr>
-        <w:spacing w:after="160" w:line="360"/>
-        <w:ind w:firstLine="0"/>
-        <w:jc w:val="both"/>
-      </w:pPr>
-      <w:r>
-        <w:t xml:space="preserve">Woody plant encroachment is one of the most widespread changes in North American grasslands and savannas (Van Auken, 2000; Archer et al., 2017). In the mesic grasslands of the southern Great Plains, a central driver is the loss of frequent fire. Without fire, fire-sensitive trees such as eastern redcedar (</w:t>
-      </w:r>
-      <w:r>
-        <w:rPr>
-          <w:i/>
-          <w:iCs/>
-        </w:rPr>
-        <w:t xml:space="preserve">Juniperus virginiana</w:t>
-      </w:r>
-      <w:r>
-        <w:t xml:space="preserve">) establish in open grassland. Once they grow large enough to survive fire and shade out the grass that carries it, a feedback develops that can shift grassland toward closed woodland (Briggs et al., 2005; Twidwell et al., 2013). Encroachment reduces plant diversity (Ratajczak et al., 2012), and redcedar has expanded rapidly in neighboring Oklahoma over recent decades (Wang et al., 2017).</w:t>
-      </w:r>
-    </w:p>
-    <w:p>
-      <w:pPr>
-        <w:spacing w:after="160" w:line="360"/>
-        <w:ind w:firstLine="0"/>
-        <w:jc w:val="both"/>
-      </w:pPr>
-      <w:r>
-        <w:t xml:space="preserve">The Cross Timbers is a mosaic of post oak and blackjack oak woodland and open grassland that forms the transition between eastern forests and the southern prairies (Hoagland et al., 1999). At LBJ National Grassland, parts of the Cross Timbers Research Natural Area are described as heavily invaded by young juniper (Cross Timbers Project, n.d.), and the US Forest Service uses prescribed fire across management units to limit woody cover, including about 5,635 acres in the Denton Creek project (USDA Forest Service, 2013). For this study, the ecological theory has two consequences. First, the meaningful mapping unit is the individual tree, because encroachment begins with single trees spreading into grass. Second, the key distinction is between native oaks and encroaching redcedar, which defines the classes I will map and motivates the optional change analysis.</w:t>
+        <w:t xml:space="preserve">3.1 RGB imagery: crown geometry and texture</w:t>
+      </w:r>
+    </w:p>
+    <w:p>
+      <w:pPr>
+        <w:spacing w:after="160" w:line="360"/>
+        <w:jc w:val="both"/>
+      </w:pPr>
+      <w:r>
+        <w:t xml:space="preserve">NEON’s digital camera produces orthorectified RGB mosaics at 10 cm resolution. At this resolution individual crowns, their edges and their internal texture are clearly visible, which is why most deep learning tree detectors, including DeepForest and Detectree2, are designed for RGB input (Weinstein et al., 2019; Ball et al., 2023). RGB imagery has two important limits in a savanna. It contains no height information, so a green tree crown and a green patch of grass or shrub can look similar, and neighboring crowns of similar color can merge into one. Shadows also change the apparent shape of crowns. In this framework, RGB imagery is the main input for detecting and outlining crowns, and its weaknesses are addressed by the other two sensors.</w:t>
       </w:r>
     </w:p>
     <w:p>
@@ -142,27 +162,16 @@
           <w:sz w:val="24"/>
           <w:szCs w:val="24"/>
         </w:rPr>
-        <w:t xml:space="preserve">2.2 Remote sensing foundation: what distinguishes trees and species</w:t>
-      </w:r>
-    </w:p>
-    <w:p>
-      <w:pPr>
-        <w:spacing w:after="160" w:line="360"/>
-        <w:ind w:firstLine="0"/>
-        <w:jc w:val="both"/>
-      </w:pPr>
-      <w:r>
-        <w:t xml:space="preserve">With very high-resolution imagery, individual pixels are much smaller than the objects of interest, so analysis should treat whole objects, not pixels, as the basic unit (Blaschke, 2010). Individual tree crown detection and delineation has developed along this line, first with optical imagery and later with LiDAR (Ke &amp; Quackenbush, 2011; Zhen et al., 2016). Each sensor captures a different property of the same tree. RGB imagery records two-dimensional crown shape and texture. LiDAR records three-dimensional structure; local height maxima in a canopy height model mark tree tops, and point clouds describe crown form (Popescu &amp; Wynne, 2004; Dong &amp; Chen, 2018; Roussel et al., 2020). Hyperspectral imagery records canopy reflectance, which depends on leaf pigments, water, dry matter and canopy architecture (Asner, 1998), and therefore differs among plant functional types and species (Ustin &amp; Gamon, 2010; Fassnacht et al., 2016). Across NEON sites, hyperspectral data have classified individual trees to species with an average accuracy of 0.77 (Marconi et al., 2022).</w:t>
-      </w:r>
-    </w:p>
-    <w:p>
-      <w:pPr>
-        <w:spacing w:after="160" w:line="360"/>
-        <w:ind w:firstLine="0"/>
-        <w:jc w:val="both"/>
-      </w:pPr>
-      <w:r>
-        <w:t xml:space="preserve">Multisensor fusion theory holds that sensors measuring complementary properties give better results together than separately (Pohl &amp; van Genderen, 1998), and combining LiDAR with hyperspectral data has improved tree-level mapping in forests (Dalponte &amp; Coomes, 2016; Scholl et al., 2021). NEON’s Airborne Observation Platform collects RGB, LiDAR and hyperspectral data together from one aircraft (Kampe et al., 2010), which makes LBJ a suitable place to test this idea at the level of individual trees. Evergreen, dense and conical redcedar crowns are expected to differ from broad, deciduous oak crowns in all three data types.</w:t>
+        <w:t xml:space="preserve">3.2 LiDAR: three-dimensional structure</w:t>
+      </w:r>
+    </w:p>
+    <w:p>
+      <w:pPr>
+        <w:spacing w:after="160" w:line="360"/>
+        <w:jc w:val="both"/>
+      </w:pPr>
+      <w:r>
+        <w:t xml:space="preserve">LiDAR records the three-dimensional position of laser returns from the canopy and the ground. From the point cloud, NEON derives a canopy height model at 1 m resolution that gives the height of vegetation above the ground. Local maxima in a canopy height model are a well-established way to locate individual tree tops (Popescu &amp; Wynne, 2004), and point clouds can be segmented into individual trees directly (Li et al., 2012; Roussel et al., 2020; Zhen et al., 2016). LiDAR remote sensing of vegetation structure is reviewed in detail by Dong and Chen (2018). In this framework, LiDAR plays two roles. It provides tree-top locations that can be used to prompt foundation models, and it provides a height filter that removes grass and low shrubs, which RGB imagery alone cannot do. It also adds structural features, such as height and crown shape, that help separate the dense, conical crowns of redcedar from the broader crowns of oaks.</w:t>
       </w:r>
     </w:p>
     <w:p>
@@ -178,119 +187,16 @@
           <w:sz w:val="24"/>
           <w:szCs w:val="24"/>
         </w:rPr>
-        <w:t xml:space="preserve">2.3 AI foundation: supervised deep learning versus foundation models</w:t>
-      </w:r>
-    </w:p>
-    <w:p>
-      <w:pPr>
-        <w:spacing w:after="160" w:line="360"/>
-        <w:ind w:firstLine="0"/>
-        <w:jc w:val="both"/>
-      </w:pPr>
-      <w:r>
-        <w:t xml:space="preserve">Supervised deep learning learns visual features directly from labeled examples and now dominates many remote sensing tasks (Zhu et al., 2017). DeepForest uses the RetinaNet detector (Lin et al., 2017) trained on NEON imagery with LiDAR-derived training labels (Weinstein et al., 2019, 2020), and Detectree2 builds on Mask R-CNN to outline crown boundaries (He et al., 2017; Ball et al., 2023). These models perform well where their training data come from, but they are affected by domain shift: accuracy tends to fall in landscapes that look different from the training sites. Open savanna is such a case, and CLBJ was left out of the NEON crown benchmark because too few trees met its criteria (Weinstein et al., 2021).</w:t>
-      </w:r>
-    </w:p>
-    <w:p>
-      <w:pPr>
-        <w:spacing w:after="160" w:line="360"/>
-        <w:ind w:firstLine="0"/>
-        <w:jc w:val="both"/>
-      </w:pPr>
-      <w:r>
-        <w:t xml:space="preserve">Foundation models take a different approach. They are trained on very large, broad datasets and then applied to many tasks (Bommasani et al., 2021). SAM was trained on more than one billion masks from eleven million images and can segment objects from simple prompts such as points or boxes (Kirillov et al., 2023). SAM 2 extends this to video and is reported to be more accurate and about six times faster than SAM on images (Ravi et al., 2024). On remote sensing imagery, however, SAM performs unevenly (Osco et al., 2023; Wu &amp; Osco, 2023), and on tree crowns in drone imagery it did not match a trained Mask R-CNN until elevation data were added (Teng et al., 2025). The trade-off is therefore between specialization and generality. Prompts are the channel through which site knowledge can be supplied to a general model, and this is the idea the study builds on.</w:t>
-      </w:r>
-    </w:p>
-    <w:p>
-      <w:pPr>
-        <w:spacing w:after="120" w:before="240" w:line="360"/>
-      </w:pPr>
-      <w:r>
-        <w:rPr>
-          <w:b/>
-          <w:bCs/>
-          <w:sz w:val="26"/>
-          <w:szCs w:val="26"/>
-        </w:rPr>
-        <w:t xml:space="preserve">3. Conceptual Framework and Core Proposition</w:t>
-      </w:r>
-    </w:p>
-    <w:p>
-      <w:pPr>
-        <w:spacing w:after="160" w:line="360"/>
-        <w:ind w:firstLine="0"/>
-        <w:jc w:val="both"/>
-      </w:pPr>
-      <w:r>
-        <w:t xml:space="preserve">The three foundations fit together in a simple way. Ecology defines what should be mapped and why, remote sensing defines which signals can separate trees and species, and AI defines how crowns can be extracted from those signals. Combined, they lead to the core proposition of this study: general-purpose foundation models, guided by site knowledge from LiDAR (where the trees are) and hyperspectral imagery (what is vegetation and which species it is), can overcome the domain shift that limits forest-trained models in an open savanna.</w:t>
-      </w:r>
-    </w:p>
-    <w:p>
-      <w:pPr>
-        <w:spacing w:after="160" w:line="360"/>
-        <w:ind w:firstLine="0"/>
-        <w:jc w:val="both"/>
-      </w:pPr>
-      <w:r>
-        <w:t xml:space="preserve">Within this framework, the type of model, whether supervised deep learning or a foundation model, and the type of guidance it receives, whether none, LiDAR alone, or LiDAR combined with hyperspectral data, are the main factors expected to affect crown delineation accuracy. Crown size, how isolated a tree is and its setting in open grassland or woodland are expected to moderate these effects. For species identification, the factor of interest is the combination of input data, and the outcome is how accurately oaks, redcedar and other broadleaf trees can be told apart. Each research question tests one part of this structure, and together the answers will show whether the core proposition holds.</w:t>
-      </w:r>
-    </w:p>
-    <w:p>
-      <w:pPr>
-        <w:spacing w:after="120" w:before="240" w:line="360"/>
-      </w:pPr>
-      <w:r>
-        <w:rPr>
-          <w:b/>
-          <w:bCs/>
-          <w:sz w:val="26"/>
-          <w:szCs w:val="26"/>
-        </w:rPr>
-        <w:t xml:space="preserve">4. Research Questions and Hypotheses</w:t>
-      </w:r>
-    </w:p>
-    <w:p>
-      <w:pPr>
-        <w:spacing w:after="160" w:line="360"/>
-        <w:ind w:firstLine="0"/>
-        <w:jc w:val="both"/>
-      </w:pPr>
-      <w:r>
-        <w:t xml:space="preserve">The first research question asks how supervised deep learning models (DeepForest and Detectree2) compare with foundation models (SAM and SAM 2) for delineating tree crowns in an open savanna, and whether LiDAR and hyperspectral guidance improves the foundation models. Based on the domain-shift argument and on evidence that elevation data help SAM, I expect guided SAM and SAM 2 to perform better than their zero-shot forms and to approach the accuracy of the trained detectors without any site-specific training. I also expect accuracy to be lowest for small and clustered crowns, where both prompting and detection are hardest.</w:t>
-      </w:r>
-    </w:p>
-    <w:p>
-      <w:pPr>
-        <w:spacing w:after="160" w:line="360"/>
-        <w:ind w:firstLine="0"/>
-        <w:jc w:val="both"/>
-      </w:pPr>
-      <w:r>
-        <w:t xml:space="preserve">The second research question asks how accurately the delineated crowns can be classified to species, and how much hyperspectral, LiDAR and RGB data each contribute. Because canopy reflectance reflects leaf chemistry and structure, I expect hyperspectral data to contribute the most to species separation. Following fusion theory, I expect that adding LiDAR structure will improve the results further, particularly for separating evergreen, conical redcedar from deciduous oaks.</w:t>
-      </w:r>
-    </w:p>
-    <w:p>
-      <w:pPr>
-        <w:spacing w:after="160" w:line="360"/>
-        <w:ind w:firstLine="0"/>
-        <w:jc w:val="both"/>
-      </w:pPr>
-      <w:r>
-        <w:t xml:space="preserve">The third research question, which is optional and not required for the thesis, asks where eastern redcedar has expanded between NEON flight years and whether change differs between burned and unburned management units. The fire–grass–tree feedback theory of encroachment predicts that redcedar cover has increased overall, but that expansion has been smaller in units that are burned regularly.</w:t>
-      </w:r>
-    </w:p>
-    <w:p>
-      <w:pPr>
-        <w:spacing w:after="120" w:before="240" w:line="360"/>
-      </w:pPr>
-      <w:r>
-        <w:rPr>
-          <w:b/>
-          <w:bCs/>
-          <w:sz w:val="26"/>
-          <w:szCs w:val="26"/>
-        </w:rPr>
-        <w:t xml:space="preserve">5. Methodology Alignment</w:t>
+        <w:t xml:space="preserve">3.3 Hyperspectral imagery: spectral and biochemical information</w:t>
+      </w:r>
+    </w:p>
+    <w:p>
+      <w:pPr>
+        <w:spacing w:after="160" w:line="360"/>
+        <w:jc w:val="both"/>
+      </w:pPr>
+      <w:r>
+        <w:t xml:space="preserve">NEON’s imaging spectrometer measures reflected light from 380 to about 2510 nm in roughly 5 nm bands, producing about 426 bands at 1 m resolution. Canopy reflectance depends on leaf pigments, water and dry matter and on canopy structure (Asner, 1998), and these properties differ among plant functional types and species (Ustin &amp; Gamon, 2010). As a result, hyperspectral data are among the most effective data for tree species classification (Fassnacht et al., 2016), and across NEON sites they have classified individual trees to species with an average accuracy of 0.77 (Marconi et al., 2022). Bands affected by atmospheric water vapor, around 1340 to 1445 nm and 1790 to 1955 nm, must be removed before analysis. In this framework, hyperspectral data serve two purposes: a vegetation mask that separates vegetation from bare ground and dry grass during crown delineation, and the main source of features for species classification. Its main limitation is the 1 m pixel size, which means that small crowns contain only a few pixels and pixels at crown edges mix tree and background signals.</w:t>
       </w:r>
     </w:p>
     <w:p>
@@ -306,17 +212,30 @@
           <w:sz w:val="24"/>
           <w:szCs w:val="24"/>
         </w:rPr>
-        <w:t xml:space="preserve">5.1 Study area and data collection</w:t>
-      </w:r>
-    </w:p>
-    <w:p>
-      <w:pPr>
-        <w:spacing w:after="160" w:line="360"/>
-        <w:ind w:firstLine="0"/>
-        <w:jc w:val="both"/>
-      </w:pPr>
-      <w:r>
-        <w:t xml:space="preserve">The study uses existing, openly available NEON data for the CLBJ site, so no new field campaign is required. I will work with a single flight year, 2024, to keep the sensors consistent. The data include 10 cm RGB imagery, the LiDAR canopy height model and point cloud, and 426-band hyperspectral reflectance at 1 m. Ground truth comes from NEON vegetation structure surveys (NEON, 2026), which record 862 live trees at least 2 m tall in 47 plots, 517 of them with mapped stem positions. Five plots spanning woodland and grassland have already been selected, and the RGB and canopy height tiles that cover them have been downloaded.</w:t>
+        <w:t xml:space="preserve">3.4 Complementarity of the three sensors</w:t>
+      </w:r>
+    </w:p>
+    <w:p>
+      <w:pPr>
+        <w:spacing w:after="160" w:line="360"/>
+        <w:jc w:val="both"/>
+      </w:pPr>
+      <w:r>
+        <w:t xml:space="preserve">The three sensors are complementary. RGB imagery shows where crown boundaries are, LiDAR shows how tall and how shaped each crown is, and hyperspectral imagery shows what the crown is made of. Multisensor fusion theory holds that combining sensors that measure different properties gives better results than using any one of them alone (Pohl &amp; van Genderen, 1998), and combining LiDAR with hyperspectral data has improved tree-level mapping in forests (Dalponte &amp; Coomes, 2016; Scholl et al., 2021). This complementarity is the data basis for the whole framework.</w:t>
+      </w:r>
+    </w:p>
+    <w:p>
+      <w:pPr>
+        <w:spacing w:after="120" w:before="240" w:line="360"/>
+      </w:pPr>
+      <w:r>
+        <w:rPr>
+          <w:b/>
+          <w:bCs/>
+          <w:sz w:val="26"/>
+          <w:szCs w:val="26"/>
+        </w:rPr>
+        <w:t xml:space="preserve">4. GeoAI Model Foundation</w:t>
       </w:r>
     </w:p>
     <w:p>
@@ -332,27 +251,16 @@
           <w:sz w:val="24"/>
           <w:szCs w:val="24"/>
         </w:rPr>
-        <w:t xml:space="preserve">5.2 Linking methods to the framework</w:t>
-      </w:r>
-    </w:p>
-    <w:p>
-      <w:pPr>
-        <w:spacing w:after="160" w:line="360"/>
-        <w:ind w:firstLine="0"/>
-        <w:jc w:val="both"/>
-      </w:pPr>
-      <w:r>
-        <w:t xml:space="preserve">For the first research question, crowns will be delineated from the RGB imagery with DeepForest and Detectree2, each used with its pretrained weights and again after fine-tuning on local crowns. SAM and SAM 2 will first be run in zero-shot mode and then guided with LiDAR tree tops as prompts, a 2 m canopy height filter and a hyperspectral vegetation mask that removes grass and bare ground. Performance will be measured as the proportion of the 517 field-mapped trees that are detected, and as precision, recall, F1 score and intersection-over-union against 150 to 300 hand-delineated reference crowns. Errors will be examined by crown size and by setting.</w:t>
-      </w:r>
-    </w:p>
-    <w:p>
-      <w:pPr>
-        <w:spacing w:after="160" w:line="360"/>
-        <w:ind w:firstLine="0"/>
-        <w:jc w:val="both"/>
-      </w:pPr>
-      <w:r>
-        <w:t xml:space="preserve">For the second research question, I will extract, for each crown, its mean spectrum, vegetation indices and principal components, together with LiDAR height and structure metrics and RGB texture. Random forest, support vector machine and one-dimensional convolutional neural network classifiers will then be trained on hyperspectral-only, LiDAR-only, RGB-only and combined inputs. Results will be reported as overall accuracy, per-class F1 score and kappa. For the optional third question, the best workflow will be applied to earlier NEON years, and changes in redcedar number and cover will be compared between burned and unburned units using US Forest Service unit boundaries.</w:t>
+        <w:t xml:space="preserve">4.1 Supervised deep learning</w:t>
+      </w:r>
+    </w:p>
+    <w:p>
+      <w:pPr>
+        <w:spacing w:after="160" w:line="360"/>
+        <w:jc w:val="both"/>
+      </w:pPr>
+      <w:r>
+        <w:t xml:space="preserve">Deep learning uses many-layered neural networks that learn features directly from data instead of relying on hand-designed rules (LeCun et al., 2015), and convolutional neural networks have become standard tools in remote sensing (Zhu et al., 2017). Two types of supervised model are relevant to this study. Object detectors locate each tree with a bounding box. DeepForest is built on the RetinaNet detector (Lin et al., 2017) and was trained on NEON RGB imagery, using LiDAR-derived tree locations to create a large set of training labels (Weinstein et al., 2019, 2020). Instance segmentation models go further and outline the exact shape of each crown. Detectree2 is built on Mask R-CNN (He et al., 2017) and was developed for crown delineation in tropical forests (Ball et al., 2023). Both models perform well in landscapes similar to those they were trained on, but they are affected by domain shift: their accuracy tends to drop in landscapes that look different. An open savanna differs strongly from closed forest, and CLBJ was left out of the NEON crown benchmark because too few trees met its criteria (Weinstein et al., 2021). Fine-tuning these models on a small set of local crowns is the usual way to reduce this problem.</w:t>
       </w:r>
     </w:p>
     <w:p>
@@ -368,17 +276,16 @@
           <w:sz w:val="24"/>
           <w:szCs w:val="24"/>
         </w:rPr>
-        <w:t xml:space="preserve">5.3 Rigor of the analysis</w:t>
-      </w:r>
-    </w:p>
-    <w:p>
-      <w:pPr>
-        <w:spacing w:after="160" w:line="360"/>
-        <w:ind w:firstLine="0"/>
-        <w:jc w:val="both"/>
-      </w:pPr>
-      <w:r>
-        <w:t xml:space="preserve">Several choices are made to keep the results trustworthy. Accuracy will be reported with standard measures for remotely sensed maps, including error matrices and kappa (Congalton, 1991), and with intersection-over-union for crown outlines, following the NEON crown benchmark (Weinstein et al., 2021). Field stems and image crowns are different kinds of measurement, so I will use both: field stems test whether real trees are found, and hand-drawn crowns test how well their outlines match. Because nearby trees resemble each other, random training and test splits would overstate accuracy, so classifiers will be trained and tested in spatially separate blocks (Roberts et al., 2017; Ploton et al., 2020). Random forest (Breiman, 2001) and support vector machines (Cortes &amp; Vapnik, 1995) provide established baselines against which the neural network can be compared. Finally, a sensor ablation, in which the same analysis is repeated with each data source removed, directly measures what each sensor contributes.</w:t>
+        <w:t xml:space="preserve">4.2 Vision foundation models: SAM and SAM 2</w:t>
+      </w:r>
+    </w:p>
+    <w:p>
+      <w:pPr>
+        <w:spacing w:after="160" w:line="360"/>
+        <w:jc w:val="both"/>
+      </w:pPr>
+      <w:r>
+        <w:t xml:space="preserve">Foundation models are trained on very large and diverse datasets and can then be applied to many tasks with little or no retraining (Bommasani et al., 2021). The Segment Anything Model (SAM) combines a vision transformer image encoder (Dosovitskiy et al., 2021) with a prompt encoder and a mask decoder, and was trained on more than one billion masks from eleven million images (Kirillov et al., 2023). Given a prompt, such as a point or a box, SAM returns an outline of the object at that location, without any training for that object type. SAM 2 extends the model to video with a memory module and is reported to be more accurate and about six times faster than SAM on images (Ravi et al., 2024). Tools such as samgeo make these models usable with georeferenced imagery (Wu &amp; Osco, 2023). On remote sensing imagery, however, SAM performs unevenly and depends heavily on good prompts (Osco et al., 2023). For tree crowns in drone imagery, SAM used out of the box did not match a trained Mask R-CNN, and its results improved when elevation data were added (Teng et al., 2025). This points directly to the role of LiDAR in this framework: LiDAR can supply the tree-top prompts and height information that SAM lacks.</w:t>
       </w:r>
     </w:p>
     <w:p>
@@ -394,17 +301,16 @@
           <w:sz w:val="24"/>
           <w:szCs w:val="24"/>
         </w:rPr>
-        <w:t xml:space="preserve">5.4 Data management and reproducibility</w:t>
-      </w:r>
-    </w:p>
-    <w:p>
-      <w:pPr>
-        <w:spacing w:after="160" w:line="360"/>
-        <w:ind w:firstLine="0"/>
-        <w:jc w:val="both"/>
-      </w:pPr>
-      <w:r>
-        <w:t xml:space="preserve">All inputs are public NEON products, and I will record the product version, release and download date for each dataset. Processing will be written as scripts in Python, with R for selected LiDAR steps, and kept under version control in a Git repository, so that every result can be traced to the code and data that produced it. Model settings, prompts and random seeds will be saved with the outputs. The reference crowns and species labels will be stored as GeoPackage files in the same coordinate system as the NEON data (UTM zone 14N) and, subject to NEON’s data policy, shared at the end of the project together with the code.</w:t>
+        <w:t xml:space="preserve">4.3 Classifiers for species identification</w:t>
+      </w:r>
+    </w:p>
+    <w:p>
+      <w:pPr>
+        <w:spacing w:after="160" w:line="360"/>
+        <w:jc w:val="both"/>
+      </w:pPr>
+      <w:r>
+        <w:t xml:space="preserve">Once crowns are delineated, each crown is described by a set of features and assigned to a species class. Random forest builds many decision trees on random subsets of the data and features and is robust to noisy and high-dimensional inputs (Breiman, 2001). Support vector machines find the boundary that best separates classes (Cortes &amp; Vapnik, 1995) and have performed well on hyperspectral data without requiring prior band reduction (Melgani &amp; Bruzzone, 2004). One-dimensional convolutional neural networks learn patterns directly along the spectrum of each pixel or crown and have outperformed support vector machines on several hyperspectral datasets (Hu et al., 2015). Comparing these three classifiers shows whether a deep learning approach adds value over established machine learning methods for the relatively small number of labeled trees available at CLBJ.</w:t>
       </w:r>
     </w:p>
     <w:p>
@@ -418,17 +324,25 @@
           <w:sz w:val="26"/>
           <w:szCs w:val="26"/>
         </w:rPr>
-        <w:t xml:space="preserve">6. Structure and Organization</w:t>
-      </w:r>
-    </w:p>
-    <w:p>
-      <w:pPr>
-        <w:spacing w:after="160" w:line="360"/>
-        <w:ind w:firstLine="0"/>
-        <w:jc w:val="both"/>
-      </w:pPr>
-      <w:r>
-        <w:t xml:space="preserve">The project follows a linear sequence in which each phase produces the inputs for the next. Data preparation feeds crown delineation, the reference dataset feeds accuracy assessment, and the best delineation method feeds species classification and, if time allows, change mapping. The work is organized into five phases over twelve months. The first two months cover data preparation and the literature review. Months three to five are devoted to building the reference crowns and running the delineation experiments for the first research question. Months six to eight focus on species classification and the comparison of sensors. Month nine is reserved for the optional change analysis and for bringing the results together, and the final three months are for writing, revision and the defense. The first research question is the core of the thesis, so later phases can be narrowed without affecting it.</w:t>
+        <w:t xml:space="preserve">5. Integrating Data and Models: the Conceptual Framework</w:t>
+      </w:r>
+    </w:p>
+    <w:p>
+      <w:pPr>
+        <w:spacing w:after="160" w:line="360"/>
+        <w:jc w:val="both"/>
+      </w:pPr>
+      <w:r>
+        <w:t xml:space="preserve">The framework links the data and the models at three levels, following the pixel, feature and decision levels of multisensor fusion (Pohl &amp; van Genderen, 1998). At the image level, RGB imagery is the input to all four crown delineation models. At the decision level, LiDAR and hyperspectral data guide the foundation models: tree tops from the canopy height model become point prompts for SAM and SAM 2, a 2 m height threshold removes grass and low shrubs, and a hyperspectral vegetation mask removes bare ground and senescent grass. At the feature level, the delineated crowns are used to extract hyperspectral, LiDAR and RGB features, which are combined for species classification.</w:t>
+      </w:r>
+    </w:p>
+    <w:p>
+      <w:pPr>
+        <w:spacing w:after="160" w:line="360"/>
+        <w:jc w:val="both"/>
+      </w:pPr>
+      <w:r>
+        <w:t xml:space="preserve">From this structure follows the core proposition of the study: general-purpose foundation models, guided by structural information from LiDAR and spectral information from hyperspectral imagery, can overcome the domain shift that limits forest-trained deep learning models in an open savanna, and the same multi-sensor features can then identify tree species. In terms of variables, the model type and the type of guidance are the main factors expected to affect delineation accuracy, while crown size, tree isolation and setting (open grassland or woodland) are expected to moderate their effect. For species identification, the factor of interest is the combination of sensors used, and the outcome is classification accuracy.</w:t>
       </w:r>
     </w:p>
     <w:p>
@@ -442,27 +356,34 @@
           <w:sz w:val="26"/>
           <w:szCs w:val="26"/>
         </w:rPr>
-        <w:t xml:space="preserve">7. Expected Outcomes and Broader Impacts</w:t>
-      </w:r>
-    </w:p>
-    <w:p>
-      <w:pPr>
-        <w:spacing w:after="160" w:line="360"/>
-        <w:ind w:firstLine="0"/>
-        <w:jc w:val="both"/>
-      </w:pPr>
-      <w:r>
-        <w:t xml:space="preserve">The study is expected to produce several outcomes. The first is direct evidence on how supervised deep learning and foundation models compare for tree crowns in an open savanna, and on whether LiDAR and hyperspectral guidance can make general models work in a landscape they were not trained on. The second is a measure of how much RGB, LiDAR and hyperspectral data each add to crown delineation and species identification, which can guide sensor choices in similar studies. The third is a checked set of crowns and species labels for CLBJ that fills the gap in the NEON benchmark and can be shared for future work.</w:t>
-      </w:r>
-    </w:p>
-    <w:p>
-      <w:pPr>
-        <w:spacing w:after="160" w:line="360"/>
-        <w:ind w:firstLine="0"/>
-        <w:jc w:val="both"/>
-      </w:pPr>
-      <w:r>
-        <w:t xml:space="preserve">Beyond research, the tree-level maps of oaks and redcedar can help the US Forest Service target cedar removal and plan prescribed burns at LBJ. Because NEON collects the same data at grassland and savanna sites across the country, an open and reproducible workflow developed here can also be applied at other sites facing woody encroachment.</w:t>
+        <w:t xml:space="preserve">6. Research Questions and Hypotheses</w:t>
+      </w:r>
+    </w:p>
+    <w:p>
+      <w:pPr>
+        <w:spacing w:after="160" w:line="360"/>
+        <w:jc w:val="both"/>
+      </w:pPr>
+      <w:r>
+        <w:t xml:space="preserve">The first research question asks how supervised deep learning models (DeepForest and Detectree2) compare with foundation models (SAM and SAM 2) for delineating tree crowns in an open savanna, and whether LiDAR and hyperspectral guidance improves the foundation models. Following the domain-shift argument and the evidence that elevation data help SAM, I expect guided SAM and SAM 2 to clearly outperform their zero-shot forms and to approach the accuracy of the trained detectors without site-specific training, with the lowest accuracy for small and clustered crowns.</w:t>
+      </w:r>
+    </w:p>
+    <w:p>
+      <w:pPr>
+        <w:spacing w:after="160" w:line="360"/>
+        <w:jc w:val="both"/>
+      </w:pPr>
+      <w:r>
+        <w:t xml:space="preserve">The second research question asks how accurately the delineated crowns can be classified to species, and how much hyperspectral, LiDAR and RGB data each contribute. Based on the spectral basis of species differences, I expect hyperspectral data to contribute the most, and based on fusion theory I expect that adding LiDAR structure will further improve the separation of evergreen redcedar from deciduous oaks. I also expect the one-dimensional convolutional neural network to perform at least as well as random forest and support vector machines, although the small number of labeled trees may limit its advantage.</w:t>
+      </w:r>
+    </w:p>
+    <w:p>
+      <w:pPr>
+        <w:spacing w:after="160" w:line="360"/>
+        <w:jc w:val="both"/>
+      </w:pPr>
+      <w:r>
+        <w:t xml:space="preserve">A third, optional question asks whether the best workflow can detect redcedar expansion between NEON flight years, and whether expansion differs between burned and unburned management units. This question applies the framework rather than testing it, and the thesis does not depend on it.</w:t>
       </w:r>
     </w:p>
     <w:p>
@@ -476,17 +397,82 @@
           <w:sz w:val="26"/>
           <w:szCs w:val="26"/>
         </w:rPr>
-        <w:t xml:space="preserve">8. Assumptions and Limitations</w:t>
-      </w:r>
-    </w:p>
-    <w:p>
-      <w:pPr>
-        <w:spacing w:after="160" w:line="360"/>
-        <w:ind w:firstLine="0"/>
-        <w:jc w:val="both"/>
-      </w:pPr>
-      <w:r>
-        <w:t xml:space="preserve">The framework assumes that NEON field records and imagery from the same period describe the same trees, which may not hold where trees died or were cleared between survey and flight. Hyperspectral pixels are 1 m, so very small crowns may contain too few pixels for reliable classification. The 2022 to 2025 hyperspectral data are provisional and may be revised by NEON, so I will record the version used. Results from a single site may not transfer directly to other savannas, and running SAM and SAM 2 on large areas requires GPU resources. These limits are acknowledged in the design, and the core comparison in the first research question does not depend on any of them.</w:t>
+        <w:t xml:space="preserve">7. Methodology Alignment</w:t>
+      </w:r>
+    </w:p>
+    <w:p>
+      <w:pPr>
+        <w:spacing w:after="100" w:before="160" w:line="360"/>
+      </w:pPr>
+      <w:r>
+        <w:rPr>
+          <w:b/>
+          <w:bCs/>
+          <w:i/>
+          <w:iCs/>
+          <w:sz w:val="24"/>
+          <w:szCs w:val="24"/>
+        </w:rPr>
+        <w:t xml:space="preserve">7.1 Data collection</w:t>
+      </w:r>
+    </w:p>
+    <w:p>
+      <w:pPr>
+        <w:spacing w:after="160" w:line="360"/>
+        <w:jc w:val="both"/>
+      </w:pPr>
+      <w:r>
+        <w:t xml:space="preserve">The study uses existing, openly available NEON data for CLBJ, so no new field campaign is needed. To keep the sensors consistent, I will use data from a single flight year, 2024: the 10 cm RGB mosaic, the LiDAR canopy height model and point cloud, and the hyperspectral reflectance product. Ground truth comes from NEON vegetation structure surveys (NEON, 2026), which record 862 live trees at least 2 m tall in 47 plots; 517 of these have mapped stem positions, and the main species are post oak, eastern redcedar and blackjack oak. Five plots covering both woodland and grassland have already been selected, and the RGB and canopy height tiles that cover them have been downloaded.</w:t>
+      </w:r>
+    </w:p>
+    <w:p>
+      <w:pPr>
+        <w:spacing w:after="100" w:before="160" w:line="360"/>
+      </w:pPr>
+      <w:r>
+        <w:rPr>
+          <w:b/>
+          <w:bCs/>
+          <w:i/>
+          <w:iCs/>
+          <w:sz w:val="24"/>
+          <w:szCs w:val="24"/>
+        </w:rPr>
+        <w:t xml:space="preserve">7.2 Methods for each research question</w:t>
+      </w:r>
+    </w:p>
+    <w:p>
+      <w:pPr>
+        <w:spacing w:after="160" w:line="360"/>
+        <w:jc w:val="both"/>
+      </w:pPr>
+      <w:r>
+        <w:t xml:space="preserve">For the first research question, DeepForest and Detectree2 will be run with their pretrained weights and again after fine-tuning on local crowns, and SAM and SAM 2 will be run in zero-shot mode and then with LiDAR tree-top prompts, the height filter and the hyperspectral vegetation mask. Performance will be measured as the proportion of the 517 field-mapped trees that are detected, and as precision, recall, F1 score and intersection-over-union against 150 to 300 hand-delineated reference crowns, with errors examined by crown size and setting. For the second research question, I will extract for each crown its mean spectrum, vegetation indices and principal components, together with LiDAR height and structure metrics and RGB texture, and train random forest, support vector machine and one-dimensional convolutional neural network classifiers on hyperspectral-only, LiDAR-only, RGB-only and combined inputs. Results will be reported as overall accuracy, per-class F1 score and kappa.</w:t>
+      </w:r>
+    </w:p>
+    <w:p>
+      <w:pPr>
+        <w:spacing w:after="100" w:before="160" w:line="360"/>
+      </w:pPr>
+      <w:r>
+        <w:rPr>
+          <w:b/>
+          <w:bCs/>
+          <w:i/>
+          <w:iCs/>
+          <w:sz w:val="24"/>
+          <w:szCs w:val="24"/>
+        </w:rPr>
+        <w:t xml:space="preserve">7.3 Rigor</w:t>
+      </w:r>
+    </w:p>
+    <w:p>
+      <w:pPr>
+        <w:spacing w:after="160" w:line="360"/>
+        <w:jc w:val="both"/>
+      </w:pPr>
+      <w:r>
+        <w:t xml:space="preserve">Accuracy will be assessed with standard measures for remotely sensed maps (Congalton, 1991) and with intersection-over-union for crown outlines, following the NEON crown benchmark (Weinstein et al., 2021). Field stems and image crowns are different kinds of measurement, so both will be used: field stems test whether real trees are found, and reference crowns test how well their outlines match. Because nearby trees resemble each other, random splits would overstate accuracy, so classifiers will be trained and tested on spatially separate blocks (Roberts et al., 2017; Ploton et al., 2020). A sensor ablation, in which each analysis is repeated with one data source removed, will directly measure what each sensor contributes. All processing will be scripted in Python, with R for selected LiDAR steps, and kept under version control, and the product versions, model settings and prompts will be recorded so that the results can be reproduced.</w:t>
       </w:r>
     </w:p>
     <w:p>
@@ -500,6 +486,84 @@
           <w:sz w:val="26"/>
           <w:szCs w:val="26"/>
         </w:rPr>
+        <w:t xml:space="preserve">8. Structure and Organization</w:t>
+      </w:r>
+    </w:p>
+    <w:p>
+      <w:pPr>
+        <w:spacing w:after="160" w:line="360"/>
+        <w:jc w:val="both"/>
+      </w:pPr>
+      <w:r>
+        <w:t xml:space="preserve">The project is organized as a sequence in which each phase feeds the next. Data preparation aligns the three sensors and the field records. Crown delineation produces crowns from the four models, and the reference dataset is used to evaluate them. The best delineation then feeds species classification and, if time allows, the change analysis. The work is planned over twelve months: data preparation and literature review in months one and two, reference crowns and delineation experiments in months three to five, species classification and sensor comparison in months six to eight, the optional change analysis and synthesis in month nine, and writing, revision and the defense in the final three months. The first research question is the core of the thesis, so later phases can be narrowed without affecting it.</w:t>
+      </w:r>
+    </w:p>
+    <w:p>
+      <w:pPr>
+        <w:spacing w:after="120" w:before="240" w:line="360"/>
+      </w:pPr>
+      <w:r>
+        <w:rPr>
+          <w:b/>
+          <w:bCs/>
+          <w:sz w:val="26"/>
+          <w:szCs w:val="26"/>
+        </w:rPr>
+        <w:t xml:space="preserve">9. Expected Outcomes and Broader Impacts</w:t>
+      </w:r>
+    </w:p>
+    <w:p>
+      <w:pPr>
+        <w:spacing w:after="160" w:line="360"/>
+        <w:jc w:val="both"/>
+      </w:pPr>
+      <w:r>
+        <w:t xml:space="preserve">The study is expected to provide direct evidence on how supervised deep learning and foundation models compare for tree crown delineation in an open savanna, and on whether LiDAR and hyperspectral guidance can make general-purpose foundation models work in a landscape they were not trained on. It will also show how much RGB, LiDAR and hyperspectral data each add to crown delineation and species identification, which can guide sensor and model choices in similar studies. A checked set of reference crowns and species labels for CLBJ will fill the gap in the NEON benchmark and can be shared for future work.</w:t>
+      </w:r>
+    </w:p>
+    <w:p>
+      <w:pPr>
+        <w:spacing w:after="160" w:line="360"/>
+        <w:jc w:val="both"/>
+      </w:pPr>
+      <w:r>
+        <w:t xml:space="preserve">Beyond research, tree-level maps of oaks and redcedar can help the US Forest Service target cedar removal and plan prescribed burns at LBJ. Because NEON collects the same three types of data at grassland and savanna sites across the United States, an open and reproducible workflow developed here can be transferred to other sites facing woody encroachment.</w:t>
+      </w:r>
+    </w:p>
+    <w:p>
+      <w:pPr>
+        <w:spacing w:after="120" w:before="240" w:line="360"/>
+      </w:pPr>
+      <w:r>
+        <w:rPr>
+          <w:b/>
+          <w:bCs/>
+          <w:sz w:val="26"/>
+          <w:szCs w:val="26"/>
+        </w:rPr>
+        <w:t xml:space="preserve">10. Assumptions and Limitations</w:t>
+      </w:r>
+    </w:p>
+    <w:p>
+      <w:pPr>
+        <w:spacing w:after="160" w:line="360"/>
+        <w:jc w:val="both"/>
+      </w:pPr>
+      <w:r>
+        <w:t xml:space="preserve">The framework assumes that field records and imagery from the same period describe the same trees, which may not hold where trees died or were cleared between survey and flight. The 1 m hyperspectral pixels limit species classification for very small crowns, and the 2022 to 2025 hyperspectral data are provisional and may be revised, so the version used will be recorded. Results from a single site may not transfer directly to other savannas, and running SAM and SAM 2 over large areas requires GPU resources. These limits are recognized in the design, and the core comparison in the first research question does not depend on any of them.</w:t>
+      </w:r>
+    </w:p>
+    <w:p>
+      <w:pPr>
+        <w:spacing w:after="120" w:before="240" w:line="360"/>
+      </w:pPr>
+      <w:r>
+        <w:rPr>
+          <w:b/>
+          <w:bCs/>
+          <w:sz w:val="26"/>
+          <w:szCs w:val="26"/>
+        </w:rPr>
         <w:t xml:space="preserve">References</w:t>
       </w:r>
     </w:p>
@@ -510,16 +574,6 @@
         <w:jc w:val="left"/>
       </w:pPr>
       <w:r>
-        <w:t xml:space="preserve">Archer, S. R., Andersen, E. M., Predick, K. I., Schwinning, S., Steidl, R. J., &amp; Woods, S. R. (2017). Woody plant encroachment: Causes and consequences. In D. D. Briske (Ed.), Rangeland systems: Processes, management and challenges (pp. 25–84). Springer.</w:t>
-      </w:r>
-    </w:p>
-    <w:p>
-      <w:pPr>
-        <w:spacing w:after="120" w:line="276"/>
-        <w:ind w:left="720" w:hanging="720"/>
-        <w:jc w:val="left"/>
-      </w:pPr>
-      <w:r>
         <w:t xml:space="preserve">Asner, G. P. (1998). Biophysical and biochemical sources of variability in canopy reflectance. Remote Sensing of Environment, 64(3), 234–253.</w:t>
       </w:r>
     </w:p>
@@ -600,16 +654,6 @@
         <w:jc w:val="left"/>
       </w:pPr>
       <w:r>
-        <w:t xml:space="preserve">Cross Timbers Project. (n.d.). LBJ National Grasslands, Texas. University of Arkansas. https://xtimbers.uark.edu/?p=27098</w:t>
-      </w:r>
-    </w:p>
-    <w:p>
-      <w:pPr>
-        <w:spacing w:after="120" w:line="276"/>
-        <w:ind w:left="720" w:hanging="720"/>
-        <w:jc w:val="left"/>
-      </w:pPr>
-      <w:r>
         <w:t xml:space="preserve">Dalponte, M., &amp; Coomes, D. A. (2016). Tree-centric mapping of forest carbon density from airborne laser scanning and hyperspectral data. Methods in Ecology and Evolution, 7(10), 1236–1245.</w:t>
       </w:r>
     </w:p>
@@ -630,6 +674,16 @@
         <w:jc w:val="left"/>
       </w:pPr>
       <w:r>
+        <w:t xml:space="preserve">Dosovitskiy, A., et al. (2021). An image is worth 16x16 words: Transformers for image recognition at scale. International Conference on Learning Representations (ICLR).</w:t>
+      </w:r>
+    </w:p>
+    <w:p>
+      <w:pPr>
+        <w:spacing w:after="120" w:line="276"/>
+        <w:ind w:left="720" w:hanging="720"/>
+        <w:jc w:val="left"/>
+      </w:pPr>
+      <w:r>
         <w:t xml:space="preserve">Fassnacht, F. E., et al. (2016). Review of studies on tree species classification from remotely sensed data. Remote Sensing of Environment, 186, 64–87.</w:t>
       </w:r>
     </w:p>
@@ -650,7 +704,7 @@
         <w:jc w:val="left"/>
       </w:pPr>
       <w:r>
-        <w:t xml:space="preserve">Hoagland, B. W., Butler, I. H., Johnson, F. L., &amp; Glenn, S. (1999). The Cross Timbers. In R. C. Anderson, J. S. Fralish, &amp; J. M. Baskin (Eds.), Savannas, barrens, and rock outcrop plant communities of North America (pp. 231–245). Cambridge University Press.</w:t>
+        <w:t xml:space="preserve">Hu, W., Huang, Y., Wei, L., Zhang, F., &amp; Li, H. (2015). Deep convolutional neural networks for hyperspectral image classification. Journal of Sensors, 2015, 258619.</w:t>
       </w:r>
     </w:p>
     <w:p>
@@ -690,6 +744,26 @@
         <w:jc w:val="left"/>
       </w:pPr>
       <w:r>
+        <w:t xml:space="preserve">LeCun, Y., Bengio, Y., &amp; Hinton, G. (2015). Deep learning. Nature, 521(7553), 436–444.</w:t>
+      </w:r>
+    </w:p>
+    <w:p>
+      <w:pPr>
+        <w:spacing w:after="120" w:line="276"/>
+        <w:ind w:left="720" w:hanging="720"/>
+        <w:jc w:val="left"/>
+      </w:pPr>
+      <w:r>
+        <w:t xml:space="preserve">Li, W., Guo, Q., Jakubowski, M. K., &amp; Kelly, M. (2012). A new method for segmenting individual trees from the lidar point cloud. Photogrammetric Engineering &amp; Remote Sensing, 78(1), 75–84.</w:t>
+      </w:r>
+    </w:p>
+    <w:p>
+      <w:pPr>
+        <w:spacing w:after="120" w:line="276"/>
+        <w:ind w:left="720" w:hanging="720"/>
+        <w:jc w:val="left"/>
+      </w:pPr>
+      <w:r>
         <w:t xml:space="preserve">Lin, T.-Y., Goyal, P., Girshick, R., He, K., &amp; Dollár, P. (2017). Focal loss for dense object detection. Proceedings of the IEEE International Conference on Computer Vision (ICCV), 2980–2988.</w:t>
       </w:r>
     </w:p>
@@ -710,6 +784,16 @@
         <w:jc w:val="left"/>
       </w:pPr>
       <w:r>
+        <w:t xml:space="preserve">Melgani, F., &amp; Bruzzone, L. (2004). Classification of hyperspectral remote sensing images with support vector machines. IEEE Transactions on Geoscience and Remote Sensing, 42(8), 1778–1790.</w:t>
+      </w:r>
+    </w:p>
+    <w:p>
+      <w:pPr>
+        <w:spacing w:after="120" w:line="276"/>
+        <w:ind w:left="720" w:hanging="720"/>
+        <w:jc w:val="left"/>
+      </w:pPr>
+      <w:r>
         <w:t xml:space="preserve">NEON (National Ecological Observatory Network). (2026). Vegetation structure (DP1.10098.001), RELEASE-2026. https://doi.org/10.48443/pypa-qf12</w:t>
       </w:r>
     </w:p>
@@ -751,16 +835,6 @@
       </w:pPr>
       <w:r>
         <w:t xml:space="preserve">Popescu, S. C., &amp; Wynne, R. H. (2004). Seeing the trees in the forest: Using lidar and multispectral data fusion with local filtering and variable window size for estimating tree height. Photogrammetric Engineering &amp; Remote Sensing, 70(5), 589–604.</w:t>
-      </w:r>
-    </w:p>
-    <w:p>
-      <w:pPr>
-        <w:spacing w:after="120" w:line="276"/>
-        <w:ind w:left="720" w:hanging="720"/>
-        <w:jc w:val="left"/>
-      </w:pPr>
-      <w:r>
-        <w:t xml:space="preserve">Ratajczak, Z., Nippert, J. B., &amp; Collins, S. L. (2012). Woody encroachment decreases diversity across North American grasslands and savannas. Ecology, 93(4), 697–703.</w:t>
       </w:r>
     </w:p>
     <w:p>

</xml_diff>

<commit_message>
Framework: continuous NSF-style paragraphs without section headings
Co-Authored-By: Claude Opus 5.5 <noreply@anthropic.com>
Claude-Session: https://claude.ai/code/session_0132bxCMLAKTHUnyQV3MmGfs
</commit_message>
<xml_diff>
--- a/thesis/Proposed_Research_Framework_Poudel.docx
+++ b/thesis/Proposed_Research_Framework_Poudel.docx
@@ -14,7 +14,7 @@
           <w:sz w:val="28"/>
           <w:szCs w:val="28"/>
         </w:rPr>
-        <w:t xml:space="preserve">Proposed Research Framework</w:t>
+        <w:t xml:space="preserve">Research Framework</w:t>
       </w:r>
     </w:p>
     <w:p>
@@ -47,21 +47,8 @@
     </w:p>
     <w:p>
       <w:pPr>
-        <w:spacing w:after="120" w:before="240" w:line="360"/>
-      </w:pPr>
-      <w:r>
-        <w:rPr>
-          <w:b/>
-          <w:bCs/>
-          <w:sz w:val="26"/>
-          <w:szCs w:val="26"/>
-        </w:rPr>
-        <w:t xml:space="preserve">1. Purpose and Focus of the Framework</w:t>
-      </w:r>
-    </w:p>
-    <w:p>
-      <w:pPr>
-        <w:spacing w:after="160" w:line="360"/>
+        <w:spacing w:after="0" w:line="360"/>
+        <w:ind w:firstLine="720"/>
         <w:jc w:val="both"/>
       </w:pPr>
       <w:r>
@@ -70,21 +57,8 @@
     </w:p>
     <w:p>
       <w:pPr>
-        <w:spacing w:after="120" w:before="240" w:line="360"/>
-      </w:pPr>
-      <w:r>
-        <w:rPr>
-          <w:b/>
-          <w:bCs/>
-          <w:sz w:val="26"/>
-          <w:szCs w:val="26"/>
-        </w:rPr>
-        <w:t xml:space="preserve">2. Application Context</w:t>
-      </w:r>
-    </w:p>
-    <w:p>
-      <w:pPr>
-        <w:spacing w:after="160" w:line="360"/>
+        <w:spacing w:after="0" w:line="360"/>
+        <w:ind w:firstLine="720"/>
         <w:jc w:val="both"/>
       </w:pPr>
       <w:r>
@@ -103,468 +77,218 @@
     </w:p>
     <w:p>
       <w:pPr>
-        <w:spacing w:after="120" w:before="240" w:line="360"/>
+        <w:spacing w:after="0" w:line="360"/>
+        <w:ind w:firstLine="720"/>
+        <w:jc w:val="both"/>
+      </w:pPr>
+      <w:r>
+        <w:t xml:space="preserve">The data side of the framework begins from the fact that individual tree mapping treats each crown, rather than each pixel, as the unit of analysis, because very high-resolution pixels are much smaller than the objects being mapped (Blaschke, 2010; Ke &amp; Quackenbush, 2011). Each of the three NEON sensors describes a crown in a different way, and the framework uses them for different purposes. All three are carried on the same aircraft of NEON’s Airborne Observation Platform and collected in the same flight, so they are closely co-registered (Kampe et al., 2010).</w:t>
+      </w:r>
+    </w:p>
+    <w:p>
+      <w:pPr>
+        <w:spacing w:after="0" w:line="360"/>
+        <w:ind w:firstLine="720"/>
+        <w:jc w:val="both"/>
+      </w:pPr>
+      <w:r>
+        <w:t xml:space="preserve">The first sensor, NEON’s digital camera, produces orthorectified RGB mosaics at 10 cm resolution. At this resolution individual crowns, their edges and their internal texture are clearly visible, which is why most deep learning tree detectors, including DeepForest and Detectree2, are designed for RGB input (Weinstein et al., 2019; Ball et al., 2023). RGB imagery has two important limits in a savanna. It contains no height information, so a green tree crown and a green patch of grass or shrub can look similar, and neighboring crowns of similar color can merge into one. Shadows also change the apparent shape of crowns. In this framework, RGB imagery is the main input for detecting and outlining crowns, and its weaknesses are addressed by the other two sensors.</w:t>
+      </w:r>
+    </w:p>
+    <w:p>
+      <w:pPr>
+        <w:spacing w:after="0" w:line="360"/>
+        <w:ind w:firstLine="720"/>
+        <w:jc w:val="both"/>
+      </w:pPr>
+      <w:r>
+        <w:t xml:space="preserve">The second sensor, LiDAR, records the three-dimensional position of laser returns from the canopy and the ground. From the point cloud, NEON derives a canopy height model at 1 m resolution that gives the height of vegetation above the ground. Local maxima in a canopy height model are a well-established way to locate individual tree tops (Popescu &amp; Wynne, 2004), and point clouds can be segmented into individual trees directly (Li et al., 2012; Roussel et al., 2020; Zhen et al., 2016). LiDAR remote sensing of vegetation structure is reviewed in detail by Dong and Chen (2018). In this framework, LiDAR plays two roles. It provides tree-top locations that can be used to prompt foundation models, and it provides a height filter that removes grass and low shrubs, which RGB imagery alone cannot do. It also adds structural features, such as height and crown shape, that help separate the dense, conical crowns of redcedar from the broader crowns of oaks.</w:t>
+      </w:r>
+    </w:p>
+    <w:p>
+      <w:pPr>
+        <w:spacing w:after="0" w:line="360"/>
+        <w:ind w:firstLine="720"/>
+        <w:jc w:val="both"/>
+      </w:pPr>
+      <w:r>
+        <w:t xml:space="preserve">The third sensor, NEON’s imaging spectrometer, measures reflected light from 380 to about 2510 nm in roughly 5 nm bands, producing about 426 bands at 1 m resolution. Canopy reflectance depends on leaf pigments, water and dry matter and on canopy structure (Asner, 1998), and these properties differ among plant functional types and species (Ustin &amp; Gamon, 2010). As a result, hyperspectral data are among the most effective data for tree species classification (Fassnacht et al., 2016), and across NEON sites they have classified individual trees to species with an average accuracy of 0.77 (Marconi et al., 2022). Bands affected by atmospheric water vapor, around 1340 to 1445 nm and 1790 to 1955 nm, must be removed before analysis. In this framework, hyperspectral data serve two purposes: a vegetation mask that separates vegetation from bare ground and dry grass during crown delineation, and the main source of features for species classification. Its main limitation is the 1 m pixel size, which means that small crowns contain only a few pixels and pixels at crown edges mix tree and background signals.</w:t>
+      </w:r>
+    </w:p>
+    <w:p>
+      <w:pPr>
+        <w:spacing w:after="0" w:line="360"/>
+        <w:ind w:firstLine="720"/>
+        <w:jc w:val="both"/>
+      </w:pPr>
+      <w:r>
+        <w:t xml:space="preserve">The three sensors are complementary. RGB imagery shows where crown boundaries are, LiDAR shows how tall and how shaped each crown is, and hyperspectral imagery shows what the crown is made of. Multisensor fusion theory holds that combining sensors that measure different properties gives better results than using any one of them alone (Pohl &amp; van Genderen, 1998), and combining LiDAR with hyperspectral data has improved tree-level mapping in forests (Dalponte &amp; Coomes, 2016; Scholl et al., 2021). This complementarity is the data basis for the whole framework.</w:t>
+      </w:r>
+    </w:p>
+    <w:p>
+      <w:pPr>
+        <w:spacing w:after="0" w:line="360"/>
+        <w:ind w:firstLine="720"/>
+        <w:jc w:val="both"/>
+      </w:pPr>
+      <w:r>
+        <w:t xml:space="preserve">The model side of the framework starts with deep learning, which uses many-layered neural networks that learn features directly from data instead of relying on hand-designed rules (LeCun et al., 2015), and convolutional neural networks have become standard tools in remote sensing (Zhu et al., 2017). Two types of supervised model are relevant to this study. Object detectors locate each tree with a bounding box. DeepForest is built on the RetinaNet detector (Lin et al., 2017) and was trained on NEON RGB imagery, using LiDAR-derived tree locations to create a large set of training labels (Weinstein et al., 2019, 2020). Instance segmentation models go further and outline the exact shape of each crown. Detectree2 is built on Mask R-CNN (He et al., 2017) and was developed for crown delineation in tropical forests (Ball et al., 2023). Both models perform well in landscapes similar to those they were trained on, but they are affected by domain shift: their accuracy tends to drop in landscapes that look different. An open savanna differs strongly from closed forest, and CLBJ was left out of the NEON crown benchmark because too few trees met its criteria (Weinstein et al., 2021). Fine-tuning these models on a small set of local crowns is the usual way to reduce this problem.</w:t>
+      </w:r>
+    </w:p>
+    <w:p>
+      <w:pPr>
+        <w:spacing w:after="0" w:line="360"/>
+        <w:ind w:firstLine="720"/>
+        <w:jc w:val="both"/>
+      </w:pPr>
+      <w:r>
+        <w:t xml:space="preserve">The second group of models, foundation models, are trained on very large and diverse datasets and can then be applied to many tasks with little or no retraining (Bommasani et al., 2021). The Segment Anything Model (SAM) combines a vision transformer image encoder (Dosovitskiy et al., 2021) with a prompt encoder and a mask decoder, and was trained on more than one billion masks from eleven million images (Kirillov et al., 2023). Given a prompt, such as a point or a box, SAM returns an outline of the object at that location, without any training for that object type. SAM 2 extends the model to video with a memory module and is reported to be more accurate and about six times faster than SAM on images (Ravi et al., 2024). Tools such as samgeo make these models usable with georeferenced imagery (Wu &amp; Osco, 2023). On remote sensing imagery, however, SAM performs unevenly and depends heavily on good prompts (Osco et al., 2023). For tree crowns in drone imagery, SAM used out of the box did not match a trained Mask R-CNN, and its results improved when elevation data were added (Teng et al., 2025). This points directly to the role of LiDAR in this framework: LiDAR can supply the tree-top prompts and height information that SAM lacks.</w:t>
+      </w:r>
+    </w:p>
+    <w:p>
+      <w:pPr>
+        <w:spacing w:after="0" w:line="360"/>
+        <w:ind w:firstLine="720"/>
+        <w:jc w:val="both"/>
+      </w:pPr>
+      <w:r>
+        <w:t xml:space="preserve">The third group of models handles species identification. Once crowns are delineated, each crown is described by a set of features and assigned to a species class. Random forest builds many decision trees on random subsets of the data and features and is robust to noisy and high-dimensional inputs (Breiman, 2001). Support vector machines find the boundary that best separates classes (Cortes &amp; Vapnik, 1995) and have performed well on hyperspectral data without requiring prior band reduction (Melgani &amp; Bruzzone, 2004). One-dimensional convolutional neural networks learn patterns directly along the spectrum of each pixel or crown and have outperformed support vector machines on several hyperspectral datasets (Hu et al., 2015). Comparing these three classifiers shows whether a deep learning approach adds value over established machine learning methods for the relatively small number of labeled trees available at CLBJ.</w:t>
+      </w:r>
+    </w:p>
+    <w:p>
+      <w:pPr>
+        <w:spacing w:after="0" w:line="360"/>
+        <w:ind w:firstLine="720"/>
+        <w:jc w:val="both"/>
+      </w:pPr>
+      <w:r>
+        <w:t xml:space="preserve">Data and models are linked at three levels, following the pixel, feature and decision levels of multisensor fusion (Pohl &amp; van Genderen, 1998). At the image level, RGB imagery is the input to all four crown delineation models. At the decision level, LiDAR and hyperspectral data guide the foundation models: tree tops from the canopy height model become point prompts for SAM and SAM 2, a 2 m height threshold removes grass and low shrubs, and a hyperspectral vegetation mask removes bare ground and senescent grass. At the feature level, the delineated crowns are used to extract hyperspectral, LiDAR and RGB features, which are combined for species classification.</w:t>
+      </w:r>
+    </w:p>
+    <w:p>
+      <w:pPr>
+        <w:spacing w:after="0" w:line="360"/>
+        <w:ind w:firstLine="720"/>
+        <w:jc w:val="both"/>
+      </w:pPr>
+      <w:r>
+        <w:t xml:space="preserve">From this structure follows the core proposition of the study: general-purpose foundation models, guided by structural information from LiDAR and spectral information from hyperspectral imagery, can overcome the domain shift that limits forest-trained deep learning models in an open savanna, and the same multi-sensor features can then identify tree species. In terms of variables, the model type and the type of guidance are the main factors expected to affect delineation accuracy, while crown size, tree isolation and setting (open grassland or woodland) are expected to moderate their effect. For species identification, the factor of interest is the combination of sensors used, and the outcome is classification accuracy.</w:t>
+      </w:r>
+    </w:p>
+    <w:p>
+      <w:pPr>
+        <w:spacing w:after="0" w:line="360"/>
+        <w:ind w:firstLine="720"/>
+        <w:jc w:val="both"/>
+      </w:pPr>
+      <w:r>
+        <w:t xml:space="preserve">Two research questions and their hypotheses follow from this proposition. The first research question asks how supervised deep learning models (DeepForest and Detectree2) compare with foundation models (SAM and SAM 2) for delineating tree crowns in an open savanna, and whether LiDAR and hyperspectral guidance improves the foundation models. Following the domain-shift argument and the evidence that elevation data help SAM, I expect guided SAM and SAM 2 to clearly outperform their zero-shot forms and to approach the accuracy of the trained detectors without site-specific training, with the lowest accuracy for small and clustered crowns.</w:t>
+      </w:r>
+    </w:p>
+    <w:p>
+      <w:pPr>
+        <w:spacing w:after="0" w:line="360"/>
+        <w:ind w:firstLine="720"/>
+        <w:jc w:val="both"/>
+      </w:pPr>
+      <w:r>
+        <w:t xml:space="preserve">The second research question asks how accurately the delineated crowns can be classified to species, and how much hyperspectral, LiDAR and RGB data each contribute. Based on the spectral basis of species differences, I expect hyperspectral data to contribute the most, and based on fusion theory I expect that adding LiDAR structure will further improve the separation of evergreen redcedar from deciduous oaks. I also expect the one-dimensional convolutional neural network to perform at least as well as random forest and support vector machines, although the small number of labeled trees may limit its advantage.</w:t>
+      </w:r>
+    </w:p>
+    <w:p>
+      <w:pPr>
+        <w:spacing w:after="0" w:line="360"/>
+        <w:ind w:firstLine="720"/>
+        <w:jc w:val="both"/>
+      </w:pPr>
+      <w:r>
+        <w:t xml:space="preserve">A third, optional question asks whether the best workflow can detect redcedar expansion between NEON flight years, and whether expansion differs between burned and unburned management units. This question applies the framework rather than testing it, and the thesis does not depend on it.</w:t>
+      </w:r>
+    </w:p>
+    <w:p>
+      <w:pPr>
+        <w:spacing w:after="0" w:line="360"/>
+        <w:ind w:firstLine="720"/>
+        <w:jc w:val="both"/>
+      </w:pPr>
+      <w:r>
+        <w:t xml:space="preserve">The methodology is aligned directly with these questions. The study uses existing, openly available NEON data for CLBJ, so no new field campaign is needed. To keep the sensors consistent, I will use data from a single flight year, 2024: the 10 cm RGB mosaic, the LiDAR canopy height model and point cloud, and the hyperspectral reflectance product. Ground truth comes from NEON vegetation structure surveys (NEON, 2026), which record 862 live trees at least 2 m tall in 47 plots; 517 of these have mapped stem positions, and the main species are post oak, eastern redcedar and blackjack oak. Five plots covering both woodland and grassland have already been selected, and the RGB and canopy height tiles that cover them have been downloaded.</w:t>
+      </w:r>
+    </w:p>
+    <w:p>
+      <w:pPr>
+        <w:spacing w:after="0" w:line="360"/>
+        <w:ind w:firstLine="720"/>
+        <w:jc w:val="both"/>
+      </w:pPr>
+      <w:r>
+        <w:t xml:space="preserve">For the first research question, DeepForest and Detectree2 will be run with their pretrained weights and again after fine-tuning on local crowns, and SAM and SAM 2 will be run in zero-shot mode and then with LiDAR tree-top prompts, the height filter and the hyperspectral vegetation mask. Performance will be measured as the proportion of the 517 field-mapped trees that are detected, and as precision, recall, F1 score and intersection-over-union against 150 to 300 hand-delineated reference crowns, with errors examined by crown size and setting. For the second research question, I will extract for each crown its mean spectrum, vegetation indices and principal components, together with LiDAR height and structure metrics and RGB texture, and train random forest, support vector machine and one-dimensional convolutional neural network classifiers on hyperspectral-only, LiDAR-only, RGB-only and combined inputs. Results will be reported as overall accuracy, per-class F1 score and kappa.</w:t>
+      </w:r>
+    </w:p>
+    <w:p>
+      <w:pPr>
+        <w:spacing w:after="0" w:line="360"/>
+        <w:ind w:firstLine="720"/>
+        <w:jc w:val="both"/>
+      </w:pPr>
+      <w:r>
+        <w:t xml:space="preserve">Rigor is built into the design in several ways. Accuracy will be assessed with standard measures for remotely sensed maps (Congalton, 1991) and with intersection-over-union for crown outlines, following the NEON crown benchmark (Weinstein et al., 2021). Field stems and image crowns are different kinds of measurement, so both will be used: field stems test whether real trees are found, and reference crowns test how well their outlines match. Because nearby trees resemble each other, random splits would overstate accuracy, so classifiers will be trained and tested on spatially separate blocks (Roberts et al., 2017; Ploton et al., 2020). A sensor ablation, in which each analysis is repeated with one data source removed, will directly measure what each sensor contributes. All processing will be scripted in Python, with R for selected LiDAR steps, and kept under version control, and the product versions, model settings and prompts will be recorded so that the results can be reproduced.</w:t>
+      </w:r>
+    </w:p>
+    <w:p>
+      <w:pPr>
+        <w:spacing w:after="0" w:line="360"/>
+        <w:ind w:firstLine="720"/>
+        <w:jc w:val="both"/>
+      </w:pPr>
+      <w:r>
+        <w:t xml:space="preserve">The project is organized as a sequence in which each phase feeds the next. Data preparation aligns the three sensors and the field records. Crown delineation produces crowns from the four models, and the reference dataset is used to evaluate them. The best delineation then feeds species classification and, if time allows, the change analysis. The work is planned over twelve months: data preparation and literature review in months one and two, reference crowns and delineation experiments in months three to five, species classification and sensor comparison in months six to eight, the optional change analysis and synthesis in month nine, and writing, revision and the defense in the final three months. The first research question is the core of the thesis, so later phases can be narrowed without affecting it.</w:t>
+      </w:r>
+    </w:p>
+    <w:p>
+      <w:pPr>
+        <w:spacing w:after="0" w:line="360"/>
+        <w:ind w:firstLine="720"/>
+        <w:jc w:val="both"/>
+      </w:pPr>
+      <w:r>
+        <w:t xml:space="preserve">The intellectual merit of the study lies in the direct evidence it is expected to provide on how supervised deep learning and foundation models compare for tree crown delineation in an open savanna, and on whether LiDAR and hyperspectral guidance can make general-purpose foundation models work in a landscape they were not trained on. It will also show how much RGB, LiDAR and hyperspectral data each add to crown delineation and species identification, which can guide sensor and model choices in similar studies. A checked set of reference crowns and species labels for CLBJ will fill the gap in the NEON benchmark and can be shared for future work.</w:t>
+      </w:r>
+    </w:p>
+    <w:p>
+      <w:pPr>
+        <w:spacing w:after="0" w:line="360"/>
+        <w:ind w:firstLine="720"/>
+        <w:jc w:val="both"/>
+      </w:pPr>
+      <w:r>
+        <w:t xml:space="preserve">In terms of broader impacts, tree-level maps of oaks and redcedar can help the US Forest Service target cedar removal and plan prescribed burns at LBJ. Because NEON collects the same three types of data at grassland and savanna sites across the United States, an open and reproducible workflow developed here can be transferred to other sites facing woody encroachment.</w:t>
+      </w:r>
+    </w:p>
+    <w:p>
+      <w:pPr>
+        <w:spacing w:after="0" w:line="360"/>
+        <w:ind w:firstLine="720"/>
+        <w:jc w:val="both"/>
+      </w:pPr>
+      <w:r>
+        <w:t xml:space="preserve">Finally, the framework rests on some assumptions and has limitations. It assumes that field records and imagery from the same period describe the same trees, which may not hold where trees died or were cleared between survey and flight. The 1 m hyperspectral pixels limit species classification for very small crowns, and the 2022 to 2025 hyperspectral data are provisional and may be revised, so the version used will be recorded. Results from a single site may not transfer directly to other savannas, and running SAM and SAM 2 over large areas requires GPU resources. These limits are recognized in the design, and the core comparison in the first research question does not depend on any of them.</w:t>
+      </w:r>
+    </w:p>
+    <w:p>
+      <w:pPr>
+        <w:pageBreakBefore/>
+        <w:spacing w:after="240"/>
+        <w:jc w:val="center"/>
       </w:pPr>
       <w:r>
         <w:rPr>
           <w:b/>
           <w:bCs/>
-          <w:sz w:val="26"/>
-          <w:szCs w:val="26"/>
-        </w:rPr>
-        <w:t xml:space="preserve">3. Data Foundation: RGB, LiDAR and Hyperspectral Imagery</w:t>
-      </w:r>
-    </w:p>
-    <w:p>
-      <w:pPr>
-        <w:spacing w:after="160" w:line="360"/>
-        <w:jc w:val="both"/>
-      </w:pPr>
-      <w:r>
-        <w:t xml:space="preserve">Individual tree mapping treats each crown, rather than each pixel, as the unit of analysis, because very high-resolution pixels are much smaller than the objects being mapped (Blaschke, 2010; Ke &amp; Quackenbush, 2011). Each of the three NEON sensors describes a crown in a different way, and the framework uses them for different purposes. All three are carried on the same aircraft of NEON’s Airborne Observation Platform and collected in the same flight, so they are closely co-registered (Kampe et al., 2010).</w:t>
-      </w:r>
-    </w:p>
-    <w:p>
-      <w:pPr>
-        <w:spacing w:after="100" w:before="160" w:line="360"/>
-      </w:pPr>
-      <w:r>
-        <w:rPr>
-          <w:b/>
-          <w:bCs/>
-          <w:i/>
-          <w:iCs/>
           <w:sz w:val="24"/>
           <w:szCs w:val="24"/>
         </w:rPr>
-        <w:t xml:space="preserve">3.1 RGB imagery: crown geometry and texture</w:t>
-      </w:r>
-    </w:p>
-    <w:p>
-      <w:pPr>
-        <w:spacing w:after="160" w:line="360"/>
-        <w:jc w:val="both"/>
-      </w:pPr>
-      <w:r>
-        <w:t xml:space="preserve">NEON’s digital camera produces orthorectified RGB mosaics at 10 cm resolution. At this resolution individual crowns, their edges and their internal texture are clearly visible, which is why most deep learning tree detectors, including DeepForest and Detectree2, are designed for RGB input (Weinstein et al., 2019; Ball et al., 2023). RGB imagery has two important limits in a savanna. It contains no height information, so a green tree crown and a green patch of grass or shrub can look similar, and neighboring crowns of similar color can merge into one. Shadows also change the apparent shape of crowns. In this framework, RGB imagery is the main input for detecting and outlining crowns, and its weaknesses are addressed by the other two sensors.</w:t>
-      </w:r>
-    </w:p>
-    <w:p>
-      <w:pPr>
-        <w:spacing w:after="100" w:before="160" w:line="360"/>
-      </w:pPr>
-      <w:r>
-        <w:rPr>
-          <w:b/>
-          <w:bCs/>
-          <w:i/>
-          <w:iCs/>
-          <w:sz w:val="24"/>
-          <w:szCs w:val="24"/>
-        </w:rPr>
-        <w:t xml:space="preserve">3.2 LiDAR: three-dimensional structure</w:t>
-      </w:r>
-    </w:p>
-    <w:p>
-      <w:pPr>
-        <w:spacing w:after="160" w:line="360"/>
-        <w:jc w:val="both"/>
-      </w:pPr>
-      <w:r>
-        <w:t xml:space="preserve">LiDAR records the three-dimensional position of laser returns from the canopy and the ground. From the point cloud, NEON derives a canopy height model at 1 m resolution that gives the height of vegetation above the ground. Local maxima in a canopy height model are a well-established way to locate individual tree tops (Popescu &amp; Wynne, 2004), and point clouds can be segmented into individual trees directly (Li et al., 2012; Roussel et al., 2020; Zhen et al., 2016). LiDAR remote sensing of vegetation structure is reviewed in detail by Dong and Chen (2018). In this framework, LiDAR plays two roles. It provides tree-top locations that can be used to prompt foundation models, and it provides a height filter that removes grass and low shrubs, which RGB imagery alone cannot do. It also adds structural features, such as height and crown shape, that help separate the dense, conical crowns of redcedar from the broader crowns of oaks.</w:t>
-      </w:r>
-    </w:p>
-    <w:p>
-      <w:pPr>
-        <w:spacing w:after="100" w:before="160" w:line="360"/>
-      </w:pPr>
-      <w:r>
-        <w:rPr>
-          <w:b/>
-          <w:bCs/>
-          <w:i/>
-          <w:iCs/>
-          <w:sz w:val="24"/>
-          <w:szCs w:val="24"/>
-        </w:rPr>
-        <w:t xml:space="preserve">3.3 Hyperspectral imagery: spectral and biochemical information</w:t>
-      </w:r>
-    </w:p>
-    <w:p>
-      <w:pPr>
-        <w:spacing w:after="160" w:line="360"/>
-        <w:jc w:val="both"/>
-      </w:pPr>
-      <w:r>
-        <w:t xml:space="preserve">NEON’s imaging spectrometer measures reflected light from 380 to about 2510 nm in roughly 5 nm bands, producing about 426 bands at 1 m resolution. Canopy reflectance depends on leaf pigments, water and dry matter and on canopy structure (Asner, 1998), and these properties differ among plant functional types and species (Ustin &amp; Gamon, 2010). As a result, hyperspectral data are among the most effective data for tree species classification (Fassnacht et al., 2016), and across NEON sites they have classified individual trees to species with an average accuracy of 0.77 (Marconi et al., 2022). Bands affected by atmospheric water vapor, around 1340 to 1445 nm and 1790 to 1955 nm, must be removed before analysis. In this framework, hyperspectral data serve two purposes: a vegetation mask that separates vegetation from bare ground and dry grass during crown delineation, and the main source of features for species classification. Its main limitation is the 1 m pixel size, which means that small crowns contain only a few pixels and pixels at crown edges mix tree and background signals.</w:t>
-      </w:r>
-    </w:p>
-    <w:p>
-      <w:pPr>
-        <w:spacing w:after="100" w:before="160" w:line="360"/>
-      </w:pPr>
-      <w:r>
-        <w:rPr>
-          <w:b/>
-          <w:bCs/>
-          <w:i/>
-          <w:iCs/>
-          <w:sz w:val="24"/>
-          <w:szCs w:val="24"/>
-        </w:rPr>
-        <w:t xml:space="preserve">3.4 Complementarity of the three sensors</w:t>
-      </w:r>
-    </w:p>
-    <w:p>
-      <w:pPr>
-        <w:spacing w:after="160" w:line="360"/>
-        <w:jc w:val="both"/>
-      </w:pPr>
-      <w:r>
-        <w:t xml:space="preserve">The three sensors are complementary. RGB imagery shows where crown boundaries are, LiDAR shows how tall and how shaped each crown is, and hyperspectral imagery shows what the crown is made of. Multisensor fusion theory holds that combining sensors that measure different properties gives better results than using any one of them alone (Pohl &amp; van Genderen, 1998), and combining LiDAR with hyperspectral data has improved tree-level mapping in forests (Dalponte &amp; Coomes, 2016; Scholl et al., 2021). This complementarity is the data basis for the whole framework.</w:t>
-      </w:r>
-    </w:p>
-    <w:p>
-      <w:pPr>
-        <w:spacing w:after="120" w:before="240" w:line="360"/>
-      </w:pPr>
-      <w:r>
-        <w:rPr>
-          <w:b/>
-          <w:bCs/>
-          <w:sz w:val="26"/>
-          <w:szCs w:val="26"/>
-        </w:rPr>
-        <w:t xml:space="preserve">4. GeoAI Model Foundation</w:t>
-      </w:r>
-    </w:p>
-    <w:p>
-      <w:pPr>
-        <w:spacing w:after="100" w:before="160" w:line="360"/>
-      </w:pPr>
-      <w:r>
-        <w:rPr>
-          <w:b/>
-          <w:bCs/>
-          <w:i/>
-          <w:iCs/>
-          <w:sz w:val="24"/>
-          <w:szCs w:val="24"/>
-        </w:rPr>
-        <w:t xml:space="preserve">4.1 Supervised deep learning</w:t>
-      </w:r>
-    </w:p>
-    <w:p>
-      <w:pPr>
-        <w:spacing w:after="160" w:line="360"/>
-        <w:jc w:val="both"/>
-      </w:pPr>
-      <w:r>
-        <w:t xml:space="preserve">Deep learning uses many-layered neural networks that learn features directly from data instead of relying on hand-designed rules (LeCun et al., 2015), and convolutional neural networks have become standard tools in remote sensing (Zhu et al., 2017). Two types of supervised model are relevant to this study. Object detectors locate each tree with a bounding box. DeepForest is built on the RetinaNet detector (Lin et al., 2017) and was trained on NEON RGB imagery, using LiDAR-derived tree locations to create a large set of training labels (Weinstein et al., 2019, 2020). Instance segmentation models go further and outline the exact shape of each crown. Detectree2 is built on Mask R-CNN (He et al., 2017) and was developed for crown delineation in tropical forests (Ball et al., 2023). Both models perform well in landscapes similar to those they were trained on, but they are affected by domain shift: their accuracy tends to drop in landscapes that look different. An open savanna differs strongly from closed forest, and CLBJ was left out of the NEON crown benchmark because too few trees met its criteria (Weinstein et al., 2021). Fine-tuning these models on a small set of local crowns is the usual way to reduce this problem.</w:t>
-      </w:r>
-    </w:p>
-    <w:p>
-      <w:pPr>
-        <w:spacing w:after="100" w:before="160" w:line="360"/>
-      </w:pPr>
-      <w:r>
-        <w:rPr>
-          <w:b/>
-          <w:bCs/>
-          <w:i/>
-          <w:iCs/>
-          <w:sz w:val="24"/>
-          <w:szCs w:val="24"/>
-        </w:rPr>
-        <w:t xml:space="preserve">4.2 Vision foundation models: SAM and SAM 2</w:t>
-      </w:r>
-    </w:p>
-    <w:p>
-      <w:pPr>
-        <w:spacing w:after="160" w:line="360"/>
-        <w:jc w:val="both"/>
-      </w:pPr>
-      <w:r>
-        <w:t xml:space="preserve">Foundation models are trained on very large and diverse datasets and can then be applied to many tasks with little or no retraining (Bommasani et al., 2021). The Segment Anything Model (SAM) combines a vision transformer image encoder (Dosovitskiy et al., 2021) with a prompt encoder and a mask decoder, and was trained on more than one billion masks from eleven million images (Kirillov et al., 2023). Given a prompt, such as a point or a box, SAM returns an outline of the object at that location, without any training for that object type. SAM 2 extends the model to video with a memory module and is reported to be more accurate and about six times faster than SAM on images (Ravi et al., 2024). Tools such as samgeo make these models usable with georeferenced imagery (Wu &amp; Osco, 2023). On remote sensing imagery, however, SAM performs unevenly and depends heavily on good prompts (Osco et al., 2023). For tree crowns in drone imagery, SAM used out of the box did not match a trained Mask R-CNN, and its results improved when elevation data were added (Teng et al., 2025). This points directly to the role of LiDAR in this framework: LiDAR can supply the tree-top prompts and height information that SAM lacks.</w:t>
-      </w:r>
-    </w:p>
-    <w:p>
-      <w:pPr>
-        <w:spacing w:after="100" w:before="160" w:line="360"/>
-      </w:pPr>
-      <w:r>
-        <w:rPr>
-          <w:b/>
-          <w:bCs/>
-          <w:i/>
-          <w:iCs/>
-          <w:sz w:val="24"/>
-          <w:szCs w:val="24"/>
-        </w:rPr>
-        <w:t xml:space="preserve">4.3 Classifiers for species identification</w:t>
-      </w:r>
-    </w:p>
-    <w:p>
-      <w:pPr>
-        <w:spacing w:after="160" w:line="360"/>
-        <w:jc w:val="both"/>
-      </w:pPr>
-      <w:r>
-        <w:t xml:space="preserve">Once crowns are delineated, each crown is described by a set of features and assigned to a species class. Random forest builds many decision trees on random subsets of the data and features and is robust to noisy and high-dimensional inputs (Breiman, 2001). Support vector machines find the boundary that best separates classes (Cortes &amp; Vapnik, 1995) and have performed well on hyperspectral data without requiring prior band reduction (Melgani &amp; Bruzzone, 2004). One-dimensional convolutional neural networks learn patterns directly along the spectrum of each pixel or crown and have outperformed support vector machines on several hyperspectral datasets (Hu et al., 2015). Comparing these three classifiers shows whether a deep learning approach adds value over established machine learning methods for the relatively small number of labeled trees available at CLBJ.</w:t>
-      </w:r>
-    </w:p>
-    <w:p>
-      <w:pPr>
-        <w:spacing w:after="120" w:before="240" w:line="360"/>
-      </w:pPr>
-      <w:r>
-        <w:rPr>
-          <w:b/>
-          <w:bCs/>
-          <w:sz w:val="26"/>
-          <w:szCs w:val="26"/>
-        </w:rPr>
-        <w:t xml:space="preserve">5. Integrating Data and Models: the Conceptual Framework</w:t>
-      </w:r>
-    </w:p>
-    <w:p>
-      <w:pPr>
-        <w:spacing w:after="160" w:line="360"/>
-        <w:jc w:val="both"/>
-      </w:pPr>
-      <w:r>
-        <w:t xml:space="preserve">The framework links the data and the models at three levels, following the pixel, feature and decision levels of multisensor fusion (Pohl &amp; van Genderen, 1998). At the image level, RGB imagery is the input to all four crown delineation models. At the decision level, LiDAR and hyperspectral data guide the foundation models: tree tops from the canopy height model become point prompts for SAM and SAM 2, a 2 m height threshold removes grass and low shrubs, and a hyperspectral vegetation mask removes bare ground and senescent grass. At the feature level, the delineated crowns are used to extract hyperspectral, LiDAR and RGB features, which are combined for species classification.</w:t>
-      </w:r>
-    </w:p>
-    <w:p>
-      <w:pPr>
-        <w:spacing w:after="160" w:line="360"/>
-        <w:jc w:val="both"/>
-      </w:pPr>
-      <w:r>
-        <w:t xml:space="preserve">From this structure follows the core proposition of the study: general-purpose foundation models, guided by structural information from LiDAR and spectral information from hyperspectral imagery, can overcome the domain shift that limits forest-trained deep learning models in an open savanna, and the same multi-sensor features can then identify tree species. In terms of variables, the model type and the type of guidance are the main factors expected to affect delineation accuracy, while crown size, tree isolation and setting (open grassland or woodland) are expected to moderate their effect. For species identification, the factor of interest is the combination of sensors used, and the outcome is classification accuracy.</w:t>
-      </w:r>
-    </w:p>
-    <w:p>
-      <w:pPr>
-        <w:spacing w:after="120" w:before="240" w:line="360"/>
-      </w:pPr>
-      <w:r>
-        <w:rPr>
-          <w:b/>
-          <w:bCs/>
-          <w:sz w:val="26"/>
-          <w:szCs w:val="26"/>
-        </w:rPr>
-        <w:t xml:space="preserve">6. Research Questions and Hypotheses</w:t>
-      </w:r>
-    </w:p>
-    <w:p>
-      <w:pPr>
-        <w:spacing w:after="160" w:line="360"/>
-        <w:jc w:val="both"/>
-      </w:pPr>
-      <w:r>
-        <w:t xml:space="preserve">The first research question asks how supervised deep learning models (DeepForest and Detectree2) compare with foundation models (SAM and SAM 2) for delineating tree crowns in an open savanna, and whether LiDAR and hyperspectral guidance improves the foundation models. Following the domain-shift argument and the evidence that elevation data help SAM, I expect guided SAM and SAM 2 to clearly outperform their zero-shot forms and to approach the accuracy of the trained detectors without site-specific training, with the lowest accuracy for small and clustered crowns.</w:t>
-      </w:r>
-    </w:p>
-    <w:p>
-      <w:pPr>
-        <w:spacing w:after="160" w:line="360"/>
-        <w:jc w:val="both"/>
-      </w:pPr>
-      <w:r>
-        <w:t xml:space="preserve">The second research question asks how accurately the delineated crowns can be classified to species, and how much hyperspectral, LiDAR and RGB data each contribute. Based on the spectral basis of species differences, I expect hyperspectral data to contribute the most, and based on fusion theory I expect that adding LiDAR structure will further improve the separation of evergreen redcedar from deciduous oaks. I also expect the one-dimensional convolutional neural network to perform at least as well as random forest and support vector machines, although the small number of labeled trees may limit its advantage.</w:t>
-      </w:r>
-    </w:p>
-    <w:p>
-      <w:pPr>
-        <w:spacing w:after="160" w:line="360"/>
-        <w:jc w:val="both"/>
-      </w:pPr>
-      <w:r>
-        <w:t xml:space="preserve">A third, optional question asks whether the best workflow can detect redcedar expansion between NEON flight years, and whether expansion differs between burned and unburned management units. This question applies the framework rather than testing it, and the thesis does not depend on it.</w:t>
-      </w:r>
-    </w:p>
-    <w:p>
-      <w:pPr>
-        <w:spacing w:after="120" w:before="240" w:line="360"/>
-      </w:pPr>
-      <w:r>
-        <w:rPr>
-          <w:b/>
-          <w:bCs/>
-          <w:sz w:val="26"/>
-          <w:szCs w:val="26"/>
-        </w:rPr>
-        <w:t xml:space="preserve">7. Methodology Alignment</w:t>
-      </w:r>
-    </w:p>
-    <w:p>
-      <w:pPr>
-        <w:spacing w:after="100" w:before="160" w:line="360"/>
-      </w:pPr>
-      <w:r>
-        <w:rPr>
-          <w:b/>
-          <w:bCs/>
-          <w:i/>
-          <w:iCs/>
-          <w:sz w:val="24"/>
-          <w:szCs w:val="24"/>
-        </w:rPr>
-        <w:t xml:space="preserve">7.1 Data collection</w:t>
-      </w:r>
-    </w:p>
-    <w:p>
-      <w:pPr>
-        <w:spacing w:after="160" w:line="360"/>
-        <w:jc w:val="both"/>
-      </w:pPr>
-      <w:r>
-        <w:t xml:space="preserve">The study uses existing, openly available NEON data for CLBJ, so no new field campaign is needed. To keep the sensors consistent, I will use data from a single flight year, 2024: the 10 cm RGB mosaic, the LiDAR canopy height model and point cloud, and the hyperspectral reflectance product. Ground truth comes from NEON vegetation structure surveys (NEON, 2026), which record 862 live trees at least 2 m tall in 47 plots; 517 of these have mapped stem positions, and the main species are post oak, eastern redcedar and blackjack oak. Five plots covering both woodland and grassland have already been selected, and the RGB and canopy height tiles that cover them have been downloaded.</w:t>
-      </w:r>
-    </w:p>
-    <w:p>
-      <w:pPr>
-        <w:spacing w:after="100" w:before="160" w:line="360"/>
-      </w:pPr>
-      <w:r>
-        <w:rPr>
-          <w:b/>
-          <w:bCs/>
-          <w:i/>
-          <w:iCs/>
-          <w:sz w:val="24"/>
-          <w:szCs w:val="24"/>
-        </w:rPr>
-        <w:t xml:space="preserve">7.2 Methods for each research question</w:t>
-      </w:r>
-    </w:p>
-    <w:p>
-      <w:pPr>
-        <w:spacing w:after="160" w:line="360"/>
-        <w:jc w:val="both"/>
-      </w:pPr>
-      <w:r>
-        <w:t xml:space="preserve">For the first research question, DeepForest and Detectree2 will be run with their pretrained weights and again after fine-tuning on local crowns, and SAM and SAM 2 will be run in zero-shot mode and then with LiDAR tree-top prompts, the height filter and the hyperspectral vegetation mask. Performance will be measured as the proportion of the 517 field-mapped trees that are detected, and as precision, recall, F1 score and intersection-over-union against 150 to 300 hand-delineated reference crowns, with errors examined by crown size and setting. For the second research question, I will extract for each crown its mean spectrum, vegetation indices and principal components, together with LiDAR height and structure metrics and RGB texture, and train random forest, support vector machine and one-dimensional convolutional neural network classifiers on hyperspectral-only, LiDAR-only, RGB-only and combined inputs. Results will be reported as overall accuracy, per-class F1 score and kappa.</w:t>
-      </w:r>
-    </w:p>
-    <w:p>
-      <w:pPr>
-        <w:spacing w:after="100" w:before="160" w:line="360"/>
-      </w:pPr>
-      <w:r>
-        <w:rPr>
-          <w:b/>
-          <w:bCs/>
-          <w:i/>
-          <w:iCs/>
-          <w:sz w:val="24"/>
-          <w:szCs w:val="24"/>
-        </w:rPr>
-        <w:t xml:space="preserve">7.3 Rigor</w:t>
-      </w:r>
-    </w:p>
-    <w:p>
-      <w:pPr>
-        <w:spacing w:after="160" w:line="360"/>
-        <w:jc w:val="both"/>
-      </w:pPr>
-      <w:r>
-        <w:t xml:space="preserve">Accuracy will be assessed with standard measures for remotely sensed maps (Congalton, 1991) and with intersection-over-union for crown outlines, following the NEON crown benchmark (Weinstein et al., 2021). Field stems and image crowns are different kinds of measurement, so both will be used: field stems test whether real trees are found, and reference crowns test how well their outlines match. Because nearby trees resemble each other, random splits would overstate accuracy, so classifiers will be trained and tested on spatially separate blocks (Roberts et al., 2017; Ploton et al., 2020). A sensor ablation, in which each analysis is repeated with one data source removed, will directly measure what each sensor contributes. All processing will be scripted in Python, with R for selected LiDAR steps, and kept under version control, and the product versions, model settings and prompts will be recorded so that the results can be reproduced.</w:t>
-      </w:r>
-    </w:p>
-    <w:p>
-      <w:pPr>
-        <w:spacing w:after="120" w:before="240" w:line="360"/>
-      </w:pPr>
-      <w:r>
-        <w:rPr>
-          <w:b/>
-          <w:bCs/>
-          <w:sz w:val="26"/>
-          <w:szCs w:val="26"/>
-        </w:rPr>
-        <w:t xml:space="preserve">8. Structure and Organization</w:t>
-      </w:r>
-    </w:p>
-    <w:p>
-      <w:pPr>
-        <w:spacing w:after="160" w:line="360"/>
-        <w:jc w:val="both"/>
-      </w:pPr>
-      <w:r>
-        <w:t xml:space="preserve">The project is organized as a sequence in which each phase feeds the next. Data preparation aligns the three sensors and the field records. Crown delineation produces crowns from the four models, and the reference dataset is used to evaluate them. The best delineation then feeds species classification and, if time allows, the change analysis. The work is planned over twelve months: data preparation and literature review in months one and two, reference crowns and delineation experiments in months three to five, species classification and sensor comparison in months six to eight, the optional change analysis and synthesis in month nine, and writing, revision and the defense in the final three months. The first research question is the core of the thesis, so later phases can be narrowed without affecting it.</w:t>
-      </w:r>
-    </w:p>
-    <w:p>
-      <w:pPr>
-        <w:spacing w:after="120" w:before="240" w:line="360"/>
-      </w:pPr>
-      <w:r>
-        <w:rPr>
-          <w:b/>
-          <w:bCs/>
-          <w:sz w:val="26"/>
-          <w:szCs w:val="26"/>
-        </w:rPr>
-        <w:t xml:space="preserve">9. Expected Outcomes and Broader Impacts</w:t>
-      </w:r>
-    </w:p>
-    <w:p>
-      <w:pPr>
-        <w:spacing w:after="160" w:line="360"/>
-        <w:jc w:val="both"/>
-      </w:pPr>
-      <w:r>
-        <w:t xml:space="preserve">The study is expected to provide direct evidence on how supervised deep learning and foundation models compare for tree crown delineation in an open savanna, and on whether LiDAR and hyperspectral guidance can make general-purpose foundation models work in a landscape they were not trained on. It will also show how much RGB, LiDAR and hyperspectral data each add to crown delineation and species identification, which can guide sensor and model choices in similar studies. A checked set of reference crowns and species labels for CLBJ will fill the gap in the NEON benchmark and can be shared for future work.</w:t>
-      </w:r>
-    </w:p>
-    <w:p>
-      <w:pPr>
-        <w:spacing w:after="160" w:line="360"/>
-        <w:jc w:val="both"/>
-      </w:pPr>
-      <w:r>
-        <w:t xml:space="preserve">Beyond research, tree-level maps of oaks and redcedar can help the US Forest Service target cedar removal and plan prescribed burns at LBJ. Because NEON collects the same three types of data at grassland and savanna sites across the United States, an open and reproducible workflow developed here can be transferred to other sites facing woody encroachment.</w:t>
-      </w:r>
-    </w:p>
-    <w:p>
-      <w:pPr>
-        <w:spacing w:after="120" w:before="240" w:line="360"/>
-      </w:pPr>
-      <w:r>
-        <w:rPr>
-          <w:b/>
-          <w:bCs/>
-          <w:sz w:val="26"/>
-          <w:szCs w:val="26"/>
-        </w:rPr>
-        <w:t xml:space="preserve">10. Assumptions and Limitations</w:t>
-      </w:r>
-    </w:p>
-    <w:p>
-      <w:pPr>
-        <w:spacing w:after="160" w:line="360"/>
-        <w:jc w:val="both"/>
-      </w:pPr>
-      <w:r>
-        <w:t xml:space="preserve">The framework assumes that field records and imagery from the same period describe the same trees, which may not hold where trees died or were cleared between survey and flight. The 1 m hyperspectral pixels limit species classification for very small crowns, and the 2022 to 2025 hyperspectral data are provisional and may be revised, so the version used will be recorded. Results from a single site may not transfer directly to other savannas, and running SAM and SAM 2 over large areas requires GPU resources. These limits are recognized in the design, and the core comparison in the first research question does not depend on any of them.</w:t>
-      </w:r>
-    </w:p>
-    <w:p>
-      <w:pPr>
-        <w:spacing w:after="120" w:before="240" w:line="360"/>
-      </w:pPr>
-      <w:r>
-        <w:rPr>
-          <w:b/>
-          <w:bCs/>
-          <w:sz w:val="26"/>
-          <w:szCs w:val="26"/>
-        </w:rPr>
-        <w:t xml:space="preserve">References</w:t>
+        <w:t xml:space="preserve">References Cited</w:t>
       </w:r>
     </w:p>
     <w:p>

</xml_diff>

<commit_message>
Framework: passive voice, remove meta introduction paragraph
Co-Authored-By: Claude Opus 5.5 <noreply@anthropic.com>
Claude-Session: https://claude.ai/code/session_0132bxCMLAKTHUnyQV3MmGfs
</commit_message>
<xml_diff>
--- a/thesis/Proposed_Research_Framework_Poudel.docx
+++ b/thesis/Proposed_Research_Framework_Poudel.docx
@@ -52,17 +52,7 @@
         <w:jc w:val="both"/>
       </w:pPr>
       <w:r>
-        <w:t xml:space="preserve">This framework explains how GeoAI models and multi-sensor airborne data are combined in my research to delineate individual tree crowns and identify their species. It rests on two pillars. The first is the data: RGB imagery, LiDAR and hyperspectral imagery, each of which measures a different property of a tree. The second is the models: supervised deep learning, vision foundation models and machine learning classifiers, each of which extracts information from images in a different way. The central idea of the framework is that the strengths of each data type can be matched to the needs of each model, so that the combination performs better than any single sensor or model alone. The research questions, methods and expected outcomes described below all follow from this idea.</w:t>
-      </w:r>
-    </w:p>
-    <w:p>
-      <w:pPr>
-        <w:spacing w:after="0" w:line="360"/>
-        <w:ind w:firstLine="720"/>
-        <w:jc w:val="both"/>
-      </w:pPr>
-      <w:r>
-        <w:t xml:space="preserve">The framework is applied at LBJ National Grassland (NEON site CLBJ) in Wise County, Texas, an open Cross Timbers savanna of post oak and blackjack oak woodland mixed with grassland. Eastern redcedar (</w:t>
+        <w:t xml:space="preserve">LBJ National Grassland (NEON site CLBJ) in Wise County, Texas, is an open Cross Timbers savanna in which post oak and blackjack oak woodland is mixed with grassland. Grasslands across the southern Great Plains have been invaded by eastern redcedar (</w:t>
       </w:r>
       <w:r>
         <w:rPr>
@@ -72,207 +62,207 @@
         <w:t xml:space="preserve">Juniperus virginiana</w:t>
       </w:r>
       <w:r>
-        <w:t xml:space="preserve">) has been spreading into grasslands across the southern Great Plains as fire has become less frequent (Van Auken, 2000; Briggs et al., 2005; Twidwell et al., 2013), and its expansion has been mapped over recent decades in neighboring Oklahoma (Wang et al., 2017). The US Forest Service uses prescribed fire at LBJ to limit woody cover, including about 5,635 acres in the Denton Creek project (USDA Forest Service, 2013). This setting gives the framework its target: find every tree crown in an open landscape and tell native oaks apart from encroaching redcedar.</w:t>
-      </w:r>
-    </w:p>
-    <w:p>
-      <w:pPr>
-        <w:spacing w:after="0" w:line="360"/>
-        <w:ind w:firstLine="720"/>
-        <w:jc w:val="both"/>
-      </w:pPr>
-      <w:r>
-        <w:t xml:space="preserve">The data side of the framework begins from the fact that individual tree mapping treats each crown, rather than each pixel, as the unit of analysis, because very high-resolution pixels are much smaller than the objects being mapped (Blaschke, 2010; Ke &amp; Quackenbush, 2011). Each of the three NEON sensors describes a crown in a different way, and the framework uses them for different purposes. All three are carried on the same aircraft of NEON’s Airborne Observation Platform and collected in the same flight, so they are closely co-registered (Kampe et al., 2010).</w:t>
-      </w:r>
-    </w:p>
-    <w:p>
-      <w:pPr>
-        <w:spacing w:after="0" w:line="360"/>
-        <w:ind w:firstLine="720"/>
-        <w:jc w:val="both"/>
-      </w:pPr>
-      <w:r>
-        <w:t xml:space="preserve">The first sensor, NEON’s digital camera, produces orthorectified RGB mosaics at 10 cm resolution. At this resolution individual crowns, their edges and their internal texture are clearly visible, which is why most deep learning tree detectors, including DeepForest and Detectree2, are designed for RGB input (Weinstein et al., 2019; Ball et al., 2023). RGB imagery has two important limits in a savanna. It contains no height information, so a green tree crown and a green patch of grass or shrub can look similar, and neighboring crowns of similar color can merge into one. Shadows also change the apparent shape of crowns. In this framework, RGB imagery is the main input for detecting and outlining crowns, and its weaknesses are addressed by the other two sensors.</w:t>
-      </w:r>
-    </w:p>
-    <w:p>
-      <w:pPr>
-        <w:spacing w:after="0" w:line="360"/>
-        <w:ind w:firstLine="720"/>
-        <w:jc w:val="both"/>
-      </w:pPr>
-      <w:r>
-        <w:t xml:space="preserve">The second sensor, LiDAR, records the three-dimensional position of laser returns from the canopy and the ground. From the point cloud, NEON derives a canopy height model at 1 m resolution that gives the height of vegetation above the ground. Local maxima in a canopy height model are a well-established way to locate individual tree tops (Popescu &amp; Wynne, 2004), and point clouds can be segmented into individual trees directly (Li et al., 2012; Roussel et al., 2020; Zhen et al., 2016). LiDAR remote sensing of vegetation structure is reviewed in detail by Dong and Chen (2018). In this framework, LiDAR plays two roles. It provides tree-top locations that can be used to prompt foundation models, and it provides a height filter that removes grass and low shrubs, which RGB imagery alone cannot do. It also adds structural features, such as height and crown shape, that help separate the dense, conical crowns of redcedar from the broader crowns of oaks.</w:t>
-      </w:r>
-    </w:p>
-    <w:p>
-      <w:pPr>
-        <w:spacing w:after="0" w:line="360"/>
-        <w:ind w:firstLine="720"/>
-        <w:jc w:val="both"/>
-      </w:pPr>
-      <w:r>
-        <w:t xml:space="preserve">The third sensor, NEON’s imaging spectrometer, measures reflected light from 380 to about 2510 nm in roughly 5 nm bands, producing about 426 bands at 1 m resolution. Canopy reflectance depends on leaf pigments, water and dry matter and on canopy structure (Asner, 1998), and these properties differ among plant functional types and species (Ustin &amp; Gamon, 2010). As a result, hyperspectral data are among the most effective data for tree species classification (Fassnacht et al., 2016), and across NEON sites they have classified individual trees to species with an average accuracy of 0.77 (Marconi et al., 2022). Bands affected by atmospheric water vapor, around 1340 to 1445 nm and 1790 to 1955 nm, must be removed before analysis. In this framework, hyperspectral data serve two purposes: a vegetation mask that separates vegetation from bare ground and dry grass during crown delineation, and the main source of features for species classification. Its main limitation is the 1 m pixel size, which means that small crowns contain only a few pixels and pixels at crown edges mix tree and background signals.</w:t>
-      </w:r>
-    </w:p>
-    <w:p>
-      <w:pPr>
-        <w:spacing w:after="0" w:line="360"/>
-        <w:ind w:firstLine="720"/>
-        <w:jc w:val="both"/>
-      </w:pPr>
-      <w:r>
-        <w:t xml:space="preserve">The three sensors are complementary. RGB imagery shows where crown boundaries are, LiDAR shows how tall and how shaped each crown is, and hyperspectral imagery shows what the crown is made of. Multisensor fusion theory holds that combining sensors that measure different properties gives better results than using any one of them alone (Pohl &amp; van Genderen, 1998), and combining LiDAR with hyperspectral data has improved tree-level mapping in forests (Dalponte &amp; Coomes, 2016; Scholl et al., 2021). This complementarity is the data basis for the whole framework.</w:t>
-      </w:r>
-    </w:p>
-    <w:p>
-      <w:pPr>
-        <w:spacing w:after="0" w:line="360"/>
-        <w:ind w:firstLine="720"/>
-        <w:jc w:val="both"/>
-      </w:pPr>
-      <w:r>
-        <w:t xml:space="preserve">The model side of the framework starts with deep learning, which uses many-layered neural networks that learn features directly from data instead of relying on hand-designed rules (LeCun et al., 2015), and convolutional neural networks have become standard tools in remote sensing (Zhu et al., 2017). Two types of supervised model are relevant to this study. Object detectors locate each tree with a bounding box. DeepForest is built on the RetinaNet detector (Lin et al., 2017) and was trained on NEON RGB imagery, using LiDAR-derived tree locations to create a large set of training labels (Weinstein et al., 2019, 2020). Instance segmentation models go further and outline the exact shape of each crown. Detectree2 is built on Mask R-CNN (He et al., 2017) and was developed for crown delineation in tropical forests (Ball et al., 2023). Both models perform well in landscapes similar to those they were trained on, but they are affected by domain shift: their accuracy tends to drop in landscapes that look different. An open savanna differs strongly from closed forest, and CLBJ was left out of the NEON crown benchmark because too few trees met its criteria (Weinstein et al., 2021). Fine-tuning these models on a small set of local crowns is the usual way to reduce this problem.</w:t>
-      </w:r>
-    </w:p>
-    <w:p>
-      <w:pPr>
-        <w:spacing w:after="0" w:line="360"/>
-        <w:ind w:firstLine="720"/>
-        <w:jc w:val="both"/>
-      </w:pPr>
-      <w:r>
-        <w:t xml:space="preserve">The second group of models, foundation models, are trained on very large and diverse datasets and can then be applied to many tasks with little or no retraining (Bommasani et al., 2021). The Segment Anything Model (SAM) combines a vision transformer image encoder (Dosovitskiy et al., 2021) with a prompt encoder and a mask decoder, and was trained on more than one billion masks from eleven million images (Kirillov et al., 2023). Given a prompt, such as a point or a box, SAM returns an outline of the object at that location, without any training for that object type. SAM 2 extends the model to video with a memory module and is reported to be more accurate and about six times faster than SAM on images (Ravi et al., 2024). Tools such as samgeo make these models usable with georeferenced imagery (Wu &amp; Osco, 2023). On remote sensing imagery, however, SAM performs unevenly and depends heavily on good prompts (Osco et al., 2023). For tree crowns in drone imagery, SAM used out of the box did not match a trained Mask R-CNN, and its results improved when elevation data were added (Teng et al., 2025). This points directly to the role of LiDAR in this framework: LiDAR can supply the tree-top prompts and height information that SAM lacks.</w:t>
-      </w:r>
-    </w:p>
-    <w:p>
-      <w:pPr>
-        <w:spacing w:after="0" w:line="360"/>
-        <w:ind w:firstLine="720"/>
-        <w:jc w:val="both"/>
-      </w:pPr>
-      <w:r>
-        <w:t xml:space="preserve">The third group of models handles species identification. Once crowns are delineated, each crown is described by a set of features and assigned to a species class. Random forest builds many decision trees on random subsets of the data and features and is robust to noisy and high-dimensional inputs (Breiman, 2001). Support vector machines find the boundary that best separates classes (Cortes &amp; Vapnik, 1995) and have performed well on hyperspectral data without requiring prior band reduction (Melgani &amp; Bruzzone, 2004). One-dimensional convolutional neural networks learn patterns directly along the spectrum of each pixel or crown and have outperformed support vector machines on several hyperspectral datasets (Hu et al., 2015). Comparing these three classifiers shows whether a deep learning approach adds value over established machine learning methods for the relatively small number of labeled trees available at CLBJ.</w:t>
-      </w:r>
-    </w:p>
-    <w:p>
-      <w:pPr>
-        <w:spacing w:after="0" w:line="360"/>
-        <w:ind w:firstLine="720"/>
-        <w:jc w:val="both"/>
-      </w:pPr>
-      <w:r>
-        <w:t xml:space="preserve">Data and models are linked at three levels, following the pixel, feature and decision levels of multisensor fusion (Pohl &amp; van Genderen, 1998). At the image level, RGB imagery is the input to all four crown delineation models. At the decision level, LiDAR and hyperspectral data guide the foundation models: tree tops from the canopy height model become point prompts for SAM and SAM 2, a 2 m height threshold removes grass and low shrubs, and a hyperspectral vegetation mask removes bare ground and senescent grass. At the feature level, the delineated crowns are used to extract hyperspectral, LiDAR and RGB features, which are combined for species classification.</w:t>
-      </w:r>
-    </w:p>
-    <w:p>
-      <w:pPr>
-        <w:spacing w:after="0" w:line="360"/>
-        <w:ind w:firstLine="720"/>
-        <w:jc w:val="both"/>
-      </w:pPr>
-      <w:r>
-        <w:t xml:space="preserve">From this structure follows the core proposition of the study: general-purpose foundation models, guided by structural information from LiDAR and spectral information from hyperspectral imagery, can overcome the domain shift that limits forest-trained deep learning models in an open savanna, and the same multi-sensor features can then identify tree species. In terms of variables, the model type and the type of guidance are the main factors expected to affect delineation accuracy, while crown size, tree isolation and setting (open grassland or woodland) are expected to moderate their effect. For species identification, the factor of interest is the combination of sensors used, and the outcome is classification accuracy.</w:t>
-      </w:r>
-    </w:p>
-    <w:p>
-      <w:pPr>
-        <w:spacing w:after="0" w:line="360"/>
-        <w:ind w:firstLine="720"/>
-        <w:jc w:val="both"/>
-      </w:pPr>
-      <w:r>
-        <w:t xml:space="preserve">Two research questions and their hypotheses follow from this proposition. The first research question asks how supervised deep learning models (DeepForest and Detectree2) compare with foundation models (SAM and SAM 2) for delineating tree crowns in an open savanna, and whether LiDAR and hyperspectral guidance improves the foundation models. Following the domain-shift argument and the evidence that elevation data help SAM, I expect guided SAM and SAM 2 to clearly outperform their zero-shot forms and to approach the accuracy of the trained detectors without site-specific training, with the lowest accuracy for small and clustered crowns.</w:t>
-      </w:r>
-    </w:p>
-    <w:p>
-      <w:pPr>
-        <w:spacing w:after="0" w:line="360"/>
-        <w:ind w:firstLine="720"/>
-        <w:jc w:val="both"/>
-      </w:pPr>
-      <w:r>
-        <w:t xml:space="preserve">The second research question asks how accurately the delineated crowns can be classified to species, and how much hyperspectral, LiDAR and RGB data each contribute. Based on the spectral basis of species differences, I expect hyperspectral data to contribute the most, and based on fusion theory I expect that adding LiDAR structure will further improve the separation of evergreen redcedar from deciduous oaks. I also expect the one-dimensional convolutional neural network to perform at least as well as random forest and support vector machines, although the small number of labeled trees may limit its advantage.</w:t>
-      </w:r>
-    </w:p>
-    <w:p>
-      <w:pPr>
-        <w:spacing w:after="0" w:line="360"/>
-        <w:ind w:firstLine="720"/>
-        <w:jc w:val="both"/>
-      </w:pPr>
-      <w:r>
-        <w:t xml:space="preserve">A third, optional question asks whether the best workflow can detect redcedar expansion between NEON flight years, and whether expansion differs between burned and unburned management units. This question applies the framework rather than testing it, and the thesis does not depend on it.</w:t>
-      </w:r>
-    </w:p>
-    <w:p>
-      <w:pPr>
-        <w:spacing w:after="0" w:line="360"/>
-        <w:ind w:firstLine="720"/>
-        <w:jc w:val="both"/>
-      </w:pPr>
-      <w:r>
-        <w:t xml:space="preserve">The methodology is aligned directly with these questions. The study uses existing, openly available NEON data for CLBJ, so no new field campaign is needed. To keep the sensors consistent, I will use data from a single flight year, 2024: the 10 cm RGB mosaic, the LiDAR canopy height model and point cloud, and the hyperspectral reflectance product. Ground truth comes from NEON vegetation structure surveys (NEON, 2026), which record 862 live trees at least 2 m tall in 47 plots; 517 of these have mapped stem positions, and the main species are post oak, eastern redcedar and blackjack oak. Five plots covering both woodland and grassland have already been selected, and the RGB and canopy height tiles that cover them have been downloaded.</w:t>
-      </w:r>
-    </w:p>
-    <w:p>
-      <w:pPr>
-        <w:spacing w:after="0" w:line="360"/>
-        <w:ind w:firstLine="720"/>
-        <w:jc w:val="both"/>
-      </w:pPr>
-      <w:r>
-        <w:t xml:space="preserve">For the first research question, DeepForest and Detectree2 will be run with their pretrained weights and again after fine-tuning on local crowns, and SAM and SAM 2 will be run in zero-shot mode and then with LiDAR tree-top prompts, the height filter and the hyperspectral vegetation mask. Performance will be measured as the proportion of the 517 field-mapped trees that are detected, and as precision, recall, F1 score and intersection-over-union against 150 to 300 hand-delineated reference crowns, with errors examined by crown size and setting. For the second research question, I will extract for each crown its mean spectrum, vegetation indices and principal components, together with LiDAR height and structure metrics and RGB texture, and train random forest, support vector machine and one-dimensional convolutional neural network classifiers on hyperspectral-only, LiDAR-only, RGB-only and combined inputs. Results will be reported as overall accuracy, per-class F1 score and kappa.</w:t>
-      </w:r>
-    </w:p>
-    <w:p>
-      <w:pPr>
-        <w:spacing w:after="0" w:line="360"/>
-        <w:ind w:firstLine="720"/>
-        <w:jc w:val="both"/>
-      </w:pPr>
-      <w:r>
-        <w:t xml:space="preserve">Rigor is built into the design in several ways. Accuracy will be assessed with standard measures for remotely sensed maps (Congalton, 1991) and with intersection-over-union for crown outlines, following the NEON crown benchmark (Weinstein et al., 2021). Field stems and image crowns are different kinds of measurement, so both will be used: field stems test whether real trees are found, and reference crowns test how well their outlines match. Because nearby trees resemble each other, random splits would overstate accuracy, so classifiers will be trained and tested on spatially separate blocks (Roberts et al., 2017; Ploton et al., 2020). A sensor ablation, in which each analysis is repeated with one data source removed, will directly measure what each sensor contributes. All processing will be scripted in Python, with R for selected LiDAR steps, and kept under version control, and the product versions, model settings and prompts will be recorded so that the results can be reproduced.</w:t>
-      </w:r>
-    </w:p>
-    <w:p>
-      <w:pPr>
-        <w:spacing w:after="0" w:line="360"/>
-        <w:ind w:firstLine="720"/>
-        <w:jc w:val="both"/>
-      </w:pPr>
-      <w:r>
-        <w:t xml:space="preserve">The project is organized as a sequence in which each phase feeds the next. Data preparation aligns the three sensors and the field records. Crown delineation produces crowns from the four models, and the reference dataset is used to evaluate them. The best delineation then feeds species classification and, if time allows, the change analysis. The work is planned over twelve months: data preparation and literature review in months one and two, reference crowns and delineation experiments in months three to five, species classification and sensor comparison in months six to eight, the optional change analysis and synthesis in month nine, and writing, revision and the defense in the final three months. The first research question is the core of the thesis, so later phases can be narrowed without affecting it.</w:t>
-      </w:r>
-    </w:p>
-    <w:p>
-      <w:pPr>
-        <w:spacing w:after="0" w:line="360"/>
-        <w:ind w:firstLine="720"/>
-        <w:jc w:val="both"/>
-      </w:pPr>
-      <w:r>
-        <w:t xml:space="preserve">The intellectual merit of the study lies in the direct evidence it is expected to provide on how supervised deep learning and foundation models compare for tree crown delineation in an open savanna, and on whether LiDAR and hyperspectral guidance can make general-purpose foundation models work in a landscape they were not trained on. It will also show how much RGB, LiDAR and hyperspectral data each add to crown delineation and species identification, which can guide sensor and model choices in similar studies. A checked set of reference crowns and species labels for CLBJ will fill the gap in the NEON benchmark and can be shared for future work.</w:t>
-      </w:r>
-    </w:p>
-    <w:p>
-      <w:pPr>
-        <w:spacing w:after="0" w:line="360"/>
-        <w:ind w:firstLine="720"/>
-        <w:jc w:val="both"/>
-      </w:pPr>
-      <w:r>
-        <w:t xml:space="preserve">In terms of broader impacts, tree-level maps of oaks and redcedar can help the US Forest Service target cedar removal and plan prescribed burns at LBJ. Because NEON collects the same three types of data at grassland and savanna sites across the United States, an open and reproducible workflow developed here can be transferred to other sites facing woody encroachment.</w:t>
-      </w:r>
-    </w:p>
-    <w:p>
-      <w:pPr>
-        <w:spacing w:after="0" w:line="360"/>
-        <w:ind w:firstLine="720"/>
-        <w:jc w:val="both"/>
-      </w:pPr>
-      <w:r>
-        <w:t xml:space="preserve">Finally, the framework rests on some assumptions and has limitations. It assumes that field records and imagery from the same period describe the same trees, which may not hold where trees died or were cleared between survey and flight. The 1 m hyperspectral pixels limit species classification for very small crowns, and the 2022 to 2025 hyperspectral data are provisional and may be revised, so the version used will be recorded. Results from a single site may not transfer directly to other savannas, and running SAM and SAM 2 over large areas requires GPU resources. These limits are recognized in the design, and the core comparison in the first research question does not depend on any of them.</w:t>
+        <w:t xml:space="preserve">) as fire has become less frequent (Van Auken, 2000; Briggs et al., 2005; Twidwell et al., 2013), and its expansion has been mapped over recent decades in neighboring Oklahoma (Wang et al., 2017). Prescribed fire is used by the US Forest Service at LBJ to limit woody cover, and about 5,635 acres were included in the Denton Creek project (USDA Forest Service, 2013). In such a landscape, every tree crown must be located, and native oaks must be distinguished from encroaching redcedar.</w:t>
+      </w:r>
+    </w:p>
+    <w:p>
+      <w:pPr>
+        <w:spacing w:after="0" w:line="360"/>
+        <w:ind w:firstLine="720"/>
+        <w:jc w:val="both"/>
+      </w:pPr>
+      <w:r>
+        <w:t xml:space="preserve">In individual tree mapping, each crown, rather than each pixel, is treated as the unit of analysis, because very high-resolution pixels are much smaller than the objects being mapped (Blaschke, 2010; Ke &amp; Quackenbush, 2011). A crown is described differently by each of the three NEON sensors, and each sensor is used for a different purpose. All three sensors are carried on the same aircraft of NEON’s Airborne Observation Platform, and their data are collected in the same flight, so the products are closely co-registered (Kampe et al., 2010).</w:t>
+      </w:r>
+    </w:p>
+    <w:p>
+      <w:pPr>
+        <w:spacing w:after="0" w:line="360"/>
+        <w:ind w:firstLine="720"/>
+        <w:jc w:val="both"/>
+      </w:pPr>
+      <w:r>
+        <w:t xml:space="preserve">Orthorectified RGB mosaics are produced by NEON’s digital camera at 10 cm resolution. At this resolution, individual crowns, their edges and their internal texture are clearly visible, and for this reason most deep learning tree detectors, including DeepForest and Detectree2, have been designed for RGB input (Weinstein et al., 2019; Ball et al., 2023). Two important limits are imposed by RGB imagery in a savanna. Because no height information is contained in it, a green tree crown can be confused with a green patch of grass or shrub, and neighboring crowns of similar color can be merged into one. The apparent shape of crowns is also altered by shadows. RGB imagery is therefore used as the main input for detecting and outlining crowns, and its weaknesses are addressed with the other two sensors.</w:t>
+      </w:r>
+    </w:p>
+    <w:p>
+      <w:pPr>
+        <w:spacing w:after="0" w:line="360"/>
+        <w:ind w:firstLine="720"/>
+        <w:jc w:val="both"/>
+      </w:pPr>
+      <w:r>
+        <w:t xml:space="preserve">The three-dimensional positions of laser returns from the canopy and the ground are recorded by LiDAR. From the point cloud, a canopy height model at 1 m resolution is derived by NEON, in which the height of vegetation above the ground is given. Local maxima in a canopy height model have been widely used to locate individual tree tops (Popescu &amp; Wynne, 2004), and point clouds have been segmented directly into individual trees (Li et al., 2012; Zhen et al., 2016; Roussel et al., 2020). LiDAR remote sensing of vegetation structure has been reviewed in detail by Dong and Chen (2018). Two roles are assigned to LiDAR. Tree-top locations are provided that can be used as prompts for foundation models, and a height filter is provided by which grass and low shrubs are removed, a task that cannot be accomplished with RGB imagery alone. Structural features, such as height and crown shape, are also supplied, by which the dense, conical crowns of redcedar can be separated from the broader crowns of oaks.</w:t>
+      </w:r>
+    </w:p>
+    <w:p>
+      <w:pPr>
+        <w:spacing w:after="0" w:line="360"/>
+        <w:ind w:firstLine="720"/>
+        <w:jc w:val="both"/>
+      </w:pPr>
+      <w:r>
+        <w:t xml:space="preserve">Reflected light from 380 to about 2510 nm is measured by NEON’s imaging spectrometer in roughly 5 nm bands, and about 426 bands are produced at 1 m resolution. Canopy reflectance is controlled by leaf pigments, water and dry matter and by canopy structure (Asner, 1998), and these properties have been shown to differ among plant functional types and species (Ustin &amp; Gamon, 2010). As a result, hyperspectral data are regarded as among the most effective data for tree species classification (Fassnacht et al., 2016), and across NEON sites individual trees have been classified to species with an average accuracy of 0.77 (Marconi et al., 2022). Bands affected by atmospheric water vapor, around 1340 to 1445 nm and 1790 to 1955 nm, are removed before analysis. Two purposes are served by the hyperspectral data: a vegetation mask is provided by which vegetation is separated from bare ground and dry grass during crown delineation, and the main set of features for species classification is supplied. The main limitation is the 1 m pixel size, because small crowns are covered by only a few pixels, and tree and background signals are mixed in pixels at crown edges.</w:t>
+      </w:r>
+    </w:p>
+    <w:p>
+      <w:pPr>
+        <w:spacing w:after="0" w:line="360"/>
+        <w:ind w:firstLine="720"/>
+        <w:jc w:val="both"/>
+      </w:pPr>
+      <w:r>
+        <w:t xml:space="preserve">The three sensors are therefore complementary: crown boundaries are revealed by RGB imagery, crown height and shape are described by LiDAR, and crown composition is captured by hyperspectral imagery. In multisensor fusion theory, it is held that better results are obtained when sensors measuring different properties are combined than when any one of them is used alone (Pohl &amp; van Genderen, 1998), and tree-level mapping in forests has been improved when LiDAR has been combined with hyperspectral data (Dalponte &amp; Coomes, 2016; Scholl et al., 2021).</w:t>
+      </w:r>
+    </w:p>
+    <w:p>
+      <w:pPr>
+        <w:spacing w:after="0" w:line="360"/>
+        <w:ind w:firstLine="720"/>
+        <w:jc w:val="both"/>
+      </w:pPr>
+      <w:r>
+        <w:t xml:space="preserve">In deep learning, features are learned directly from data by many-layered neural networks rather than being defined by hand-designed rules (LeCun et al., 2015), and convolutional neural networks have become standard tools in remote sensing (Zhu et al., 2017). Two types of supervised model are considered. In object detection, each tree is located with a bounding box. DeepForest is built on the RetinaNet detector (Lin et al., 2017) and was trained on NEON RGB imagery, with a large set of training labels generated from LiDAR-derived tree locations (Weinstein et al., 2019, 2020). In instance segmentation, the exact shape of each crown is outlined. Detectree2 is built on Mask R-CNN (He et al., 2017) and was developed for crown delineation in tropical forests (Ball et al., 2023). Good performance is achieved by both models in landscapes similar to those on which they were trained, but both are affected by domain shift, and lower accuracy is typically obtained in landscapes that look different. An open savanna differs strongly from a closed forest, and CLBJ was excluded from the NEON crown benchmark because too few trees met its criteria (Weinstein et al., 2021). This problem is usually reduced by fine-tuning on a small set of local crowns.</w:t>
+      </w:r>
+    </w:p>
+    <w:p>
+      <w:pPr>
+        <w:spacing w:after="0" w:line="360"/>
+        <w:ind w:firstLine="720"/>
+        <w:jc w:val="both"/>
+      </w:pPr>
+      <w:r>
+        <w:t xml:space="preserve">Foundation models are trained on very large and diverse datasets and can then be applied to many tasks with little or no retraining (Bommasani et al., 2021). In the Segment Anything Model (SAM), a vision transformer image encoder (Dosovitskiy et al., 2021) is combined with a prompt encoder and a mask decoder, and the model was trained on more than one billion masks from eleven million images (Kirillov et al., 2023). When a prompt, such as a point or a box, is given, an outline of the object at that location is returned without any training for that object type. In SAM 2, the model is extended to video with a memory module, and on images it has been reported to be more accurate and about six times faster than SAM (Ravi et al., 2024). These models have been made usable with georeferenced imagery through tools such as samgeo (Wu &amp; Osco, 2023). On remote sensing imagery, however, uneven performance has been reported, and results have been found to depend heavily on prompt quality (Osco et al., 2023). For tree crowns in drone imagery, a trained Mask R-CNN was not matched by SAM used out of the box, and its results were improved when elevation data were added (Teng et al., 2025). The role of LiDAR is thus indicated directly, since the tree-top prompts and height information that are lacking in SAM can be supplied by LiDAR.</w:t>
+      </w:r>
+    </w:p>
+    <w:p>
+      <w:pPr>
+        <w:spacing w:after="0" w:line="360"/>
+        <w:ind w:firstLine="720"/>
+        <w:jc w:val="both"/>
+      </w:pPr>
+      <w:r>
+        <w:t xml:space="preserve">After crowns are delineated, each crown is described by a set of features and assigned to a species class. In random forest, many decision trees are built on random subsets of the data and features, and robustness to noisy and high-dimensional inputs is achieved (Breiman, 2001). In support vector machines, the boundary by which classes are best separated is found (Cortes &amp; Vapnik, 1995), and good performance has been obtained on hyperspectral data without prior band reduction (Melgani &amp; Bruzzone, 2004). In one-dimensional convolutional neural networks, patterns are learned directly along the spectrum of each pixel or crown, and support vector machines have been outperformed by them on several hyperspectral datasets (Hu et al., 2015). Through a comparison of the three classifiers, it can be shown whether value is added by a deep learning approach over established machine learning methods, given the relatively small number of labeled trees available at CLBJ.</w:t>
+      </w:r>
+    </w:p>
+    <w:p>
+      <w:pPr>
+        <w:spacing w:after="0" w:line="360"/>
+        <w:ind w:firstLine="720"/>
+        <w:jc w:val="both"/>
+      </w:pPr>
+      <w:r>
+        <w:t xml:space="preserve">Data and models are linked at three levels, following the pixel, feature and decision levels of multisensor fusion (Pohl &amp; van Genderen, 1998). At the image level, RGB imagery is used as the input to all four crown delineation models. At the decision level, the foundation models are guided by LiDAR and hyperspectral data: tree tops from the canopy height model are converted into point prompts for SAM and SAM 2, grass and low shrubs are removed with a 2 m height threshold, and bare ground and senescent grass are removed with a hyperspectral vegetation mask. At the feature level, hyperspectral, LiDAR and RGB features are extracted from the delineated crowns and combined for species classification.</w:t>
+      </w:r>
+    </w:p>
+    <w:p>
+      <w:pPr>
+        <w:spacing w:after="0" w:line="360"/>
+        <w:ind w:firstLine="720"/>
+        <w:jc w:val="both"/>
+      </w:pPr>
+      <w:r>
+        <w:t xml:space="preserve">From this structure, the core proposition of the study is derived: when general-purpose foundation models are guided by structural information from LiDAR and spectral information from hyperspectral imagery, the domain shift by which forest-trained deep learning models are limited in an open savanna can be overcome, and tree species can then be identified from the same multi-sensor features. Delineation accuracy is expected to be affected mainly by model type and guidance type, and this effect is expected to be moderated by crown size, tree isolation and setting (open grassland or woodland). For species identification, the combination of sensors is treated as the factor of interest, and classification accuracy is treated as the outcome.</w:t>
+      </w:r>
+    </w:p>
+    <w:p>
+      <w:pPr>
+        <w:spacing w:after="0" w:line="360"/>
+        <w:ind w:firstLine="720"/>
+        <w:jc w:val="both"/>
+      </w:pPr>
+      <w:r>
+        <w:t xml:space="preserve">Two research questions are posed. In the first, it is asked how supervised deep learning models (DeepForest and Detectree2) compare with foundation models (SAM and SAM 2) for crown delineation in an open savanna, and whether the foundation models are improved by LiDAR and hyperspectral guidance. On the basis of the domain-shift argument and the evidence that SAM is helped by elevation data, it is hypothesized that guided SAM and SAM 2 will clearly outperform their zero-shot forms and will approach the accuracy of the trained detectors without site-specific training, and that the lowest accuracy will be obtained for small and clustered crowns.</w:t>
+      </w:r>
+    </w:p>
+    <w:p>
+      <w:pPr>
+        <w:spacing w:after="0" w:line="360"/>
+        <w:ind w:firstLine="720"/>
+        <w:jc w:val="both"/>
+      </w:pPr>
+      <w:r>
+        <w:t xml:space="preserve">In the second, it is asked how accurately the delineated crowns can be classified to species and how much is contributed by hyperspectral, LiDAR and RGB data. Because species differences are rooted in spectral properties, the largest contribution is expected from hyperspectral data, and on the basis of fusion theory, further improvement in the separation of evergreen redcedar from deciduous oaks is expected when LiDAR structure is added. The one-dimensional convolutional neural network is expected to perform at least as well as random forest and support vector machines, although its advantage may be limited by the small number of labeled trees.</w:t>
+      </w:r>
+    </w:p>
+    <w:p>
+      <w:pPr>
+        <w:spacing w:after="0" w:line="360"/>
+        <w:ind w:firstLine="720"/>
+        <w:jc w:val="both"/>
+      </w:pPr>
+      <w:r>
+        <w:t xml:space="preserve">A third, optional question is also considered, in which it is asked whether redcedar expansion between NEON flight years can be detected with the best workflow and whether expansion differs between burned and unburned management units. In this question, the framework is applied rather than tested, and the thesis is not dependent on it.</w:t>
+      </w:r>
+    </w:p>
+    <w:p>
+      <w:pPr>
+        <w:spacing w:after="0" w:line="360"/>
+        <w:ind w:firstLine="720"/>
+        <w:jc w:val="both"/>
+      </w:pPr>
+      <w:r>
+        <w:t xml:space="preserve">Only existing, openly available NEON data for CLBJ are used, so no new field campaign is required. To keep the sensors consistent, data from a single flight year, 2024, are used: the 10 cm RGB mosaic, the LiDAR canopy height model and point cloud, and the hyperspectral reflectance product. Ground truth is taken from NEON vegetation structure surveys (NEON, 2026), in which 862 live trees at least 2 m tall were recorded in 47 plots; stem positions have been mapped for 517 of these, and post oak, eastern redcedar and blackjack oak are the main species. Five plots covering both woodland and grassland have already been selected, and the RGB and canopy height tiles covering them have been downloaded.</w:t>
+      </w:r>
+    </w:p>
+    <w:p>
+      <w:pPr>
+        <w:spacing w:after="0" w:line="360"/>
+        <w:ind w:firstLine="720"/>
+        <w:jc w:val="both"/>
+      </w:pPr>
+      <w:r>
+        <w:t xml:space="preserve">For the first research question, DeepForest and Detectree2 will be run with their pretrained weights and again after fine-tuning on local crowns, and SAM and SAM 2 will be run in zero-shot mode and then with LiDAR tree-top prompts, the height filter and the hyperspectral vegetation mask. Performance will be measured as the proportion of the 517 field-mapped trees that are detected and as precision, recall, F1 score and intersection-over-union against 150 to 300 hand-delineated reference crowns, and errors will be examined by crown size and setting. For the second research question, the mean spectrum, vegetation indices and principal components of each crown will be extracted, together with LiDAR height and structure metrics and RGB texture, and random forest, support vector machine and one-dimensional convolutional neural network classifiers will be trained on hyperspectral-only, LiDAR-only, RGB-only and combined inputs. Results will be reported as overall accuracy, per-class F1 score and kappa.</w:t>
+      </w:r>
+    </w:p>
+    <w:p>
+      <w:pPr>
+        <w:spacing w:after="0" w:line="360"/>
+        <w:ind w:firstLine="720"/>
+        <w:jc w:val="both"/>
+      </w:pPr>
+      <w:r>
+        <w:t xml:space="preserve">Accuracy will be assessed with standard measures for remotely sensed maps (Congalton, 1991) and with intersection-over-union for crown outlines, as in the NEON crown benchmark (Weinstein et al., 2021). Because field stems and image crowns are different kinds of measurement, both will be used: whether real trees are found will be tested with the field stems, and how well their outlines match will be tested with the reference crowns. Since nearby trees resemble each other, accuracy would be overstated by random splits, so the classifiers will be trained and tested on spatially separate blocks (Roberts et al., 2017; Ploton et al., 2020). In a sensor ablation, each analysis will be repeated with one data source removed, so that the contribution of each sensor can be measured directly. All processing will be scripted in Python, with R used for selected LiDAR steps, and will be kept under version control, and product versions, model settings and prompts will be recorded so that the results can be reproduced.</w:t>
+      </w:r>
+    </w:p>
+    <w:p>
+      <w:pPr>
+        <w:spacing w:after="0" w:line="360"/>
+        <w:ind w:firstLine="720"/>
+        <w:jc w:val="both"/>
+      </w:pPr>
+      <w:r>
+        <w:t xml:space="preserve">The project is organized as a sequence in which the output of each phase is used in the next. In data preparation, the three sensors and the field records are aligned. In crown delineation, crowns are produced by the four models and evaluated against the reference dataset. The best delineation is then used for species classification and, if time allows, for change analysis. The work is planned over twelve months: data preparation and literature review in months one and two, reference crowns and delineation experiments in months three to five, species classification and sensor comparison in months six to eight, the optional change analysis and synthesis in month nine, and writing, revision and the defense in the final three months. Because the first research question forms the core of the thesis, later phases can be narrowed without it being affected.</w:t>
+      </w:r>
+    </w:p>
+    <w:p>
+      <w:pPr>
+        <w:spacing w:after="0" w:line="360"/>
+        <w:ind w:firstLine="720"/>
+        <w:jc w:val="both"/>
+      </w:pPr>
+      <w:r>
+        <w:t xml:space="preserve">In terms of intellectual merit, direct evidence is expected on how supervised deep learning and foundation models compare for crown delineation in an open savanna, and on whether general-purpose foundation models can be made to work in a landscape on which they were not trained when they are guided by LiDAR and hyperspectral data. The contribution of RGB, LiDAR and hyperspectral data to crown delineation and species identification will also be quantified, so that sensor and model choices in similar studies can be guided. A checked set of reference crowns and species labels for CLBJ will be produced, by which the gap in the NEON benchmark can be filled, and it will be shared for future work.</w:t>
+      </w:r>
+    </w:p>
+    <w:p>
+      <w:pPr>
+        <w:spacing w:after="0" w:line="360"/>
+        <w:ind w:firstLine="720"/>
+        <w:jc w:val="both"/>
+      </w:pPr>
+      <w:r>
+        <w:t xml:space="preserve">In terms of broader impacts, tree-level maps of oaks and redcedar can be used by the US Forest Service to target cedar removal and plan prescribed burns at LBJ. Because the same three types of data are collected by NEON at grassland and savanna sites across the United States, an open and reproducible workflow developed here can be transferred to other sites affected by woody encroachment.</w:t>
+      </w:r>
+    </w:p>
+    <w:p>
+      <w:pPr>
+        <w:spacing w:after="0" w:line="360"/>
+        <w:ind w:firstLine="720"/>
+        <w:jc w:val="both"/>
+      </w:pPr>
+      <w:r>
+        <w:t xml:space="preserve">It is assumed that the same trees are described by field records and imagery from the same period, although this may not hold where trees died or were cleared between survey and flight. Species classification of very small crowns is limited by the 1 m hyperspectral pixels, and because the 2022 to 2025 hyperspectral data are provisional and may be revised, the version used will be recorded. Results obtained at a single site may not be directly transferable to other savannas, and GPU resources are required when SAM and SAM 2 are run over large areas. These limits are recognized in the design, and the core comparison in the first research question does not depend on any of them.</w:t>
       </w:r>
     </w:p>
     <w:p>

</xml_diff>

<commit_message>
Framework: tighter argument with prompt-level fusion, hypotheses and 40 references
Co-Authored-By: Claude Opus 5.5 <noreply@anthropic.com>
Claude-Session: https://claude.ai/code/session_0132bxCMLAKTHUnyQV3MmGfs
</commit_message>
<xml_diff>
--- a/thesis/Proposed_Research_Framework_Poudel.docx
+++ b/thesis/Proposed_Research_Framework_Poudel.docx
@@ -52,7 +52,37 @@
         <w:jc w:val="both"/>
       </w:pPr>
       <w:r>
-        <w:t xml:space="preserve">LBJ National Grassland (NEON site CLBJ) in Wise County, Texas, is an open Cross Timbers savanna in which post oak and blackjack oak woodland is mixed with grassland. Grasslands across the southern Great Plains have been invaded by eastern redcedar (</w:t>
+        <w:t xml:space="preserve">Individual trees are the units in which woody plant encroachment, carbon storage and habitat change are expressed, yet they are rarely the units in which landscapes are mapped. This gap has been narrowed by two recent developments in geospatial artificial intelligence (GeoAI). Deep learning detectors have been trained to locate individual tree crowns in very high-resolution imagery (Weinstein et al., 2019; Ball et al., 2023), and vision foundation models have been released that segment almost any object in an image when only a point or a box is supplied (Kirillov et al., 2023; Ravi et al., 2024). Both developments, however, have been built almost entirely on RGB imagery, whereas the airborne platforms now flown routinely over ecological sites record each crown in three complementary ways: its color and outline in RGB imagery, its three-dimensional structure in LiDAR, and its biochemical composition in hyperspectral imagery (Kampe et al., 2010). How these three spatial datasets should be joined to GeoAI models, and whether general-purpose foundation models can be turned into reliable crown mappers when they are guided by structural and spectral data, has not been established. This question is addressed in the proposed research.</w:t>
+      </w:r>
+    </w:p>
+    <w:p>
+      <w:pPr>
+        <w:spacing w:after="0" w:line="360"/>
+        <w:ind w:firstLine="720"/>
+        <w:jc w:val="both"/>
+      </w:pPr>
+      <w:r>
+        <w:t xml:space="preserve">The question is examined at LBJ National Grassland (NEON site CLBJ), Texas, an open Cross Timbers savanna in which post oak (</w:t>
+      </w:r>
+      <w:r>
+        <w:rPr>
+          <w:i/>
+          <w:iCs/>
+        </w:rPr>
+        <w:t xml:space="preserve">Quercus stellata</w:t>
+      </w:r>
+      <w:r>
+        <w:t xml:space="preserve">) and blackjack oak (</w:t>
+      </w:r>
+      <w:r>
+        <w:rPr>
+          <w:i/>
+          <w:iCs/>
+        </w:rPr>
+        <w:t xml:space="preserve">Quercus marilandica</w:t>
+      </w:r>
+      <w:r>
+        <w:t xml:space="preserve">) woodland is interspersed with grassland that is being invaded by eastern redcedar (</w:t>
       </w:r>
       <w:r>
         <w:rPr>
@@ -62,207 +92,157 @@
         <w:t xml:space="preserve">Juniperus virginiana</w:t>
       </w:r>
       <w:r>
-        <w:t xml:space="preserve">) as fire has become less frequent (Van Auken, 2000; Briggs et al., 2005; Twidwell et al., 2013), and its expansion has been mapped over recent decades in neighboring Oklahoma (Wang et al., 2017). Prescribed fire is used by the US Forest Service at LBJ to limit woody cover, and about 5,635 acres were included in the Denton Creek project (USDA Forest Service, 2013). In such a landscape, every tree crown must be located, and native oaks must be distinguished from encroaching redcedar.</w:t>
-      </w:r>
-    </w:p>
-    <w:p>
-      <w:pPr>
-        <w:spacing w:after="0" w:line="360"/>
-        <w:ind w:firstLine="720"/>
-        <w:jc w:val="both"/>
-      </w:pPr>
-      <w:r>
-        <w:t xml:space="preserve">In individual tree mapping, each crown, rather than each pixel, is treated as the unit of analysis, because very high-resolution pixels are much smaller than the objects being mapped (Blaschke, 2010; Ke &amp; Quackenbush, 2011). A crown is described differently by each of the three NEON sensors, and each sensor is used for a different purpose. All three sensors are carried on the same aircraft of NEON’s Airborne Observation Platform, and their data are collected in the same flight, so the products are closely co-registered (Kampe et al., 2010).</w:t>
-      </w:r>
-    </w:p>
-    <w:p>
-      <w:pPr>
-        <w:spacing w:after="0" w:line="360"/>
-        <w:ind w:firstLine="720"/>
-        <w:jc w:val="both"/>
-      </w:pPr>
-      <w:r>
-        <w:t xml:space="preserve">Orthorectified RGB mosaics are produced by NEON’s digital camera at 10 cm resolution. At this resolution, individual crowns, their edges and their internal texture are clearly visible, and for this reason most deep learning tree detectors, including DeepForest and Detectree2, have been designed for RGB input (Weinstein et al., 2019; Ball et al., 2023). Two important limits are imposed by RGB imagery in a savanna. Because no height information is contained in it, a green tree crown can be confused with a green patch of grass or shrub, and neighboring crowns of similar color can be merged into one. The apparent shape of crowns is also altered by shadows. RGB imagery is therefore used as the main input for detecting and outlining crowns, and its weaknesses are addressed with the other two sensors.</w:t>
-      </w:r>
-    </w:p>
-    <w:p>
-      <w:pPr>
-        <w:spacing w:after="0" w:line="360"/>
-        <w:ind w:firstLine="720"/>
-        <w:jc w:val="both"/>
-      </w:pPr>
-      <w:r>
-        <w:t xml:space="preserve">The three-dimensional positions of laser returns from the canopy and the ground are recorded by LiDAR. From the point cloud, a canopy height model at 1 m resolution is derived by NEON, in which the height of vegetation above the ground is given. Local maxima in a canopy height model have been widely used to locate individual tree tops (Popescu &amp; Wynne, 2004), and point clouds have been segmented directly into individual trees (Li et al., 2012; Zhen et al., 2016; Roussel et al., 2020). LiDAR remote sensing of vegetation structure has been reviewed in detail by Dong and Chen (2018). Two roles are assigned to LiDAR. Tree-top locations are provided that can be used as prompts for foundation models, and a height filter is provided by which grass and low shrubs are removed, a task that cannot be accomplished with RGB imagery alone. Structural features, such as height and crown shape, are also supplied, by which the dense, conical crowns of redcedar can be separated from the broader crowns of oaks.</w:t>
-      </w:r>
-    </w:p>
-    <w:p>
-      <w:pPr>
-        <w:spacing w:after="0" w:line="360"/>
-        <w:ind w:firstLine="720"/>
-        <w:jc w:val="both"/>
-      </w:pPr>
-      <w:r>
-        <w:t xml:space="preserve">Reflected light from 380 to about 2510 nm is measured by NEON’s imaging spectrometer in roughly 5 nm bands, and about 426 bands are produced at 1 m resolution. Canopy reflectance is controlled by leaf pigments, water and dry matter and by canopy structure (Asner, 1998), and these properties have been shown to differ among plant functional types and species (Ustin &amp; Gamon, 2010). As a result, hyperspectral data are regarded as among the most effective data for tree species classification (Fassnacht et al., 2016), and across NEON sites individual trees have been classified to species with an average accuracy of 0.77 (Marconi et al., 2022). Bands affected by atmospheric water vapor, around 1340 to 1445 nm and 1790 to 1955 nm, are removed before analysis. Two purposes are served by the hyperspectral data: a vegetation mask is provided by which vegetation is separated from bare ground and dry grass during crown delineation, and the main set of features for species classification is supplied. The main limitation is the 1 m pixel size, because small crowns are covered by only a few pixels, and tree and background signals are mixed in pixels at crown edges.</w:t>
-      </w:r>
-    </w:p>
-    <w:p>
-      <w:pPr>
-        <w:spacing w:after="0" w:line="360"/>
-        <w:ind w:firstLine="720"/>
-        <w:jc w:val="both"/>
-      </w:pPr>
-      <w:r>
-        <w:t xml:space="preserve">The three sensors are therefore complementary: crown boundaries are revealed by RGB imagery, crown height and shape are described by LiDAR, and crown composition is captured by hyperspectral imagery. In multisensor fusion theory, it is held that better results are obtained when sensors measuring different properties are combined than when any one of them is used alone (Pohl &amp; van Genderen, 1998), and tree-level mapping in forests has been improved when LiDAR has been combined with hyperspectral data (Dalponte &amp; Coomes, 2016; Scholl et al., 2021).</w:t>
-      </w:r>
-    </w:p>
-    <w:p>
-      <w:pPr>
-        <w:spacing w:after="0" w:line="360"/>
-        <w:ind w:firstLine="720"/>
-        <w:jc w:val="both"/>
-      </w:pPr>
-      <w:r>
-        <w:t xml:space="preserve">In deep learning, features are learned directly from data by many-layered neural networks rather than being defined by hand-designed rules (LeCun et al., 2015), and convolutional neural networks have become standard tools in remote sensing (Zhu et al., 2017). Two types of supervised model are considered. In object detection, each tree is located with a bounding box. DeepForest is built on the RetinaNet detector (Lin et al., 2017) and was trained on NEON RGB imagery, with a large set of training labels generated from LiDAR-derived tree locations (Weinstein et al., 2019, 2020). In instance segmentation, the exact shape of each crown is outlined. Detectree2 is built on Mask R-CNN (He et al., 2017) and was developed for crown delineation in tropical forests (Ball et al., 2023). Good performance is achieved by both models in landscapes similar to those on which they were trained, but both are affected by domain shift, and lower accuracy is typically obtained in landscapes that look different. An open savanna differs strongly from a closed forest, and CLBJ was excluded from the NEON crown benchmark because too few trees met its criteria (Weinstein et al., 2021). This problem is usually reduced by fine-tuning on a small set of local crowns.</w:t>
-      </w:r>
-    </w:p>
-    <w:p>
-      <w:pPr>
-        <w:spacing w:after="0" w:line="360"/>
-        <w:ind w:firstLine="720"/>
-        <w:jc w:val="both"/>
-      </w:pPr>
-      <w:r>
-        <w:t xml:space="preserve">Foundation models are trained on very large and diverse datasets and can then be applied to many tasks with little or no retraining (Bommasani et al., 2021). In the Segment Anything Model (SAM), a vision transformer image encoder (Dosovitskiy et al., 2021) is combined with a prompt encoder and a mask decoder, and the model was trained on more than one billion masks from eleven million images (Kirillov et al., 2023). When a prompt, such as a point or a box, is given, an outline of the object at that location is returned without any training for that object type. In SAM 2, the model is extended to video with a memory module, and on images it has been reported to be more accurate and about six times faster than SAM (Ravi et al., 2024). These models have been made usable with georeferenced imagery through tools such as samgeo (Wu &amp; Osco, 2023). On remote sensing imagery, however, uneven performance has been reported, and results have been found to depend heavily on prompt quality (Osco et al., 2023). For tree crowns in drone imagery, a trained Mask R-CNN was not matched by SAM used out of the box, and its results were improved when elevation data were added (Teng et al., 2025). The role of LiDAR is thus indicated directly, since the tree-top prompts and height information that are lacking in SAM can be supplied by LiDAR.</w:t>
-      </w:r>
-    </w:p>
-    <w:p>
-      <w:pPr>
-        <w:spacing w:after="0" w:line="360"/>
-        <w:ind w:firstLine="720"/>
-        <w:jc w:val="both"/>
-      </w:pPr>
-      <w:r>
-        <w:t xml:space="preserve">After crowns are delineated, each crown is described by a set of features and assigned to a species class. In random forest, many decision trees are built on random subsets of the data and features, and robustness to noisy and high-dimensional inputs is achieved (Breiman, 2001). In support vector machines, the boundary by which classes are best separated is found (Cortes &amp; Vapnik, 1995), and good performance has been obtained on hyperspectral data without prior band reduction (Melgani &amp; Bruzzone, 2004). In one-dimensional convolutional neural networks, patterns are learned directly along the spectrum of each pixel or crown, and support vector machines have been outperformed by them on several hyperspectral datasets (Hu et al., 2015). Through a comparison of the three classifiers, it can be shown whether value is added by a deep learning approach over established machine learning methods, given the relatively small number of labeled trees available at CLBJ.</w:t>
-      </w:r>
-    </w:p>
-    <w:p>
-      <w:pPr>
-        <w:spacing w:after="0" w:line="360"/>
-        <w:ind w:firstLine="720"/>
-        <w:jc w:val="both"/>
-      </w:pPr>
-      <w:r>
-        <w:t xml:space="preserve">Data and models are linked at three levels, following the pixel, feature and decision levels of multisensor fusion (Pohl &amp; van Genderen, 1998). At the image level, RGB imagery is used as the input to all four crown delineation models. At the decision level, the foundation models are guided by LiDAR and hyperspectral data: tree tops from the canopy height model are converted into point prompts for SAM and SAM 2, grass and low shrubs are removed with a 2 m height threshold, and bare ground and senescent grass are removed with a hyperspectral vegetation mask. At the feature level, hyperspectral, LiDAR and RGB features are extracted from the delineated crowns and combined for species classification.</w:t>
-      </w:r>
-    </w:p>
-    <w:p>
-      <w:pPr>
-        <w:spacing w:after="0" w:line="360"/>
-        <w:ind w:firstLine="720"/>
-        <w:jc w:val="both"/>
-      </w:pPr>
-      <w:r>
-        <w:t xml:space="preserve">From this structure, the core proposition of the study is derived: when general-purpose foundation models are guided by structural information from LiDAR and spectral information from hyperspectral imagery, the domain shift by which forest-trained deep learning models are limited in an open savanna can be overcome, and tree species can then be identified from the same multi-sensor features. Delineation accuracy is expected to be affected mainly by model type and guidance type, and this effect is expected to be moderated by crown size, tree isolation and setting (open grassland or woodland). For species identification, the combination of sensors is treated as the factor of interest, and classification accuracy is treated as the outcome.</w:t>
-      </w:r>
-    </w:p>
-    <w:p>
-      <w:pPr>
-        <w:spacing w:after="0" w:line="360"/>
-        <w:ind w:firstLine="720"/>
-        <w:jc w:val="both"/>
-      </w:pPr>
-      <w:r>
-        <w:t xml:space="preserve">Two research questions are posed. In the first, it is asked how supervised deep learning models (DeepForest and Detectree2) compare with foundation models (SAM and SAM 2) for crown delineation in an open savanna, and whether the foundation models are improved by LiDAR and hyperspectral guidance. On the basis of the domain-shift argument and the evidence that SAM is helped by elevation data, it is hypothesized that guided SAM and SAM 2 will clearly outperform their zero-shot forms and will approach the accuracy of the trained detectors without site-specific training, and that the lowest accuracy will be obtained for small and clustered crowns.</w:t>
-      </w:r>
-    </w:p>
-    <w:p>
-      <w:pPr>
-        <w:spacing w:after="0" w:line="360"/>
-        <w:ind w:firstLine="720"/>
-        <w:jc w:val="both"/>
-      </w:pPr>
-      <w:r>
-        <w:t xml:space="preserve">In the second, it is asked how accurately the delineated crowns can be classified to species and how much is contributed by hyperspectral, LiDAR and RGB data. Because species differences are rooted in spectral properties, the largest contribution is expected from hyperspectral data, and on the basis of fusion theory, further improvement in the separation of evergreen redcedar from deciduous oaks is expected when LiDAR structure is added. The one-dimensional convolutional neural network is expected to perform at least as well as random forest and support vector machines, although its advantage may be limited by the small number of labeled trees.</w:t>
-      </w:r>
-    </w:p>
-    <w:p>
-      <w:pPr>
-        <w:spacing w:after="0" w:line="360"/>
-        <w:ind w:firstLine="720"/>
-        <w:jc w:val="both"/>
-      </w:pPr>
-      <w:r>
-        <w:t xml:space="preserve">A third, optional question is also considered, in which it is asked whether redcedar expansion between NEON flight years can be detected with the best workflow and whether expansion differs between burned and unburned management units. In this question, the framework is applied rather than tested, and the thesis is not dependent on it.</w:t>
-      </w:r>
-    </w:p>
-    <w:p>
-      <w:pPr>
-        <w:spacing w:after="0" w:line="360"/>
-        <w:ind w:firstLine="720"/>
-        <w:jc w:val="both"/>
-      </w:pPr>
-      <w:r>
-        <w:t xml:space="preserve">Only existing, openly available NEON data for CLBJ are used, so no new field campaign is required. To keep the sensors consistent, data from a single flight year, 2024, are used: the 10 cm RGB mosaic, the LiDAR canopy height model and point cloud, and the hyperspectral reflectance product. Ground truth is taken from NEON vegetation structure surveys (NEON, 2026), in which 862 live trees at least 2 m tall were recorded in 47 plots; stem positions have been mapped for 517 of these, and post oak, eastern redcedar and blackjack oak are the main species. Five plots covering both woodland and grassland have already been selected, and the RGB and canopy height tiles covering them have been downloaded.</w:t>
-      </w:r>
-    </w:p>
-    <w:p>
-      <w:pPr>
-        <w:spacing w:after="0" w:line="360"/>
-        <w:ind w:firstLine="720"/>
-        <w:jc w:val="both"/>
-      </w:pPr>
-      <w:r>
-        <w:t xml:space="preserve">For the first research question, DeepForest and Detectree2 will be run with their pretrained weights and again after fine-tuning on local crowns, and SAM and SAM 2 will be run in zero-shot mode and then with LiDAR tree-top prompts, the height filter and the hyperspectral vegetation mask. Performance will be measured as the proportion of the 517 field-mapped trees that are detected and as precision, recall, F1 score and intersection-over-union against 150 to 300 hand-delineated reference crowns, and errors will be examined by crown size and setting. For the second research question, the mean spectrum, vegetation indices and principal components of each crown will be extracted, together with LiDAR height and structure metrics and RGB texture, and random forest, support vector machine and one-dimensional convolutional neural network classifiers will be trained on hyperspectral-only, LiDAR-only, RGB-only and combined inputs. Results will be reported as overall accuracy, per-class F1 score and kappa.</w:t>
-      </w:r>
-    </w:p>
-    <w:p>
-      <w:pPr>
-        <w:spacing w:after="0" w:line="360"/>
-        <w:ind w:firstLine="720"/>
-        <w:jc w:val="both"/>
-      </w:pPr>
-      <w:r>
-        <w:t xml:space="preserve">Accuracy will be assessed with standard measures for remotely sensed maps (Congalton, 1991) and with intersection-over-union for crown outlines, as in the NEON crown benchmark (Weinstein et al., 2021). Because field stems and image crowns are different kinds of measurement, both will be used: whether real trees are found will be tested with the field stems, and how well their outlines match will be tested with the reference crowns. Since nearby trees resemble each other, accuracy would be overstated by random splits, so the classifiers will be trained and tested on spatially separate blocks (Roberts et al., 2017; Ploton et al., 2020). In a sensor ablation, each analysis will be repeated with one data source removed, so that the contribution of each sensor can be measured directly. All processing will be scripted in Python, with R used for selected LiDAR steps, and will be kept under version control, and product versions, model settings and prompts will be recorded so that the results can be reproduced.</w:t>
-      </w:r>
-    </w:p>
-    <w:p>
-      <w:pPr>
-        <w:spacing w:after="0" w:line="360"/>
-        <w:ind w:firstLine="720"/>
-        <w:jc w:val="both"/>
-      </w:pPr>
-      <w:r>
-        <w:t xml:space="preserve">The project is organized as a sequence in which the output of each phase is used in the next. In data preparation, the three sensors and the field records are aligned. In crown delineation, crowns are produced by the four models and evaluated against the reference dataset. The best delineation is then used for species classification and, if time allows, for change analysis. The work is planned over twelve months: data preparation and literature review in months one and two, reference crowns and delineation experiments in months three to five, species classification and sensor comparison in months six to eight, the optional change analysis and synthesis in month nine, and writing, revision and the defense in the final three months. Because the first research question forms the core of the thesis, later phases can be narrowed without it being affected.</w:t>
-      </w:r>
-    </w:p>
-    <w:p>
-      <w:pPr>
-        <w:spacing w:after="0" w:line="360"/>
-        <w:ind w:firstLine="720"/>
-        <w:jc w:val="both"/>
-      </w:pPr>
-      <w:r>
-        <w:t xml:space="preserve">In terms of intellectual merit, direct evidence is expected on how supervised deep learning and foundation models compare for crown delineation in an open savanna, and on whether general-purpose foundation models can be made to work in a landscape on which they were not trained when they are guided by LiDAR and hyperspectral data. The contribution of RGB, LiDAR and hyperspectral data to crown delineation and species identification will also be quantified, so that sensor and model choices in similar studies can be guided. A checked set of reference crowns and species labels for CLBJ will be produced, by which the gap in the NEON benchmark can be filled, and it will be shared for future work.</w:t>
-      </w:r>
-    </w:p>
-    <w:p>
-      <w:pPr>
-        <w:spacing w:after="0" w:line="360"/>
-        <w:ind w:firstLine="720"/>
-        <w:jc w:val="both"/>
-      </w:pPr>
-      <w:r>
-        <w:t xml:space="preserve">In terms of broader impacts, tree-level maps of oaks and redcedar can be used by the US Forest Service to target cedar removal and plan prescribed burns at LBJ. Because the same three types of data are collected by NEON at grassland and savanna sites across the United States, an open and reproducible workflow developed here can be transferred to other sites affected by woody encroachment.</w:t>
-      </w:r>
-    </w:p>
-    <w:p>
-      <w:pPr>
-        <w:spacing w:after="0" w:line="360"/>
-        <w:ind w:firstLine="720"/>
-        <w:jc w:val="both"/>
-      </w:pPr>
-      <w:r>
-        <w:t xml:space="preserve">It is assumed that the same trees are described by field records and imagery from the same period, although this may not hold where trees died or were cleared between survey and flight. Species classification of very small crowns is limited by the 1 m hyperspectral pixels, and because the 2022 to 2025 hyperspectral data are provisional and may be revised, the version used will be recorded. Results obtained at a single site may not be directly transferable to other savannas, and GPU resources are required when SAM and SAM 2 are run over large areas. These limits are recognized in the design, and the core comparison in the first research question does not depend on any of them.</w:t>
+        <w:t xml:space="preserve">). Redcedar expansion has been linked across the southern Great Plains to the suppression of fire (Van Auken, 2000; Briggs et al., 2005) and has been mapped from satellite data in neighboring Oklahoma (Wang et al., 2017), and prescribed fire is applied by the US Forest Service to control woody cover at the site (USDA Forest Service, 2013). The site is also a demanding test for GeoAI models. Isolated crowns, shrubs, bare soil and senescent grass are mixed at a fine scale, and the landscape differs strongly from the closed forests on which crown detectors have been trained. CLBJ was excluded from the NEON crown benchmark because too few trees met its criteria (Weinstein et al., 2021), so no benchmark evidence on model performance exists for it.</w:t>
+      </w:r>
+    </w:p>
+    <w:p>
+      <w:pPr>
+        <w:spacing w:after="0" w:line="360"/>
+        <w:ind w:firstLine="720"/>
+        <w:jc w:val="both"/>
+      </w:pPr>
+      <w:r>
+        <w:t xml:space="preserve">The framework rests on four bodies of theory. The first is object-based image analysis, in which the crown, rather than the pixel, is treated as the unit of analysis, because very high-resolution pixels are much smaller than the objects being mapped (Blaschke, 2010; Ke &amp; Quackenbush, 2011). The second is the physical basis of the three sensors, by which a distinct property of the crown is assigned to each dataset. In NEON RGB mosaics at 10 cm resolution, crown edges and texture are resolved, but no height information is contained, so crowns can be confused with grass or shrubs of similar color, and adjacent crowns can be merged. In LiDAR point clouds and the 1 m canopy height model derived from them, vegetation height is measured directly; tree tops have been located as local maxima of canopy height (Popescu &amp; Wynne, 2004), and individual trees have been segmented from point clouds with open tools such as lidR (Roussel et al., 2020), as reviewed for vegetation applications by Dong and Chen (2018). In NEON hyperspectral imagery, reflectance is recorded from 380 to about 2510 nm in roughly 426 bands at 1 m resolution. Because canopy reflectance is controlled by pigments, water, dry matter and canopy structure (Asner, 1998), and because these properties differ among plant functional types (Ustin &amp; Gamon, 2010), hyperspectral data have been identified as the most informative source for tree species classification (Fassnacht et al., 2016), and individual trees have been classified to species across NEON sites with an average accuracy of 0.77 (Marconi et al., 2022).</w:t>
+      </w:r>
+    </w:p>
+    <w:p>
+      <w:pPr>
+        <w:spacing w:after="0" w:line="360"/>
+        <w:ind w:firstLine="720"/>
+        <w:jc w:val="both"/>
+      </w:pPr>
+      <w:r>
+        <w:t xml:space="preserve">The third body of theory is multisensor fusion. Fusion has been classified into pixel, feature and decision levels (Pohl &amp; van Genderen, 1998), and in forests, feature-level fusion of LiDAR and hyperspectral data has improved both species classification and tree-level mapping (Dalponte et al., 2012; Dalponte &amp; Coomes, 2016), including with NEON data (Scholl et al., 2021). The fourth is the theory of transfer in machine learning. Supervised models are optimized for the distribution of their training data, and their accuracy falls when target data are drawn from a different distribution, a problem described in remote sensing as domain shift (Tuia et al., 2016). Foundation models have been proposed as a response: by pretraining on very large and diverse datasets, a model is obtained that can be adapted to new tasks with little or no labeled data (Bommasani et al., 2021). The Segment Anything Model (SAM) was pretrained on more than one billion masks from eleven million images (Kirillov et al., 2023), and its successor, SAM 2, adds a memory module and has been reported to be both more accurate and about six times faster than SAM on images (Ravi et al., 2024).</w:t>
+      </w:r>
+    </w:p>
+    <w:p>
+      <w:pPr>
+        <w:spacing w:after="0" w:line="360"/>
+        <w:ind w:firstLine="720"/>
+        <w:jc w:val="both"/>
+      </w:pPr>
+      <w:r>
+        <w:t xml:space="preserve">When these strands are brought together, a specific gap is revealed. Supervised crown models are accurate within their training domain but have not been tested outside it in open savanna. DeepForest, a RetinaNet detector (Lin et al., 2017), was pretrained on NEON RGB imagery with labels generated from LiDAR (Weinstein et al., 2019, 2020), and Detectree2, a Mask R-CNN model (He et al., 2017), was developed in tropical forests (Ball et al., 2023). Foundation models are not restricted to one domain, but on remote sensing imagery their output has been found to be uneven and strongly dependent on prompts (Osco et al., 2023), and in drone imagery of forests, SAM used without adaptation did not match a trained Mask R-CNN, although its segmentation was improved when elevation data were supplied (Teng et al., 2025). The weakness of foundation models is therefore not a lack of general visual knowledge but a lack of information on where trees are and what they are made of, which is precisely the information supplied by LiDAR and hyperspectral imagery. In existing fusion work, these sensors have been joined to models as extra input channels or as features after segmentation. Their use as prompts for a foundation model, and the propagation of the resulting crowns into multi-sensor species classification, have not, to current knowledge, been tested with co-registered airborne RGB, LiDAR and hyperspectral data.</w:t>
+      </w:r>
+    </w:p>
+    <w:p>
+      <w:pPr>
+        <w:spacing w:after="0" w:line="360"/>
+        <w:ind w:firstLine="720"/>
+        <w:jc w:val="both"/>
+      </w:pPr>
+      <w:r>
+        <w:t xml:space="preserve">From this gap, the central proposition of the framework is derived: auxiliary sensors are more valuable when they direct a foundation model than when they are added to its input. This proposition is expressed as an additional level of fusion, termed here prompt-level fusion, which is placed between the feature and decision levels of Pohl and van Genderen (1998). At this level, LiDAR is used to tell the model where each tree is, through tree tops converted into point prompts and crown extents converted into box prompts, and to discard objects lower than 2 m. Hyperspectral imagery is used to tell the model what is vegetation, through a mask that excludes bare soil and senescent grass. RGB imagery, in which crown edges are best resolved, is retained as the image that is segmented. Each sensor is thus assigned to the role for which its physics is best suited. The crowns produced in this way are then used at the feature level, where spectral, structural and textural descriptors are extracted for each crown and combined for species classification. Delineation and classification are thereby linked in a single chain: when crown outlines are more accurate, fewer mixed edge pixels are included in each crown, and species should be classified more accurately. This link is treated as a testable part of the framework rather than as an assumption.</w:t>
+      </w:r>
+    </w:p>
+    <w:p>
+      <w:pPr>
+        <w:spacing w:after="0" w:line="360"/>
+        <w:ind w:firstLine="720"/>
+        <w:jc w:val="both"/>
+      </w:pPr>
+      <w:r>
+        <w:t xml:space="preserve">Three groups of variables follow from the proposition. For crown delineation, model family (supervised detection, supervised instance segmentation, promptable foundation model and memory-based foundation model) and guidance level (none, LiDAR prompts, and LiDAR prompts with the hyperspectral mask) are treated as independent variables, and detection rate, F1 score and intersection-over-union are treated as dependent variables. Crown size, crown isolation and setting (woodland or open grassland) are treated as moderators, since the effect of guidance is expected to be greatest where crowns are small or touching. For species classification, sensor combination and classifier are treated as independent variables, the source of the crown outline is treated as a linking variable, and per-class and macro-averaged F1 scores are treated as dependent variables.</w:t>
+      </w:r>
+    </w:p>
+    <w:p>
+      <w:pPr>
+        <w:spacing w:after="0" w:line="360"/>
+        <w:ind w:firstLine="720"/>
+        <w:jc w:val="both"/>
+      </w:pPr>
+      <w:r>
+        <w:t xml:space="preserve">Two research questions are posed. In the first, it is asked how accurately individual tree crowns are delineated in an open savanna by supervised deep learning models and by foundation models, and by how much the foundation models are improved by LiDAR and hyperspectral guidance. Three hypotheses are derived. Under H1a, zero-shot SAM and SAM 2 are expected to produce lower precision than the pretrained supervised models, because grass patches, shrubs and shadows are segmented as objects when no height or spectral constraint is applied. Under H1b, LiDAR-prompted SAM and SAM 2 with the hyperspectral mask are expected to reach F1 scores comparable to those of the fine-tuned supervised models without any site-specific training, because the information missing from the foundation models is supplied through the prompts. Under H1c, the improvement from guidance is expected to be largest for small and touching crowns, where RGB edges alone are least reliable and individual tree tops provide the separation.</w:t>
+      </w:r>
+    </w:p>
+    <w:p>
+      <w:pPr>
+        <w:spacing w:after="0" w:line="360"/>
+        <w:ind w:firstLine="720"/>
+        <w:jc w:val="both"/>
+      </w:pPr>
+      <w:r>
+        <w:t xml:space="preserve">In the second, it is asked how accurately the delineated crowns are classified to species and how much is contributed by each sensor. Under H2a, hyperspectral features are expected to contribute most, because species differences in pigments, water and leaf structure are expressed spectrally (Asner, 1998; Ustin &amp; Gamon, 2010). Under H2b, the addition of LiDAR structure is expected to improve the separation of eastern redcedar, whose dense, conical evergreen crowns differ structurally from the broad crowns of the oaks, beyond what is achieved with spectra alone. Under H2c, crowns from the best guided foundation model are expected to yield higher classification accuracy than bounding boxes from the detector, because fewer background pixels are included. Three classifiers are compared: random forest (Breiman, 2001), support vector machines, which have performed well on high-dimensional hyperspectral data (Melgani &amp; Bruzzone, 2004), and a one-dimensional convolutional neural network, in which features are learned along the spectrum (Hu et al., 2015). In this way, it can be determined whether a deep learning classifier adds value when only a limited number of labeled trees is available.</w:t>
+      </w:r>
+    </w:p>
+    <w:p>
+      <w:pPr>
+        <w:spacing w:after="0" w:line="360"/>
+        <w:ind w:firstLine="720"/>
+        <w:jc w:val="both"/>
+      </w:pPr>
+      <w:r>
+        <w:t xml:space="preserve">The methodology is aligned with these questions through a controlled experimental design built entirely on open NEON data. All sensor products are taken from the 2024 flight, so that every crown is imaged under the same conditions by all three sensors: the 10 cm RGB mosaic (DP3.30010.001), the discrete-return LiDAR point cloud (DP1.30003.001) and canopy height model (DP3.30015.001), and hyperspectral surface reflectance (DP3.30006.002), from which water-vapor bands near 1340–1445 nm and 1790–1955 nm are removed. Because the three sensors are carried on one aircraft (Kampe et al., 2010), co-registration error is minimized, although alignment will be checked against crowns visible in both the RGB mosaic and the canopy height model. Ground truth is taken from NEON vegetation structure records (NEON, 2026), in which 862 live trees at least 2 m tall are recorded in 47 plots, and stem positions are available for 517 of them (353 oaks, 69 eastern redcedar and 95 other broadleaf trees, mainly hackberry, cedar elm and winged elm). Stem coordinates have already been computed from plot reference points, distances and azimuths, and the 2024 RGB and canopy height tiles covering five plots that span woodland and grassland have been downloaded. Because field stems show where trees are but not the shape of their crowns, a second reference set of 150 to 300 crowns will be delineated manually on the RGB mosaic, with the canopy height model used as a guide.</w:t>
+      </w:r>
+    </w:p>
+    <w:p>
+      <w:pPr>
+        <w:spacing w:after="0" w:line="360"/>
+        <w:ind w:firstLine="720"/>
+        <w:jc w:val="both"/>
+      </w:pPr>
+      <w:r>
+        <w:t xml:space="preserve">For the first question, a factorial experiment will be run. DeepForest and Detectree2 will be applied with their published weights and again after fine-tuning on reference crowns from training blocks only. SAM and SAM 2, accessed through samgeo (Wu &amp; Osco, 2023), will be applied in automatic zero-shot mode, with LiDAR point and box prompts, and with prompts plus the height filter and hyperspectral mask. Tree tops will be extracted from the canopy height model by local-maximum filtering with a height-dependent window (Popescu &amp; Wynne, 2004), and crown extents will be taken from LiDAR tree segmentation in lidR (Roussel et al., 2020). Each output will be evaluated in two ways. The detection rate will be calculated as the proportion of field stems that fall inside a predicted crown, and precision, recall, F1 score and intersection-over-union will be calculated against the reference crowns with the matching rules of the NEON crown benchmark (Weinstein et al., 2021). Errors will be stratified by crown size, isolation and setting, so that H1c can be tested directly.</w:t>
+      </w:r>
+    </w:p>
+    <w:p>
+      <w:pPr>
+        <w:spacing w:after="0" w:line="360"/>
+        <w:ind w:firstLine="720"/>
+        <w:jc w:val="both"/>
+      </w:pPr>
+      <w:r>
+        <w:t xml:space="preserve">For the second question, each crown from the best guided foundation model and from the best supervised model will be described by the mean and standard deviation of its reflectance, its principal components and narrow-band vegetation indices, by LiDAR height percentiles and crown area and shape metrics, and by RGB texture. Classifiers will be trained on seven sensor combinations (hyperspectral, LiDAR and RGB alone, in pairs and all together) for four classes: post oak, blackjack oak, eastern redcedar and other broadleaf. Because the classes are unbalanced, the macro-averaged F1 score will be reported together with overall accuracy and per-class F1 scores.</w:t>
+      </w:r>
+    </w:p>
+    <w:p>
+      <w:pPr>
+        <w:spacing w:after="0" w:line="360"/>
+        <w:ind w:firstLine="720"/>
+        <w:jc w:val="both"/>
+      </w:pPr>
+      <w:r>
+        <w:t xml:space="preserve">Rigor is secured in four ways. First, accuracy is measured with confusion-matrix statistics for remotely sensed maps (Congalton, 1991), and kappa is not used, because it has been shown to be misleading for comparing maps (Pontius &amp; Millones, 2011). Second, because nearby trees are spatially autocorrelated and random splits overstate accuracy (Roberts et al., 2017; Ploton et al., 2020), all fine-tuning and classifier training is carried out on spatially separate blocks defined by plot, and the same blocks are used for every model, so that results are directly comparable. Third, differences between models are tested statistically rather than judged by eye: paired comparisons are made with McNemar’s test (Foody, 2004), and bootstrap confidence intervals are calculated for F1 scores. Fourth, a sensor ablation is applied, in which each analysis is repeated with one dataset removed, so that the contribution of each sensor is measured directly rather than inferred. All processing is scripted in Python and R under version control, and data product versions, model weights, prompts and random seeds are recorded so that the full experiment can be reproduced.</w:t>
+      </w:r>
+    </w:p>
+    <w:p>
+      <w:pPr>
+        <w:spacing w:after="0" w:line="360"/>
+        <w:ind w:firstLine="720"/>
+        <w:jc w:val="both"/>
+      </w:pPr>
+      <w:r>
+        <w:t xml:space="preserve">The work is organized as a chain in which the output of each stage becomes the input of the next, and in which the core of the thesis is protected. In months one and two, the three datasets and the field records are aligned and checked. In months three to five, the reference crowns are delineated and the delineation experiment is completed, so that the first question is answered independently of the rest. In months six to eight, the species classification and sensor ablation are completed. In month nine, the results are synthesized, and in months ten to twelve, the thesis is written, revised and defended. If time is lost, the classification can be narrowed to the contrast between redcedar and oaks without weakening the first question.</w:t>
+      </w:r>
+    </w:p>
+    <w:p>
+      <w:pPr>
+        <w:spacing w:after="0" w:line="360"/>
+        <w:ind w:firstLine="720"/>
+        <w:jc w:val="both"/>
+      </w:pPr>
+      <w:r>
+        <w:t xml:space="preserve">The intellectual merit of the research lies in three contributions. Conceptually, prompt-level fusion is introduced and tested as a way of joining airborne sensors to foundation models, in which structure and spectra are used to direct segmentation rather than as additional input bands. Empirically, the first controlled comparison of supervised crown models and guided foundation models in an open savanna is provided, together with a measurement of how much RGB, LiDAR and hyperspectral data each contribute to delineation and to species classification, and of whether better crowns produce better species maps. Methodologically, a checked set of reference crowns and species labels is produced for CLBJ, a site absent from the NEON crown benchmark, and is released with the code for reuse.</w:t>
+      </w:r>
+    </w:p>
+    <w:p>
+      <w:pPr>
+        <w:spacing w:after="0" w:line="360"/>
+        <w:ind w:firstLine="720"/>
+        <w:jc w:val="both"/>
+      </w:pPr>
+      <w:r>
+        <w:t xml:space="preserve">The broader impacts follow from the openness of the data and the transferability of the design. Tree-level maps of oaks and redcedar can be used by the US Forest Service to target cedar removal and to plan prescribed burns at LBJ. Because the same three datasets are collected by NEON at grassland and savanna sites across the United States, and because the foundation models are guided rather than retrained, the workflow can be transferred to other sites affected by woody plant encroachment without new labeled data, wherever airborne LiDAR and imagery are available.</w:t>
+      </w:r>
+    </w:p>
+    <w:p>
+      <w:pPr>
+        <w:spacing w:after="0" w:line="360"/>
+        <w:ind w:firstLine="720"/>
+        <w:jc w:val="both"/>
+      </w:pPr>
+      <w:r>
+        <w:t xml:space="preserve">The framework rests on stated assumptions. Field records and 2024 imagery are assumed to describe the same trees, which may not hold where trees were burned or cleared between survey and flight; such stems will be identified on the imagery and excluded. The 1 m hyperspectral pixels limit the classification of very small crowns, the 2022–2025 hyperspectral product is provisional and may be revised, and results from one site may not transfer directly to every savanna. These limits are recognized in the design, and none of them affects the central test of whether LiDAR- and hyperspectral-guided foundation models can map tree crowns in a landscape on which supervised models were never trained.</w:t>
       </w:r>
     </w:p>
     <w:p>
@@ -358,7 +338,7 @@
         <w:jc w:val="left"/>
       </w:pPr>
       <w:r>
-        <w:t xml:space="preserve">Cortes, C., &amp; Vapnik, V. (1995). Support-vector networks. Machine Learning, 20(3), 273–297.</w:t>
+        <w:t xml:space="preserve">Dalponte, M., Bruzzone, L., &amp; Gianelle, D. (2012). Tree species classification in the Southern Alps based on the fusion of very high geometrical resolution multispectral/hyperspectral images and LiDAR data. Remote Sensing of Environment, 123, 258–270.</w:t>
       </w:r>
     </w:p>
     <w:p>
@@ -388,16 +368,6 @@
         <w:jc w:val="left"/>
       </w:pPr>
       <w:r>
-        <w:t xml:space="preserve">Dosovitskiy, A., et al. (2021). An image is worth 16x16 words: Transformers for image recognition at scale. International Conference on Learning Representations (ICLR).</w:t>
-      </w:r>
-    </w:p>
-    <w:p>
-      <w:pPr>
-        <w:spacing w:after="120" w:line="276"/>
-        <w:ind w:left="720" w:hanging="720"/>
-        <w:jc w:val="left"/>
-      </w:pPr>
-      <w:r>
         <w:t xml:space="preserve">Fassnacht, F. E., et al. (2016). Review of studies on tree species classification from remotely sensed data. Remote Sensing of Environment, 186, 64–87.</w:t>
       </w:r>
     </w:p>
@@ -408,6 +378,16 @@
         <w:jc w:val="left"/>
       </w:pPr>
       <w:r>
+        <w:t xml:space="preserve">Foody, G. M. (2004). Thematic map comparison: Evaluating the statistical significance of differences in classification accuracy. Photogrammetric Engineering &amp; Remote Sensing, 70(5), 627–633.</w:t>
+      </w:r>
+    </w:p>
+    <w:p>
+      <w:pPr>
+        <w:spacing w:after="120" w:line="276"/>
+        <w:ind w:left="720" w:hanging="720"/>
+        <w:jc w:val="left"/>
+      </w:pPr>
+      <w:r>
         <w:t xml:space="preserve">He, K., Gkioxari, G., Dollár, P., &amp; Girshick, R. (2017). Mask R-CNN. Proceedings of the IEEE International Conference on Computer Vision (ICCV), 2961–2969.</w:t>
       </w:r>
     </w:p>
@@ -448,27 +428,7 @@
         <w:jc w:val="left"/>
       </w:pPr>
       <w:r>
-        <w:t xml:space="preserve">Kirillov, A., et al. (2023). Segment anything. Proceedings of the IEEE/CVF International Conference on Computer Vision (ICCV), 4015–4026.</w:t>
-      </w:r>
-    </w:p>
-    <w:p>
-      <w:pPr>
-        <w:spacing w:after="120" w:line="276"/>
-        <w:ind w:left="720" w:hanging="720"/>
-        <w:jc w:val="left"/>
-      </w:pPr>
-      <w:r>
-        <w:t xml:space="preserve">LeCun, Y., Bengio, Y., &amp; Hinton, G. (2015). Deep learning. Nature, 521(7553), 436–444.</w:t>
-      </w:r>
-    </w:p>
-    <w:p>
-      <w:pPr>
-        <w:spacing w:after="120" w:line="276"/>
-        <w:ind w:left="720" w:hanging="720"/>
-        <w:jc w:val="left"/>
-      </w:pPr>
-      <w:r>
-        <w:t xml:space="preserve">Li, W., Guo, Q., Jakubowski, M. K., &amp; Kelly, M. (2012). A new method for segmenting individual trees from the lidar point cloud. Photogrammetric Engineering &amp; Remote Sensing, 78(1), 75–84.</w:t>
+        <w:t xml:space="preserve">Kirillov, A., Mintun, E., Ravi, N., Mao, H., Rolland, C., Gustafson, L., Xiao, T., Whitehead, S., Berg, A. C., Lo, W.-Y., Dollár, P., &amp; Girshick, R. (2023). Segment anything. Proceedings of the IEEE/CVF International Conference on Computer Vision (ICCV), 4015–4026.</w:t>
       </w:r>
     </w:p>
     <w:p>
@@ -548,6 +508,16 @@
         <w:jc w:val="left"/>
       </w:pPr>
       <w:r>
+        <w:t xml:space="preserve">Pontius, R. G., Jr., &amp; Millones, M. (2011). Death to Kappa: Birth of quantity disagreement and allocation disagreement for accuracy assessment. International Journal of Remote Sensing, 32(15), 4407–4429.</w:t>
+      </w:r>
+    </w:p>
+    <w:p>
+      <w:pPr>
+        <w:spacing w:after="120" w:line="276"/>
+        <w:ind w:left="720" w:hanging="720"/>
+        <w:jc w:val="left"/>
+      </w:pPr>
+      <w:r>
         <w:t xml:space="preserve">Popescu, S. C., &amp; Wynne, R. H. (2004). Seeing the trees in the forest: Using lidar and multispectral data fusion with local filtering and variable window size for estimating tree height. Photogrammetric Engineering &amp; Remote Sensing, 70(5), 589–604.</w:t>
       </w:r>
     </w:p>
@@ -578,7 +548,7 @@
         <w:jc w:val="left"/>
       </w:pPr>
       <w:r>
-        <w:t xml:space="preserve">Roussel, J.-R., et al. (2020). lidR: An R package for analysis of Airborne Laser Scanning (ALS) data. Remote Sensing of Environment, 251, 112061.</w:t>
+        <w:t xml:space="preserve">Roussel, J.-R., Auty, D., Coops, N. C., Tompalski, P., Goodbody, T. R. H., Sánchez Meador, A., Bourdon, J.-F., de Boissieu, F., &amp; Achim, A. (2020). lidR: An R package for analysis of Airborne Laser Scanning (ALS) data. Remote Sensing of Environment, 251, 112061.</w:t>
       </w:r>
     </w:p>
     <w:p>
@@ -608,7 +578,7 @@
         <w:jc w:val="left"/>
       </w:pPr>
       <w:r>
-        <w:t xml:space="preserve">Twidwell, D., Rogers, W. E., Fuhlendorf, S. D., Wonkka, C. L., Engle, D. M., Weir, J. R., Kreuter, U. P., &amp; Taylor, C. A. (2013). The rising Great Plains fire campaign: Citizens’ response to woody plant encroachment. Frontiers in Ecology and the Environment, 11(s1), e64–e71.</w:t>
+        <w:t xml:space="preserve">Tuia, D., Persello, C., &amp; Bruzzone, L. (2016). Domain adaptation for the classification of remote sensing data: An overview of recent advances. IEEE Geoscience and Remote Sensing Magazine, 4(2), 41–57.</w:t>
       </w:r>
     </w:p>
     <w:p>
@@ -689,26 +659,6 @@
       </w:pPr>
       <w:r>
         <w:t xml:space="preserve">Wu, Q., &amp; Osco, L. P. (2023). samgeo: A Python package for segmenting geospatial data with the Segment Anything Model (SAM). Journal of Open Source Software, 8(89), 5663.</w:t>
-      </w:r>
-    </w:p>
-    <w:p>
-      <w:pPr>
-        <w:spacing w:after="120" w:line="276"/>
-        <w:ind w:left="720" w:hanging="720"/>
-        <w:jc w:val="left"/>
-      </w:pPr>
-      <w:r>
-        <w:t xml:space="preserve">Zhen, Z., Quackenbush, L. J., &amp; Zhang, L. (2016). Trends in automatic individual tree crown detection and delineation—Evolution of LiDAR data. Remote Sensing, 8(4), 333.</w:t>
-      </w:r>
-    </w:p>
-    <w:p>
-      <w:pPr>
-        <w:spacing w:after="120" w:line="276"/>
-        <w:ind w:left="720" w:hanging="720"/>
-        <w:jc w:val="left"/>
-      </w:pPr>
-      <w:r>
-        <w:t xml:space="preserve">Zhu, X. X., Tuia, D., Mou, L., Xia, G.-S., Zhang, L., Xu, F., &amp; Fraundorfer, F. (2017). Deep learning in remote sensing: A comprehensive review and list of resources. IEEE Geoscience and Remote Sensing Magazine, 5(4), 8–36.</w:t>
       </w:r>
     </w:p>
     <w:sectPr>

</xml_diff>

<commit_message>
Framework: single-section university version, honest novelty framing, 40 references
Co-Authored-By: Claude Opus 5.5 <noreply@anthropic.com>
Claude-Session: https://claude.ai/code/session_0132bxCMLAKTHUnyQV3MmGfs
</commit_message>
<xml_diff>
--- a/thesis/Proposed_Research_Framework_Poudel.docx
+++ b/thesis/Proposed_Research_Framework_Poudel.docx
@@ -2,21 +2,6 @@
 <file path=word/document.xml><?xml version="1.0" encoding="utf-8"?>
 <w:document xmlns:wpc="http://schemas.microsoft.com/office/word/2010/wordprocessingCanvas" xmlns:mc="http://schemas.openxmlformats.org/markup-compatibility/2006" xmlns:o="urn:schemas-microsoft-com:office:office" xmlns:r="http://schemas.openxmlformats.org/officeDocument/2006/relationships" xmlns:m="http://schemas.openxmlformats.org/officeDocument/2006/math" xmlns:v="urn:schemas-microsoft-com:vml" xmlns:wp14="http://schemas.microsoft.com/office/word/2010/wordprocessingDrawing" xmlns:wp="http://schemas.openxmlformats.org/drawingml/2006/wordprocessingDrawing" xmlns:w10="urn:schemas-microsoft-com:office:word" xmlns:w="http://schemas.openxmlformats.org/wordprocessingml/2006/main" xmlns:w14="http://schemas.microsoft.com/office/word/2010/wordml" xmlns:w15="http://schemas.microsoft.com/office/word/2012/wordml" xmlns:wpg="http://schemas.microsoft.com/office/word/2010/wordprocessingGroup" xmlns:wpi="http://schemas.microsoft.com/office/word/2010/wordprocessingInk" xmlns:wne="http://schemas.microsoft.com/office/word/2006/wordml" xmlns:wps="http://schemas.microsoft.com/office/word/2010/wordprocessingShape" xmlns:cx="http://schemas.microsoft.com/office/drawing/2014/chartex" xmlns:cx1="http://schemas.microsoft.com/office/drawing/2015/9/8/chartex" xmlns:cx2="http://schemas.microsoft.com/office/drawing/2015/10/21/chartex" xmlns:cx3="http://schemas.microsoft.com/office/drawing/2016/5/9/chartex" xmlns:cx4="http://schemas.microsoft.com/office/drawing/2016/5/10/chartex" xmlns:cx5="http://schemas.microsoft.com/office/drawing/2016/5/11/chartex" xmlns:cx6="http://schemas.microsoft.com/office/drawing/2016/5/12/chartex" xmlns:cx7="http://schemas.microsoft.com/office/drawing/2016/5/13/chartex" xmlns:cx8="http://schemas.microsoft.com/office/drawing/2016/5/14/chartex" xmlns:aink="http://schemas.microsoft.com/office/drawing/2016/ink" xmlns:am3d="http://schemas.microsoft.com/office/drawing/2017/model3d" xmlns:w16cex="http://schemas.microsoft.com/office/word/2018/wordml/cex" xmlns:w16cid="http://schemas.microsoft.com/office/word/2016/wordml/cid" xmlns:w16="http://schemas.microsoft.com/office/word/2018/wordml" xmlns:w16sdtdh="http://schemas.microsoft.com/office/word/2020/wordml/sdtdatahash" xmlns:w16se="http://schemas.microsoft.com/office/word/2015/wordml/symex" mc:Ignorable="w14 w15 wp14">
   <w:body>
-    <w:p>
-      <w:pPr>
-        <w:spacing w:after="120" w:line="360"/>
-        <w:jc w:val="center"/>
-      </w:pPr>
-      <w:r>
-        <w:rPr>
-          <w:b/>
-          <w:bCs/>
-          <w:sz w:val="28"/>
-          <w:szCs w:val="28"/>
-        </w:rPr>
-        <w:t xml:space="preserve">Research Framework</w:t>
-      </w:r>
-    </w:p>
     <w:p>
       <w:pPr>
         <w:spacing w:after="120" w:line="360"/>
@@ -34,7 +19,7 @@
     </w:p>
     <w:p>
       <w:pPr>
-        <w:spacing w:after="320" w:line="360"/>
+        <w:spacing w:after="200" w:line="360"/>
         <w:jc w:val="center"/>
       </w:pPr>
       <w:r>
@@ -47,209 +32,7 @@
     </w:p>
     <w:p>
       <w:pPr>
-        <w:spacing w:after="0" w:line="360"/>
-        <w:ind w:firstLine="720"/>
-        <w:jc w:val="both"/>
-      </w:pPr>
-      <w:r>
-        <w:t xml:space="preserve">Individual trees are the units in which woody plant encroachment, carbon storage and habitat change are expressed, yet they are rarely the units in which landscapes are mapped. This gap has been narrowed by two recent developments in geospatial artificial intelligence (GeoAI). Deep learning detectors have been trained to locate individual tree crowns in very high-resolution imagery (Weinstein et al., 2019; Ball et al., 2023), and vision foundation models have been released that segment almost any object in an image when only a point or a box is supplied (Kirillov et al., 2023; Ravi et al., 2024). Both developments, however, have been built almost entirely on RGB imagery, whereas the airborne platforms now flown routinely over ecological sites record each crown in three complementary ways: its color and outline in RGB imagery, its three-dimensional structure in LiDAR, and its biochemical composition in hyperspectral imagery (Kampe et al., 2010). How these three spatial datasets should be joined to GeoAI models, and whether general-purpose foundation models can be turned into reliable crown mappers when they are guided by structural and spectral data, has not been established. This question is addressed in the proposed research.</w:t>
-      </w:r>
-    </w:p>
-    <w:p>
-      <w:pPr>
-        <w:spacing w:after="0" w:line="360"/>
-        <w:ind w:firstLine="720"/>
-        <w:jc w:val="both"/>
-      </w:pPr>
-      <w:r>
-        <w:t xml:space="preserve">The question is examined at LBJ National Grassland (NEON site CLBJ), Texas, an open Cross Timbers savanna in which post oak (</w:t>
-      </w:r>
-      <w:r>
-        <w:rPr>
-          <w:i/>
-          <w:iCs/>
-        </w:rPr>
-        <w:t xml:space="preserve">Quercus stellata</w:t>
-      </w:r>
-      <w:r>
-        <w:t xml:space="preserve">) and blackjack oak (</w:t>
-      </w:r>
-      <w:r>
-        <w:rPr>
-          <w:i/>
-          <w:iCs/>
-        </w:rPr>
-        <w:t xml:space="preserve">Quercus marilandica</w:t>
-      </w:r>
-      <w:r>
-        <w:t xml:space="preserve">) woodland is interspersed with grassland that is being invaded by eastern redcedar (</w:t>
-      </w:r>
-      <w:r>
-        <w:rPr>
-          <w:i/>
-          <w:iCs/>
-        </w:rPr>
-        <w:t xml:space="preserve">Juniperus virginiana</w:t>
-      </w:r>
-      <w:r>
-        <w:t xml:space="preserve">). Redcedar expansion has been linked across the southern Great Plains to the suppression of fire (Van Auken, 2000; Briggs et al., 2005) and has been mapped from satellite data in neighboring Oklahoma (Wang et al., 2017), and prescribed fire is applied by the US Forest Service to control woody cover at the site (USDA Forest Service, 2013). The site is also a demanding test for GeoAI models. Isolated crowns, shrubs, bare soil and senescent grass are mixed at a fine scale, and the landscape differs strongly from the closed forests on which crown detectors have been trained. CLBJ was excluded from the NEON crown benchmark because too few trees met its criteria (Weinstein et al., 2021), so no benchmark evidence on model performance exists for it.</w:t>
-      </w:r>
-    </w:p>
-    <w:p>
-      <w:pPr>
-        <w:spacing w:after="0" w:line="360"/>
-        <w:ind w:firstLine="720"/>
-        <w:jc w:val="both"/>
-      </w:pPr>
-      <w:r>
-        <w:t xml:space="preserve">The framework rests on four bodies of theory. The first is object-based image analysis, in which the crown, rather than the pixel, is treated as the unit of analysis, because very high-resolution pixels are much smaller than the objects being mapped (Blaschke, 2010; Ke &amp; Quackenbush, 2011). The second is the physical basis of the three sensors, by which a distinct property of the crown is assigned to each dataset. In NEON RGB mosaics at 10 cm resolution, crown edges and texture are resolved, but no height information is contained, so crowns can be confused with grass or shrubs of similar color, and adjacent crowns can be merged. In LiDAR point clouds and the 1 m canopy height model derived from them, vegetation height is measured directly; tree tops have been located as local maxima of canopy height (Popescu &amp; Wynne, 2004), and individual trees have been segmented from point clouds with open tools such as lidR (Roussel et al., 2020), as reviewed for vegetation applications by Dong and Chen (2018). In NEON hyperspectral imagery, reflectance is recorded from 380 to about 2510 nm in roughly 426 bands at 1 m resolution. Because canopy reflectance is controlled by pigments, water, dry matter and canopy structure (Asner, 1998), and because these properties differ among plant functional types (Ustin &amp; Gamon, 2010), hyperspectral data have been identified as the most informative source for tree species classification (Fassnacht et al., 2016), and individual trees have been classified to species across NEON sites with an average accuracy of 0.77 (Marconi et al., 2022).</w:t>
-      </w:r>
-    </w:p>
-    <w:p>
-      <w:pPr>
-        <w:spacing w:after="0" w:line="360"/>
-        <w:ind w:firstLine="720"/>
-        <w:jc w:val="both"/>
-      </w:pPr>
-      <w:r>
-        <w:t xml:space="preserve">The third body of theory is multisensor fusion. Fusion has been classified into pixel, feature and decision levels (Pohl &amp; van Genderen, 1998), and in forests, feature-level fusion of LiDAR and hyperspectral data has improved both species classification and tree-level mapping (Dalponte et al., 2012; Dalponte &amp; Coomes, 2016), including with NEON data (Scholl et al., 2021). The fourth is the theory of transfer in machine learning. Supervised models are optimized for the distribution of their training data, and their accuracy falls when target data are drawn from a different distribution, a problem described in remote sensing as domain shift (Tuia et al., 2016). Foundation models have been proposed as a response: by pretraining on very large and diverse datasets, a model is obtained that can be adapted to new tasks with little or no labeled data (Bommasani et al., 2021). The Segment Anything Model (SAM) was pretrained on more than one billion masks from eleven million images (Kirillov et al., 2023), and its successor, SAM 2, adds a memory module and has been reported to be both more accurate and about six times faster than SAM on images (Ravi et al., 2024).</w:t>
-      </w:r>
-    </w:p>
-    <w:p>
-      <w:pPr>
-        <w:spacing w:after="0" w:line="360"/>
-        <w:ind w:firstLine="720"/>
-        <w:jc w:val="both"/>
-      </w:pPr>
-      <w:r>
-        <w:t xml:space="preserve">When these strands are brought together, a specific gap is revealed. Supervised crown models are accurate within their training domain but have not been tested outside it in open savanna. DeepForest, a RetinaNet detector (Lin et al., 2017), was pretrained on NEON RGB imagery with labels generated from LiDAR (Weinstein et al., 2019, 2020), and Detectree2, a Mask R-CNN model (He et al., 2017), was developed in tropical forests (Ball et al., 2023). Foundation models are not restricted to one domain, but on remote sensing imagery their output has been found to be uneven and strongly dependent on prompts (Osco et al., 2023), and in drone imagery of forests, SAM used without adaptation did not match a trained Mask R-CNN, although its segmentation was improved when elevation data were supplied (Teng et al., 2025). The weakness of foundation models is therefore not a lack of general visual knowledge but a lack of information on where trees are and what they are made of, which is precisely the information supplied by LiDAR and hyperspectral imagery. In existing fusion work, these sensors have been joined to models as extra input channels or as features after segmentation. Their use as prompts for a foundation model, and the propagation of the resulting crowns into multi-sensor species classification, have not, to current knowledge, been tested with co-registered airborne RGB, LiDAR and hyperspectral data.</w:t>
-      </w:r>
-    </w:p>
-    <w:p>
-      <w:pPr>
-        <w:spacing w:after="0" w:line="360"/>
-        <w:ind w:firstLine="720"/>
-        <w:jc w:val="both"/>
-      </w:pPr>
-      <w:r>
-        <w:t xml:space="preserve">From this gap, the central proposition of the framework is derived: auxiliary sensors are more valuable when they direct a foundation model than when they are added to its input. This proposition is expressed as an additional level of fusion, termed here prompt-level fusion, which is placed between the feature and decision levels of Pohl and van Genderen (1998). At this level, LiDAR is used to tell the model where each tree is, through tree tops converted into point prompts and crown extents converted into box prompts, and to discard objects lower than 2 m. Hyperspectral imagery is used to tell the model what is vegetation, through a mask that excludes bare soil and senescent grass. RGB imagery, in which crown edges are best resolved, is retained as the image that is segmented. Each sensor is thus assigned to the role for which its physics is best suited. The crowns produced in this way are then used at the feature level, where spectral, structural and textural descriptors are extracted for each crown and combined for species classification. Delineation and classification are thereby linked in a single chain: when crown outlines are more accurate, fewer mixed edge pixels are included in each crown, and species should be classified more accurately. This link is treated as a testable part of the framework rather than as an assumption.</w:t>
-      </w:r>
-    </w:p>
-    <w:p>
-      <w:pPr>
-        <w:spacing w:after="0" w:line="360"/>
-        <w:ind w:firstLine="720"/>
-        <w:jc w:val="both"/>
-      </w:pPr>
-      <w:r>
-        <w:t xml:space="preserve">Three groups of variables follow from the proposition. For crown delineation, model family (supervised detection, supervised instance segmentation, promptable foundation model and memory-based foundation model) and guidance level (none, LiDAR prompts, and LiDAR prompts with the hyperspectral mask) are treated as independent variables, and detection rate, F1 score and intersection-over-union are treated as dependent variables. Crown size, crown isolation and setting (woodland or open grassland) are treated as moderators, since the effect of guidance is expected to be greatest where crowns are small or touching. For species classification, sensor combination and classifier are treated as independent variables, the source of the crown outline is treated as a linking variable, and per-class and macro-averaged F1 scores are treated as dependent variables.</w:t>
-      </w:r>
-    </w:p>
-    <w:p>
-      <w:pPr>
-        <w:spacing w:after="0" w:line="360"/>
-        <w:ind w:firstLine="720"/>
-        <w:jc w:val="both"/>
-      </w:pPr>
-      <w:r>
-        <w:t xml:space="preserve">Two research questions are posed. In the first, it is asked how accurately individual tree crowns are delineated in an open savanna by supervised deep learning models and by foundation models, and by how much the foundation models are improved by LiDAR and hyperspectral guidance. Three hypotheses are derived. Under H1a, zero-shot SAM and SAM 2 are expected to produce lower precision than the pretrained supervised models, because grass patches, shrubs and shadows are segmented as objects when no height or spectral constraint is applied. Under H1b, LiDAR-prompted SAM and SAM 2 with the hyperspectral mask are expected to reach F1 scores comparable to those of the fine-tuned supervised models without any site-specific training, because the information missing from the foundation models is supplied through the prompts. Under H1c, the improvement from guidance is expected to be largest for small and touching crowns, where RGB edges alone are least reliable and individual tree tops provide the separation.</w:t>
-      </w:r>
-    </w:p>
-    <w:p>
-      <w:pPr>
-        <w:spacing w:after="0" w:line="360"/>
-        <w:ind w:firstLine="720"/>
-        <w:jc w:val="both"/>
-      </w:pPr>
-      <w:r>
-        <w:t xml:space="preserve">In the second, it is asked how accurately the delineated crowns are classified to species and how much is contributed by each sensor. Under H2a, hyperspectral features are expected to contribute most, because species differences in pigments, water and leaf structure are expressed spectrally (Asner, 1998; Ustin &amp; Gamon, 2010). Under H2b, the addition of LiDAR structure is expected to improve the separation of eastern redcedar, whose dense, conical evergreen crowns differ structurally from the broad crowns of the oaks, beyond what is achieved with spectra alone. Under H2c, crowns from the best guided foundation model are expected to yield higher classification accuracy than bounding boxes from the detector, because fewer background pixels are included. Three classifiers are compared: random forest (Breiman, 2001), support vector machines, which have performed well on high-dimensional hyperspectral data (Melgani &amp; Bruzzone, 2004), and a one-dimensional convolutional neural network, in which features are learned along the spectrum (Hu et al., 2015). In this way, it can be determined whether a deep learning classifier adds value when only a limited number of labeled trees is available.</w:t>
-      </w:r>
-    </w:p>
-    <w:p>
-      <w:pPr>
-        <w:spacing w:after="0" w:line="360"/>
-        <w:ind w:firstLine="720"/>
-        <w:jc w:val="both"/>
-      </w:pPr>
-      <w:r>
-        <w:t xml:space="preserve">The methodology is aligned with these questions through a controlled experimental design built entirely on open NEON data. All sensor products are taken from the 2024 flight, so that every crown is imaged under the same conditions by all three sensors: the 10 cm RGB mosaic (DP3.30010.001), the discrete-return LiDAR point cloud (DP1.30003.001) and canopy height model (DP3.30015.001), and hyperspectral surface reflectance (DP3.30006.002), from which water-vapor bands near 1340–1445 nm and 1790–1955 nm are removed. Because the three sensors are carried on one aircraft (Kampe et al., 2010), co-registration error is minimized, although alignment will be checked against crowns visible in both the RGB mosaic and the canopy height model. Ground truth is taken from NEON vegetation structure records (NEON, 2026), in which 862 live trees at least 2 m tall are recorded in 47 plots, and stem positions are available for 517 of them (353 oaks, 69 eastern redcedar and 95 other broadleaf trees, mainly hackberry, cedar elm and winged elm). Stem coordinates have already been computed from plot reference points, distances and azimuths, and the 2024 RGB and canopy height tiles covering five plots that span woodland and grassland have been downloaded. Because field stems show where trees are but not the shape of their crowns, a second reference set of 150 to 300 crowns will be delineated manually on the RGB mosaic, with the canopy height model used as a guide.</w:t>
-      </w:r>
-    </w:p>
-    <w:p>
-      <w:pPr>
-        <w:spacing w:after="0" w:line="360"/>
-        <w:ind w:firstLine="720"/>
-        <w:jc w:val="both"/>
-      </w:pPr>
-      <w:r>
-        <w:t xml:space="preserve">For the first question, a factorial experiment will be run. DeepForest and Detectree2 will be applied with their published weights and again after fine-tuning on reference crowns from training blocks only. SAM and SAM 2, accessed through samgeo (Wu &amp; Osco, 2023), will be applied in automatic zero-shot mode, with LiDAR point and box prompts, and with prompts plus the height filter and hyperspectral mask. Tree tops will be extracted from the canopy height model by local-maximum filtering with a height-dependent window (Popescu &amp; Wynne, 2004), and crown extents will be taken from LiDAR tree segmentation in lidR (Roussel et al., 2020). Each output will be evaluated in two ways. The detection rate will be calculated as the proportion of field stems that fall inside a predicted crown, and precision, recall, F1 score and intersection-over-union will be calculated against the reference crowns with the matching rules of the NEON crown benchmark (Weinstein et al., 2021). Errors will be stratified by crown size, isolation and setting, so that H1c can be tested directly.</w:t>
-      </w:r>
-    </w:p>
-    <w:p>
-      <w:pPr>
-        <w:spacing w:after="0" w:line="360"/>
-        <w:ind w:firstLine="720"/>
-        <w:jc w:val="both"/>
-      </w:pPr>
-      <w:r>
-        <w:t xml:space="preserve">For the second question, each crown from the best guided foundation model and from the best supervised model will be described by the mean and standard deviation of its reflectance, its principal components and narrow-band vegetation indices, by LiDAR height percentiles and crown area and shape metrics, and by RGB texture. Classifiers will be trained on seven sensor combinations (hyperspectral, LiDAR and RGB alone, in pairs and all together) for four classes: post oak, blackjack oak, eastern redcedar and other broadleaf. Because the classes are unbalanced, the macro-averaged F1 score will be reported together with overall accuracy and per-class F1 scores.</w:t>
-      </w:r>
-    </w:p>
-    <w:p>
-      <w:pPr>
-        <w:spacing w:after="0" w:line="360"/>
-        <w:ind w:firstLine="720"/>
-        <w:jc w:val="both"/>
-      </w:pPr>
-      <w:r>
-        <w:t xml:space="preserve">Rigor is secured in four ways. First, accuracy is measured with confusion-matrix statistics for remotely sensed maps (Congalton, 1991), and kappa is not used, because it has been shown to be misleading for comparing maps (Pontius &amp; Millones, 2011). Second, because nearby trees are spatially autocorrelated and random splits overstate accuracy (Roberts et al., 2017; Ploton et al., 2020), all fine-tuning and classifier training is carried out on spatially separate blocks defined by plot, and the same blocks are used for every model, so that results are directly comparable. Third, differences between models are tested statistically rather than judged by eye: paired comparisons are made with McNemar’s test (Foody, 2004), and bootstrap confidence intervals are calculated for F1 scores. Fourth, a sensor ablation is applied, in which each analysis is repeated with one dataset removed, so that the contribution of each sensor is measured directly rather than inferred. All processing is scripted in Python and R under version control, and data product versions, model weights, prompts and random seeds are recorded so that the full experiment can be reproduced.</w:t>
-      </w:r>
-    </w:p>
-    <w:p>
-      <w:pPr>
-        <w:spacing w:after="0" w:line="360"/>
-        <w:ind w:firstLine="720"/>
-        <w:jc w:val="both"/>
-      </w:pPr>
-      <w:r>
-        <w:t xml:space="preserve">The work is organized as a chain in which the output of each stage becomes the input of the next, and in which the core of the thesis is protected. In months one and two, the three datasets and the field records are aligned and checked. In months three to five, the reference crowns are delineated and the delineation experiment is completed, so that the first question is answered independently of the rest. In months six to eight, the species classification and sensor ablation are completed. In month nine, the results are synthesized, and in months ten to twelve, the thesis is written, revised and defended. If time is lost, the classification can be narrowed to the contrast between redcedar and oaks without weakening the first question.</w:t>
-      </w:r>
-    </w:p>
-    <w:p>
-      <w:pPr>
-        <w:spacing w:after="0" w:line="360"/>
-        <w:ind w:firstLine="720"/>
-        <w:jc w:val="both"/>
-      </w:pPr>
-      <w:r>
-        <w:t xml:space="preserve">The intellectual merit of the research lies in three contributions. Conceptually, prompt-level fusion is introduced and tested as a way of joining airborne sensors to foundation models, in which structure and spectra are used to direct segmentation rather than as additional input bands. Empirically, the first controlled comparison of supervised crown models and guided foundation models in an open savanna is provided, together with a measurement of how much RGB, LiDAR and hyperspectral data each contribute to delineation and to species classification, and of whether better crowns produce better species maps. Methodologically, a checked set of reference crowns and species labels is produced for CLBJ, a site absent from the NEON crown benchmark, and is released with the code for reuse.</w:t>
-      </w:r>
-    </w:p>
-    <w:p>
-      <w:pPr>
-        <w:spacing w:after="0" w:line="360"/>
-        <w:ind w:firstLine="720"/>
-        <w:jc w:val="both"/>
-      </w:pPr>
-      <w:r>
-        <w:t xml:space="preserve">The broader impacts follow from the openness of the data and the transferability of the design. Tree-level maps of oaks and redcedar can be used by the US Forest Service to target cedar removal and to plan prescribed burns at LBJ. Because the same three datasets are collected by NEON at grassland and savanna sites across the United States, and because the foundation models are guided rather than retrained, the workflow can be transferred to other sites affected by woody plant encroachment without new labeled data, wherever airborne LiDAR and imagery are available.</w:t>
-      </w:r>
-    </w:p>
-    <w:p>
-      <w:pPr>
-        <w:spacing w:after="0" w:line="360"/>
-        <w:ind w:firstLine="720"/>
-        <w:jc w:val="both"/>
-      </w:pPr>
-      <w:r>
-        <w:t xml:space="preserve">The framework rests on stated assumptions. Field records and 2024 imagery are assumed to describe the same trees, which may not hold where trees were burned or cleared between survey and flight; such stems will be identified on the imagery and excluded. The 1 m hyperspectral pixels limit the classification of very small crowns, the 2022–2025 hyperspectral product is provisional and may be revised, and results from one site may not transfer directly to every savanna. These limits are recognized in the design, and none of them affects the central test of whether LiDAR- and hyperspectral-guided foundation models can map tree crowns in a landscape on which supervised models were never trained.</w:t>
-      </w:r>
-    </w:p>
-    <w:p>
-      <w:pPr>
-        <w:pageBreakBefore/>
-        <w:spacing w:after="240"/>
-        <w:jc w:val="center"/>
+        <w:spacing w:after="160" w:before="120" w:line="360"/>
       </w:pPr>
       <w:r>
         <w:rPr>
@@ -258,7 +41,223 @@
           <w:sz w:val="24"/>
           <w:szCs w:val="24"/>
         </w:rPr>
-        <w:t xml:space="preserve">References Cited</w:t>
+        <w:t xml:space="preserve">Research Framework</w:t>
+      </w:r>
+    </w:p>
+    <w:p>
+      <w:pPr>
+        <w:spacing w:after="0" w:line="360"/>
+        <w:ind w:firstLine="720"/>
+        <w:jc w:val="both"/>
+      </w:pPr>
+      <w:r>
+        <w:t xml:space="preserve">Individual trees are the units in which woody plant encroachment, habitat change and carbon storage are expressed, yet they are rarely the units in which landscapes are mapped. This gap has been narrowed by two developments in geospatial artificial intelligence (GeoAI). Deep learning detectors have been trained to locate individual tree crowns in very high-resolution imagery (Weinstein et al., 2019; Ball et al., 2023), and vision foundation models have been released that segment almost any object in an image when only a point or a box is supplied (Kirillov et al., 2023; Ravi et al., 2024). Both developments, however, have been built mainly on RGB imagery, whereas the airborne platforms now flown routinely over ecological sites record each crown in three complementary ways: its color and outline in RGB imagery, its three-dimensional structure in LiDAR, and its biochemical composition in hyperspectral imagery (Kampe et al., 2010). The proposed research is concerned with how these three spatial datasets should be joined to GeoAI models, and with the conditions under which general-purpose foundation models become reliable crown mappers when they are guided by structural and spectral information.</w:t>
+      </w:r>
+    </w:p>
+    <w:p>
+      <w:pPr>
+        <w:spacing w:after="0" w:line="360"/>
+        <w:ind w:firstLine="720"/>
+        <w:jc w:val="both"/>
+      </w:pPr>
+      <w:r>
+        <w:t xml:space="preserve">The research is set at LBJ National Grassland (NEON site CLBJ), Texas, an open Cross Timbers savanna in which post oak (</w:t>
+      </w:r>
+      <w:r>
+        <w:rPr>
+          <w:i/>
+          <w:iCs/>
+        </w:rPr>
+        <w:t xml:space="preserve">Quercus stellata</w:t>
+      </w:r>
+      <w:r>
+        <w:t xml:space="preserve">) and blackjack oak (</w:t>
+      </w:r>
+      <w:r>
+        <w:rPr>
+          <w:i/>
+          <w:iCs/>
+        </w:rPr>
+        <w:t xml:space="preserve">Quercus marilandica</w:t>
+      </w:r>
+      <w:r>
+        <w:t xml:space="preserve">) woodland is interspersed with grassland that is being invaded by eastern redcedar (</w:t>
+      </w:r>
+      <w:r>
+        <w:rPr>
+          <w:i/>
+          <w:iCs/>
+        </w:rPr>
+        <w:t xml:space="preserve">Juniperus virginiana</w:t>
+      </w:r>
+      <w:r>
+        <w:t xml:space="preserve">). Redcedar expansion has been linked across the southern Great Plains to the suppression of fire (Van Auken, 2000; Briggs et al., 2005) and has been mapped from satellite data in neighboring Oklahoma (Wang et al., 2017), and prescribed fire is applied by the US Forest Service to control woody cover at the site (USDA Forest Service, 2013). The site is also a demanding test for GeoAI models. Isolated crowns, shrubs, bare soil and senescent grass are mixed at a fine scale, and the landscape differs strongly from the closed forests on which crown models have been trained and evaluated. CLBJ was excluded from the NEON crown benchmark because too few trees met its criteria (Weinstein et al., 2021), so no benchmark evidence on model performance exists for this kind of landscape.</w:t>
+      </w:r>
+    </w:p>
+    <w:p>
+      <w:pPr>
+        <w:spacing w:after="0" w:line="360"/>
+        <w:ind w:firstLine="720"/>
+        <w:jc w:val="both"/>
+      </w:pPr>
+      <w:r>
+        <w:t xml:space="preserve">The framework is built on four bodies of theory. The first is object-based image analysis, in which the crown, rather than the pixel, is treated as the unit of analysis, because very high-resolution pixels are much smaller than the objects being mapped (Blaschke, 2010; Ke &amp; Quackenbush, 2011). The second is the physical basis of the three sensors, by which a distinct property of the crown is assigned to each dataset. In NEON RGB mosaics at 10 cm resolution, crown edges and texture are resolved, but no height information is contained, so crowns can be confused with grass or shrubs of similar color, and adjacent crowns can be merged. In LiDAR point clouds and the 1 m canopy height model derived from them, vegetation height is measured directly; tree tops have been located as local maxima of canopy height (Popescu &amp; Wynne, 2004), and individual trees have been segmented from point clouds with open tools such as lidR (Roussel et al., 2020) (Dong &amp; Chen, 2018). In NEON hyperspectral imagery, reflectance is recorded from 380 to about 2510 nm in roughly 426 bands at 1 m resolution. Because canopy reflectance is controlled by pigments, water, dry matter and canopy structure (Asner, 1998), and because these properties differ among plant functional types (Ustin &amp; Gamon, 2010), hyperspectral data have been identified as the most informative source for tree species classification (Fassnacht et al., 2016), and individual trees have been classified to species across NEON sites with an average accuracy of 0.77 (Marconi et al., 2022).</w:t>
+      </w:r>
+    </w:p>
+    <w:p>
+      <w:pPr>
+        <w:spacing w:after="0" w:line="360"/>
+        <w:ind w:firstLine="720"/>
+        <w:jc w:val="both"/>
+      </w:pPr>
+      <w:r>
+        <w:t xml:space="preserve">The third body of theory is multisensor fusion. Fusion has been classified into pixel, feature and decision levels (Pohl &amp; van Genderen, 1998), and feature-level fusion of LiDAR and hyperspectral data has improved tree species classification in forests (Dalponte et al., 2012), including with NEON data (Scholl et al., 2021). The fourth is the theory of transfer in machine learning. Supervised models are optimized for the distribution of their training data, and their accuracy falls when target data are drawn from a different distribution, a problem described in remote sensing as domain shift (Tuia et al., 2016). Foundation models have been proposed as a response, because pretraining on very large and diverse datasets yields models that can be adapted to new tasks with little or no labeled data (Bommasani et al., 2021). The Segment Anything Model (SAM) was pretrained on more than one billion masks from eleven million images (Kirillov et al., 2023), and its successor, SAM 2, adds a memory module and has been reported to be both more accurate and about six times faster than SAM on images (Ravi et al., 2024).</w:t>
+      </w:r>
+    </w:p>
+    <w:p>
+      <w:pPr>
+        <w:spacing w:after="0" w:line="360"/>
+        <w:ind w:firstLine="720"/>
+        <w:jc w:val="both"/>
+      </w:pPr>
+      <w:r>
+        <w:t xml:space="preserve">Supervised crown models are accurate within their training domain, but they have not been tested in open savanna. DeepForest, a RetinaNet detector (Lin et al., 2017), was pretrained on NEON RGB imagery with labels generated from LiDAR (Weinstein et al., 2019, 2020), and Detectree2, a Mask R-CNN model (He et al., 2017), was developed in tropical forests (Ball et al., 2023). Foundation models are not restricted to one domain, but on remote sensing imagery their output has been found to be uneven and strongly dependent on prompts (Osco et al., 2023). In drone imagery of forests, SAM used without adaptation did not match a trained Mask R-CNN, although its segmentation was improved when elevation data were supplied (Teng et al., 2025). Most directly, LiDAR has already been used with SAM 2 as a filter for box prompts and as a source of point prompts on 592 trees from NEON forest plots, and object-level F1 scores ranged from 35% to 92% depending only on how the prompts were generated (Zhu et al., 2025). The use of LiDAR to prompt foundation models is therefore not new. What has not been established is whether this guidance still works where trees are sparse and the background is grass and soil rather than canopy, whether hyperspectral information adds a further constraint beyond structure, and whether the crowns produced in this way improve the species maps that are ultimately needed. These three unanswered points define the gap addressed by the research.</w:t>
+      </w:r>
+    </w:p>
+    <w:p>
+      <w:pPr>
+        <w:spacing w:after="0" w:line="360"/>
+        <w:ind w:firstLine="720"/>
+        <w:jc w:val="both"/>
+      </w:pPr>
+      <w:r>
+        <w:t xml:space="preserve">From this gap, the central proposition of the framework is derived: in a landscape unlike the one a model was trained on, auxiliary sensors are most valuable when they are used to direct a foundation model rather than to replace it or to be added to its input. Each sensor is therefore assigned to the role for which its physics is best suited. RGB imagery, in which crown edges are best resolved, is retained as the image that is segmented. LiDAR is used to tell the model where each tree is, through tree tops converted into point prompts and crown extents converted into box prompts, and to discard objects below an operational height threshold. Hyperspectral imagery is used to tell the model what is vegetation, through a mask that excludes bare soil and senescent grass. This form of integration can be described as prompt-level fusion, placed between the feature and decision levels of Pohl and van Genderen (1998), and it is extended here from two sensors to three. The crowns produced in this way are then used at the feature level, where spectral, structural and textural descriptors are extracted for each crown and combined for species classification. Delineation and classification are thereby linked in a single chain: when crown outlines are more accurate, fewer mixed edge pixels are included in each crown, and species should be classified more accurately. This link is treated as a testable part of the framework rather than as an assumption.</w:t>
+      </w:r>
+    </w:p>
+    <w:p>
+      <w:pPr>
+        <w:spacing w:after="0" w:line="360"/>
+        <w:ind w:firstLine="720"/>
+        <w:jc w:val="both"/>
+      </w:pPr>
+      <w:r>
+        <w:t xml:space="preserve">The variables follow directly from this proposition. For crown delineation, model family and guidance condition (RGB-only, LiDAR prompts, and LiDAR prompts with the hyperspectral constraint) are treated as independent variables, and stem-based detection rate, precision, recall, F1 score and intersection-over-union as dependent variables. For species classification, sensor combination and crown source (manual reference crowns, guided foundation-model crowns and supervised-model crowns) are treated as independent variables, and macro-averaged and per-class F1 scores as dependent variables. Crown size, crown isolation and setting (open grassland or woodland) are treated as moderators, because the effect of guidance is expected to differ where crowns are small, touching or surrounded by grass. Field-to-flight change, co-registration error, shadow and class imbalance are recorded as potential confounders.</w:t>
+      </w:r>
+    </w:p>
+    <w:p>
+      <w:pPr>
+        <w:spacing w:after="0" w:line="360"/>
+        <w:ind w:firstLine="720"/>
+        <w:jc w:val="both"/>
+      </w:pPr>
+      <w:r>
+        <w:t xml:space="preserve">Two research questions are posed. In the first, it is asked how accurately individual tree crowns are delineated in an open savanna by supervised deep learning models and by foundation models, and by how much the foundation models are improved by LiDAR and hyperspectral guidance. Under H1a, RGB-only SAM and SAM 2 are expected to produce lower precision than the best supervised model, because grass patches, shrubs and shadows are segmented as objects when no height or spectral constraint is applied. Under H1b, LiDAR point and box prompts are expected to improve detection and delineation over RGB-only prompting, because explicit information on tree location and extent is supplied. Under H1c, the addition of the hyperspectral constraint is expected to reduce false positives further in open grassland, but to provide little benefit, or to introduce errors, for small crowns whose 1 m pixels mix tree and background. Under H1d, the gains from guidance are expected to vary with crown size, isolation and setting, so that they are reported by stratum rather than as a single average.</w:t>
+      </w:r>
+    </w:p>
+    <w:p>
+      <w:pPr>
+        <w:spacing w:after="0" w:line="360"/>
+        <w:ind w:firstLine="720"/>
+        <w:jc w:val="both"/>
+      </w:pPr>
+      <w:r>
+        <w:t xml:space="preserve">In the second, it is asked which sensor combinations best support species classification, and whether crown quality matters. Under H2a, hyperspectral features are expected to contribute most, because species differences in pigments, water and leaf structure are expressed spectrally (Asner, 1998; Ustin &amp; Gamon, 2010), while LiDAR height and crown shape are expected to add complementary information, particularly for eastern redcedar, whose dense, conical evergreen crowns differ structurally from the broad crowns of the oaks. Under H2b, combined hyperspectral, LiDAR and RGB features are expected to outperform any single sensor, which is tested by ablation rather than assumed. Under H2c, classification on manually delineated crowns is expected to set an upper bound, and crowns from the best guided foundation model are expected to come closer to that bound than crowns or boxes from the supervised models, because fewer background pixels are included. Three classifiers are compared under identical conditions: random forest (Breiman, 2001), support vector machines, which have performed well on high-dimensional hyperspectral data (Melgani &amp; Bruzzone, 2004), and a one-dimensional convolutional neural network, in which features are learned along the spectrum (Hu et al., 2015). Their comparison shows whether a deep learning classifier adds value when labeled trees are limited.</w:t>
+      </w:r>
+    </w:p>
+    <w:p>
+      <w:pPr>
+        <w:spacing w:after="0" w:line="360"/>
+        <w:ind w:firstLine="720"/>
+        <w:jc w:val="both"/>
+      </w:pPr>
+      <w:r>
+        <w:t xml:space="preserve">The methodology is aligned with these questions through a controlled design built entirely on open NEON data. All sensor products are taken from a single flight year, 2024, so that every crown is imaged under the same conditions by all three sensors: the 10 cm RGB mosaic (DP3.30010.001), the discrete-return LiDAR point cloud (DP1.30003.001) and canopy height model (DP3.30015.001), and hyperspectral surface reflectance (DP3.30006.002), from which water-vapor bands near 1340–1445 nm and 1790–1955 nm are removed. Ground truth is taken from NEON vegetation structure records (NEON, 2026), in which 862 live trees at least 2 m tall are recorded in 47 plots, and stem positions are available for 517 of them (353 oaks, 69 eastern redcedar and 95 other broadleaf trees, mainly hackberry, cedar elm and winged elm). Stem coordinates have already been computed, and the 2024 RGB and canopy height tiles for five plots spanning woodland and grassland have been downloaded. Before the full experiment, a feasibility check is completed in which three-sensor coverage, product release status and co-registration are confirmed for every selected plot, the number of usable labels per species is counted, and annotation time is estimated. If labels prove too few for four classes, classification is reduced to the contrast between redcedar and oaks.</w:t>
+      </w:r>
+    </w:p>
+    <w:p>
+      <w:pPr>
+        <w:spacing w:after="0" w:line="360"/>
+        <w:ind w:firstLine="720"/>
+        <w:jc w:val="both"/>
+      </w:pPr>
+      <w:r>
+        <w:t xml:space="preserve">Field stems show where trees are but not the shape of their crowns, so detection against stems and delineation against crown outlines are treated as separate evaluations. A second reference set of 150 to 300 crowns is delineated manually on the RGB mosaic with the canopy height model as a guide, stratified by setting, crown size and isolation, and a subset is delineated by two annotators so that agreement can be reported. Stems whose crowns cannot be matched confidently to the imagery, including trees burned or cleared since the survey, are flagged and excluded. Information leakage is prevented by design. The data are divided into spatial blocks defined by plot before any tuning, and the height threshold, local-maximum window, prompt settings and fine-tuning are chosen on training blocks only. The hyperspectral mask is created with a documented spectral rule that uses neither species labels nor test crowns, and the 2 m height threshold is treated as an operational definition whose effect is examined in a sensitivity analysis.</w:t>
+      </w:r>
+    </w:p>
+    <w:p>
+      <w:pPr>
+        <w:spacing w:after="0" w:line="360"/>
+        <w:ind w:firstLine="720"/>
+        <w:jc w:val="both"/>
+      </w:pPr>
+      <w:r>
+        <w:t xml:space="preserve">For the first question, the same held-out blocks and reference crowns are used for every method. SAM and SAM 2, accessed through samgeo (Wu &amp; Osco, 2023), are run with RGB-only automatic prompting, with LiDAR point prompts, with LiDAR box prompts, and with LiDAR prompts plus the hyperspectral constraint. Tree tops are extracted from the canopy height model by local-maximum filtering with a height-dependent window (Popescu &amp; Wynne, 2004), and crown extents are taken from LiDAR tree segmentation in lidR (Roussel et al., 2020). DeepForest and Detectree2 are run with their published weights and, where the number of reference crowns allows, after fine-tuning on training blocks. Predicted crowns are matched one-to-one to reference crowns with a matching threshold fixed before analysis, following the NEON crown benchmark (Weinstein et al., 2021), with alternative thresholds reported for sensitivity. Errors are stratified by crown size, isolation and setting, so that H1c and H1d can be tested directly.</w:t>
+      </w:r>
+    </w:p>
+    <w:p>
+      <w:pPr>
+        <w:spacing w:after="0" w:line="360"/>
+        <w:ind w:firstLine="720"/>
+        <w:jc w:val="both"/>
+      </w:pPr>
+      <w:r>
+        <w:t xml:space="preserve">For the second question, each crown is described by the mean and variability of its reflectance, its principal components and narrow-band vegetation indices, by LiDAR height percentiles and crown area and shape, and by RGB texture. Classifiers are trained on seven sensor combinations (hyperspectral, LiDAR and RGB alone, in pairs and all together) for post oak, blackjack oak, eastern redcedar and other broadleaf trees. To isolate the effect of crown quality, the same classifier and training protocol are applied to manual reference crowns, guided foundation-model crowns and supervised-model crowns, so that any difference in accuracy can be attributed to the crown outlines rather than to the classifier.</w:t>
+      </w:r>
+    </w:p>
+    <w:p>
+      <w:pPr>
+        <w:spacing w:after="0" w:line="360"/>
+        <w:ind w:firstLine="720"/>
+        <w:jc w:val="both"/>
+      </w:pPr>
+      <w:r>
+        <w:t xml:space="preserve">Rigor is secured in the analysis as well as in the design. Accuracy is measured with confusion-matrix statistics for remotely sensed maps (Congalton, 1991), and kappa is not used, because it has been shown to be misleading for comparing maps (Pontius &amp; Millones, 2011). Because classes are unbalanced, macro-averaged F1 is reported alongside overall accuracy and per-class precision, recall and F1. Because nearby trees are spatially autocorrelated and random splits overstate accuracy (Roberts et al., 2017; Ploton et al., 2020), all training and testing use spatial blocks, and confidence intervals are obtained by bootstrap resampling at the block level rather than by treating every crown as independent. Paired comparisons of classification correctness on the same crowns are made with McNemar’s test (Foody, 2004), and paired differences in continuous measures such as intersection-over-union are tested with block-level permutation. A sensor ablation, in which each analysis is repeated with one dataset removed, is used to measure the contribution of each sensor directly rather than infer it. All processing is scripted in Python and R under version control, with product versions, model weights, prompts, thresholds and random seeds recorded for reproducibility.</w:t>
+      </w:r>
+    </w:p>
+    <w:p>
+      <w:pPr>
+        <w:spacing w:after="0" w:line="360"/>
+        <w:ind w:firstLine="720"/>
+        <w:jc w:val="both"/>
+      </w:pPr>
+      <w:r>
+        <w:t xml:space="preserve">The work is organized as a chain in which the output of each stage becomes the input of the next. Data checks and the analysis protocol are completed in months one and two, reference crowns and prompt pilots in months three and four, and the delineation experiment in months five to seven, so that the first question is answered independently of the rest. Species classification and sensor ablation follow in months eight and nine, uncertainty and sensitivity analyses in month ten, and writing and defense in months eleven and twelve.</w:t>
+      </w:r>
+    </w:p>
+    <w:p>
+      <w:pPr>
+        <w:spacing w:after="0" w:line="360"/>
+        <w:ind w:firstLine="720"/>
+        <w:jc w:val="both"/>
+      </w:pPr>
+      <w:r>
+        <w:t xml:space="preserve">The expected contribution to knowledge is threefold. Conceptually, prompt-level fusion is extended from two sensors to three and tested in a setting where it is most likely to fail, so that the conditions under which structural prompts and spectral constraints help or harm foundation models are identified. Empirically, a controlled, spatially independent comparison of supervised crown models and guided foundation models is provided for an open savanna, together with a measurement of how much RGB, LiDAR and hyperspectral data each contribute and of whether better crowns produce better species maps. Methodologically, a documented set of reference crowns and species labels is produced for a site absent from the NEON crown benchmark and is released with the code for reuse. Because the design is controlled, its answer is valuable whether guidance proves helpful, harmful or mixed.</w:t>
+      </w:r>
+    </w:p>
+    <w:p>
+      <w:pPr>
+        <w:spacing w:after="0" w:line="360"/>
+        <w:ind w:firstLine="720"/>
+        <w:jc w:val="both"/>
+      </w:pPr>
+      <w:r>
+        <w:t xml:space="preserve">The practical significance follows from the openness of the data. Tree-level maps of oaks and redcedar can support decisions on cedar removal and prescribed burning at LBJ, and because the same three datasets are collected by NEON at grassland and savanna sites across the United States, the workflow is designed so that it can be tested at other sites affected by woody plant encroachment. The limits of the framework are stated openly. Field records and 2024 imagery may not describe identical trees, the 1 m hyperspectral pixels limit the analysis of very small crowns, the 2022–2025 hyperspectral product is provisional and may be revised, and evidence from a single site cannot by itself demonstrate transfer to other savannas. These limits are addressed through flagging, stratified reporting and proportionate claims, and none of them affects the central test of the framework.</w:t>
+      </w:r>
+    </w:p>
+    <w:p>
+      <w:pPr>
+        <w:pageBreakBefore/>
+        <w:spacing w:after="240"/>
+        <w:jc w:val="center"/>
+      </w:pPr>
+      <w:r>
+        <w:rPr>
+          <w:b/>
+          <w:bCs/>
+          <w:sz w:val="24"/>
+          <w:szCs w:val="24"/>
+        </w:rPr>
+        <w:t xml:space="preserve">References</w:t>
       </w:r>
     </w:p>
     <w:p>
@@ -348,16 +347,6 @@
         <w:jc w:val="left"/>
       </w:pPr>
       <w:r>
-        <w:t xml:space="preserve">Dalponte, M., &amp; Coomes, D. A. (2016). Tree-centric mapping of forest carbon density from airborne laser scanning and hyperspectral data. Methods in Ecology and Evolution, 7(10), 1236–1245.</w:t>
-      </w:r>
-    </w:p>
-    <w:p>
-      <w:pPr>
-        <w:spacing w:after="120" w:line="276"/>
-        <w:ind w:left="720" w:hanging="720"/>
-        <w:jc w:val="left"/>
-      </w:pPr>
-      <w:r>
         <w:t xml:space="preserve">Dong, P., &amp; Chen, Q. (2018). LiDAR remote sensing and applications. CRC Press.</w:t>
       </w:r>
     </w:p>
@@ -628,6 +617,26 @@
         <w:jc w:val="left"/>
       </w:pPr>
       <w:r>
+        <w:t xml:space="preserve">Weinstein, B. G., et al. (2021). A benchmark dataset for canopy crown detection and delineation in co-registered airborne RGB, LiDAR and hyperspectral imagery from the National Ecological Observation Network. PLoS Computational Biology, 17(7), e1009180.</w:t>
+      </w:r>
+    </w:p>
+    <w:p>
+      <w:pPr>
+        <w:spacing w:after="120" w:line="276"/>
+        <w:ind w:left="720" w:hanging="720"/>
+        <w:jc w:val="left"/>
+      </w:pPr>
+      <w:r>
+        <w:t xml:space="preserve">Weinstein, B. G., Marconi, S., Aubry-Kientz, M., Vincent, G., Senyondo, H., &amp; White, E. P. (2020). DeepForest: A Python package for RGB deep learning tree crown delineation. Methods in Ecology and Evolution, 11(12), 1743–1751.</w:t>
+      </w:r>
+    </w:p>
+    <w:p>
+      <w:pPr>
+        <w:spacing w:after="120" w:line="276"/>
+        <w:ind w:left="720" w:hanging="720"/>
+        <w:jc w:val="left"/>
+      </w:pPr>
+      <w:r>
         <w:t xml:space="preserve">Weinstein, B. G., Marconi, S., Bohlman, S., Zare, A., &amp; White, E. (2019). Individual tree-crown detection in RGB imagery using semi-supervised deep learning neural networks. Remote Sensing, 11(11), 1309.</w:t>
       </w:r>
     </w:p>
@@ -638,27 +647,17 @@
         <w:jc w:val="left"/>
       </w:pPr>
       <w:r>
-        <w:t xml:space="preserve">Weinstein, B. G., Marconi, S., Aubry-Kientz, M., Vincent, G., Senyondo, H., &amp; White, E. P. (2020). DeepForest: A Python package for RGB deep learning tree crown delineation. Methods in Ecology and Evolution, 11(12), 1743–1751.</w:t>
-      </w:r>
-    </w:p>
-    <w:p>
-      <w:pPr>
-        <w:spacing w:after="120" w:line="276"/>
-        <w:ind w:left="720" w:hanging="720"/>
-        <w:jc w:val="left"/>
-      </w:pPr>
-      <w:r>
-        <w:t xml:space="preserve">Weinstein, B. G., et al. (2021). A benchmark dataset for canopy crown detection and delineation in co-registered airborne RGB, LiDAR and hyperspectral imagery from the National Ecological Observation Network. PLoS Computational Biology, 17(7), e1009180.</w:t>
-      </w:r>
-    </w:p>
-    <w:p>
-      <w:pPr>
-        <w:spacing w:after="120" w:line="276"/>
-        <w:ind w:left="720" w:hanging="720"/>
-        <w:jc w:val="left"/>
-      </w:pPr>
-      <w:r>
         <w:t xml:space="preserve">Wu, Q., &amp; Osco, L. P. (2023). samgeo: A Python package for segmenting geospatial data with the Segment Anything Model (SAM). Journal of Open Source Software, 8(89), 5663.</w:t>
+      </w:r>
+    </w:p>
+    <w:p>
+      <w:pPr>
+        <w:spacing w:after="120" w:line="276"/>
+        <w:ind w:left="720" w:hanging="720"/>
+        <w:jc w:val="left"/>
+      </w:pPr>
+      <w:r>
+        <w:t xml:space="preserve">Zhu, Y., Locke, W., Yuan, J., Zhang, Y., Ma, Q., &amp; Liang, L. (2025). Leveraging SAM 2 and LiDAR for automated individual tree crown delineation: A comparative evaluation of prompting methods. Information Geography, 1(2), 100025. https://doi.org/10.1016/j.infgeo.2025.100025</w:t>
       </w:r>
     </w:p>
     <w:sectPr>

</xml_diff>

<commit_message>
Framework: future tense for proposed work
Co-Authored-By: Claude Opus 5.5 <noreply@anthropic.com>
Claude-Session: https://claude.ai/code/session_0132bxCMLAKTHUnyQV3MmGfs
</commit_message>
<xml_diff>
--- a/thesis/Proposed_Research_Framework_Poudel.docx
+++ b/thesis/Proposed_Research_Framework_Poudel.docx
@@ -51,17 +51,17 @@
         <w:jc w:val="both"/>
       </w:pPr>
       <w:r>
-        <w:t xml:space="preserve">Individual trees are the units in which woody plant encroachment, habitat change and carbon storage are expressed, yet they are rarely the units in which landscapes are mapped. This gap has been narrowed by two developments in geospatial artificial intelligence (GeoAI). Deep learning detectors have been trained to locate individual tree crowns in very high-resolution imagery (Weinstein et al., 2019; Ball et al., 2023), and vision foundation models have been released that segment almost any object in an image when only a point or a box is supplied (Kirillov et al., 2023; Ravi et al., 2024). Both developments, however, have been built mainly on RGB imagery, whereas the airborne platforms now flown routinely over ecological sites record each crown in three complementary ways: its color and outline in RGB imagery, its three-dimensional structure in LiDAR, and its biochemical composition in hyperspectral imagery (Kampe et al., 2010). The proposed research is concerned with how these three spatial datasets should be joined to GeoAI models, and with the conditions under which general-purpose foundation models become reliable crown mappers when they are guided by structural and spectral information.</w:t>
-      </w:r>
-    </w:p>
-    <w:p>
-      <w:pPr>
-        <w:spacing w:after="0" w:line="360"/>
-        <w:ind w:firstLine="720"/>
-        <w:jc w:val="both"/>
-      </w:pPr>
-      <w:r>
-        <w:t xml:space="preserve">The research is set at LBJ National Grassland (NEON site CLBJ), Texas, an open Cross Timbers savanna in which post oak (</w:t>
+        <w:t xml:space="preserve">Individual trees are the units in which woody plant encroachment, habitat change and carbon storage are expressed, yet they are rarely the units in which landscapes are mapped. This gap has been narrowed by two developments in geospatial artificial intelligence (GeoAI). Deep learning detectors have been trained to locate individual tree crowns in very high-resolution imagery (Weinstein et al., 2019; Ball et al., 2023), and vision foundation models have been released that segment almost any object in an image when only a point or a box is supplied (Kirillov et al., 2023; Ravi et al., 2024). Both developments, however, have been built mainly on RGB imagery, whereas the airborne platforms now flown routinely over ecological sites record each crown in three complementary ways: its color and outline in RGB imagery, its three-dimensional structure in LiDAR, and its biochemical composition in hyperspectral imagery (Kampe et al., 2010). The proposed research will examine how these three spatial datasets should be joined to GeoAI models, and with the conditions under which general-purpose foundation models become reliable crown mappers when they are guided by structural and spectral information.</w:t>
+      </w:r>
+    </w:p>
+    <w:p>
+      <w:pPr>
+        <w:spacing w:after="0" w:line="360"/>
+        <w:ind w:firstLine="720"/>
+        <w:jc w:val="both"/>
+      </w:pPr>
+      <w:r>
+        <w:t xml:space="preserve">The research will be conducted at LBJ National Grassland (NEON site CLBJ), Texas, an open Cross Timbers savanna in which post oak (</w:t>
       </w:r>
       <w:r>
         <w:rPr>
@@ -121,127 +121,127 @@
         <w:jc w:val="both"/>
       </w:pPr>
       <w:r>
-        <w:t xml:space="preserve">Supervised crown models are accurate within their training domain, but they have not been tested in open savanna. DeepForest, a RetinaNet detector (Lin et al., 2017), was pretrained on NEON RGB imagery with labels generated from LiDAR (Weinstein et al., 2019, 2020), and Detectree2, a Mask R-CNN model (He et al., 2017), was developed in tropical forests (Ball et al., 2023). Foundation models are not restricted to one domain, but on remote sensing imagery their output has been found to be uneven and strongly dependent on prompts (Osco et al., 2023). In drone imagery of forests, SAM used without adaptation did not match a trained Mask R-CNN, although its segmentation was improved when elevation data were supplied (Teng et al., 2025). Most directly, LiDAR has already been used with SAM 2 as a filter for box prompts and as a source of point prompts on 592 trees from NEON forest plots, and object-level F1 scores ranged from 35% to 92% depending only on how the prompts were generated (Zhu et al., 2025). The use of LiDAR to prompt foundation models is therefore not new. What has not been established is whether this guidance still works where trees are sparse and the background is grass and soil rather than canopy, whether hyperspectral information adds a further constraint beyond structure, and whether the crowns produced in this way improve the species maps that are ultimately needed. These three unanswered points define the gap addressed by the research.</w:t>
-      </w:r>
-    </w:p>
-    <w:p>
-      <w:pPr>
-        <w:spacing w:after="0" w:line="360"/>
-        <w:ind w:firstLine="720"/>
-        <w:jc w:val="both"/>
-      </w:pPr>
-      <w:r>
-        <w:t xml:space="preserve">From this gap, the central proposition of the framework is derived: in a landscape unlike the one a model was trained on, auxiliary sensors are most valuable when they are used to direct a foundation model rather than to replace it or to be added to its input. Each sensor is therefore assigned to the role for which its physics is best suited. RGB imagery, in which crown edges are best resolved, is retained as the image that is segmented. LiDAR is used to tell the model where each tree is, through tree tops converted into point prompts and crown extents converted into box prompts, and to discard objects below an operational height threshold. Hyperspectral imagery is used to tell the model what is vegetation, through a mask that excludes bare soil and senescent grass. This form of integration can be described as prompt-level fusion, placed between the feature and decision levels of Pohl and van Genderen (1998), and it is extended here from two sensors to three. The crowns produced in this way are then used at the feature level, where spectral, structural and textural descriptors are extracted for each crown and combined for species classification. Delineation and classification are thereby linked in a single chain: when crown outlines are more accurate, fewer mixed edge pixels are included in each crown, and species should be classified more accurately. This link is treated as a testable part of the framework rather than as an assumption.</w:t>
-      </w:r>
-    </w:p>
-    <w:p>
-      <w:pPr>
-        <w:spacing w:after="0" w:line="360"/>
-        <w:ind w:firstLine="720"/>
-        <w:jc w:val="both"/>
-      </w:pPr>
-      <w:r>
-        <w:t xml:space="preserve">The variables follow directly from this proposition. For crown delineation, model family and guidance condition (RGB-only, LiDAR prompts, and LiDAR prompts with the hyperspectral constraint) are treated as independent variables, and stem-based detection rate, precision, recall, F1 score and intersection-over-union as dependent variables. For species classification, sensor combination and crown source (manual reference crowns, guided foundation-model crowns and supervised-model crowns) are treated as independent variables, and macro-averaged and per-class F1 scores as dependent variables. Crown size, crown isolation and setting (open grassland or woodland) are treated as moderators, because the effect of guidance is expected to differ where crowns are small, touching or surrounded by grass. Field-to-flight change, co-registration error, shadow and class imbalance are recorded as potential confounders.</w:t>
-      </w:r>
-    </w:p>
-    <w:p>
-      <w:pPr>
-        <w:spacing w:after="0" w:line="360"/>
-        <w:ind w:firstLine="720"/>
-        <w:jc w:val="both"/>
-      </w:pPr>
-      <w:r>
-        <w:t xml:space="preserve">Two research questions are posed. In the first, it is asked how accurately individual tree crowns are delineated in an open savanna by supervised deep learning models and by foundation models, and by how much the foundation models are improved by LiDAR and hyperspectral guidance. Under H1a, RGB-only SAM and SAM 2 are expected to produce lower precision than the best supervised model, because grass patches, shrubs and shadows are segmented as objects when no height or spectral constraint is applied. Under H1b, LiDAR point and box prompts are expected to improve detection and delineation over RGB-only prompting, because explicit information on tree location and extent is supplied. Under H1c, the addition of the hyperspectral constraint is expected to reduce false positives further in open grassland, but to provide little benefit, or to introduce errors, for small crowns whose 1 m pixels mix tree and background. Under H1d, the gains from guidance are expected to vary with crown size, isolation and setting, so that they are reported by stratum rather than as a single average.</w:t>
-      </w:r>
-    </w:p>
-    <w:p>
-      <w:pPr>
-        <w:spacing w:after="0" w:line="360"/>
-        <w:ind w:firstLine="720"/>
-        <w:jc w:val="both"/>
-      </w:pPr>
-      <w:r>
-        <w:t xml:space="preserve">In the second, it is asked which sensor combinations best support species classification, and whether crown quality matters. Under H2a, hyperspectral features are expected to contribute most, because species differences in pigments, water and leaf structure are expressed spectrally (Asner, 1998; Ustin &amp; Gamon, 2010), while LiDAR height and crown shape are expected to add complementary information, particularly for eastern redcedar, whose dense, conical evergreen crowns differ structurally from the broad crowns of the oaks. Under H2b, combined hyperspectral, LiDAR and RGB features are expected to outperform any single sensor, which is tested by ablation rather than assumed. Under H2c, classification on manually delineated crowns is expected to set an upper bound, and crowns from the best guided foundation model are expected to come closer to that bound than crowns or boxes from the supervised models, because fewer background pixels are included. Three classifiers are compared under identical conditions: random forest (Breiman, 2001), support vector machines, which have performed well on high-dimensional hyperspectral data (Melgani &amp; Bruzzone, 2004), and a one-dimensional convolutional neural network, in which features are learned along the spectrum (Hu et al., 2015). Their comparison shows whether a deep learning classifier adds value when labeled trees are limited.</w:t>
-      </w:r>
-    </w:p>
-    <w:p>
-      <w:pPr>
-        <w:spacing w:after="0" w:line="360"/>
-        <w:ind w:firstLine="720"/>
-        <w:jc w:val="both"/>
-      </w:pPr>
-      <w:r>
-        <w:t xml:space="preserve">The methodology is aligned with these questions through a controlled design built entirely on open NEON data. All sensor products are taken from a single flight year, 2024, so that every crown is imaged under the same conditions by all three sensors: the 10 cm RGB mosaic (DP3.30010.001), the discrete-return LiDAR point cloud (DP1.30003.001) and canopy height model (DP3.30015.001), and hyperspectral surface reflectance (DP3.30006.002), from which water-vapor bands near 1340–1445 nm and 1790–1955 nm are removed. Ground truth is taken from NEON vegetation structure records (NEON, 2026), in which 862 live trees at least 2 m tall are recorded in 47 plots, and stem positions are available for 517 of them (353 oaks, 69 eastern redcedar and 95 other broadleaf trees, mainly hackberry, cedar elm and winged elm). Stem coordinates have already been computed, and the 2024 RGB and canopy height tiles for five plots spanning woodland and grassland have been downloaded. Before the full experiment, a feasibility check is completed in which three-sensor coverage, product release status and co-registration are confirmed for every selected plot, the number of usable labels per species is counted, and annotation time is estimated. If labels prove too few for four classes, classification is reduced to the contrast between redcedar and oaks.</w:t>
-      </w:r>
-    </w:p>
-    <w:p>
-      <w:pPr>
-        <w:spacing w:after="0" w:line="360"/>
-        <w:ind w:firstLine="720"/>
-        <w:jc w:val="both"/>
-      </w:pPr>
-      <w:r>
-        <w:t xml:space="preserve">Field stems show where trees are but not the shape of their crowns, so detection against stems and delineation against crown outlines are treated as separate evaluations. A second reference set of 150 to 300 crowns is delineated manually on the RGB mosaic with the canopy height model as a guide, stratified by setting, crown size and isolation, and a subset is delineated by two annotators so that agreement can be reported. Stems whose crowns cannot be matched confidently to the imagery, including trees burned or cleared since the survey, are flagged and excluded. Information leakage is prevented by design. The data are divided into spatial blocks defined by plot before any tuning, and the height threshold, local-maximum window, prompt settings and fine-tuning are chosen on training blocks only. The hyperspectral mask is created with a documented spectral rule that uses neither species labels nor test crowns, and the 2 m height threshold is treated as an operational definition whose effect is examined in a sensitivity analysis.</w:t>
-      </w:r>
-    </w:p>
-    <w:p>
-      <w:pPr>
-        <w:spacing w:after="0" w:line="360"/>
-        <w:ind w:firstLine="720"/>
-        <w:jc w:val="both"/>
-      </w:pPr>
-      <w:r>
-        <w:t xml:space="preserve">For the first question, the same held-out blocks and reference crowns are used for every method. SAM and SAM 2, accessed through samgeo (Wu &amp; Osco, 2023), are run with RGB-only automatic prompting, with LiDAR point prompts, with LiDAR box prompts, and with LiDAR prompts plus the hyperspectral constraint. Tree tops are extracted from the canopy height model by local-maximum filtering with a height-dependent window (Popescu &amp; Wynne, 2004), and crown extents are taken from LiDAR tree segmentation in lidR (Roussel et al., 2020). DeepForest and Detectree2 are run with their published weights and, where the number of reference crowns allows, after fine-tuning on training blocks. Predicted crowns are matched one-to-one to reference crowns with a matching threshold fixed before analysis, following the NEON crown benchmark (Weinstein et al., 2021), with alternative thresholds reported for sensitivity. Errors are stratified by crown size, isolation and setting, so that H1c and H1d can be tested directly.</w:t>
-      </w:r>
-    </w:p>
-    <w:p>
-      <w:pPr>
-        <w:spacing w:after="0" w:line="360"/>
-        <w:ind w:firstLine="720"/>
-        <w:jc w:val="both"/>
-      </w:pPr>
-      <w:r>
-        <w:t xml:space="preserve">For the second question, each crown is described by the mean and variability of its reflectance, its principal components and narrow-band vegetation indices, by LiDAR height percentiles and crown area and shape, and by RGB texture. Classifiers are trained on seven sensor combinations (hyperspectral, LiDAR and RGB alone, in pairs and all together) for post oak, blackjack oak, eastern redcedar and other broadleaf trees. To isolate the effect of crown quality, the same classifier and training protocol are applied to manual reference crowns, guided foundation-model crowns and supervised-model crowns, so that any difference in accuracy can be attributed to the crown outlines rather than to the classifier.</w:t>
-      </w:r>
-    </w:p>
-    <w:p>
-      <w:pPr>
-        <w:spacing w:after="0" w:line="360"/>
-        <w:ind w:firstLine="720"/>
-        <w:jc w:val="both"/>
-      </w:pPr>
-      <w:r>
-        <w:t xml:space="preserve">Rigor is secured in the analysis as well as in the design. Accuracy is measured with confusion-matrix statistics for remotely sensed maps (Congalton, 1991), and kappa is not used, because it has been shown to be misleading for comparing maps (Pontius &amp; Millones, 2011). Because classes are unbalanced, macro-averaged F1 is reported alongside overall accuracy and per-class precision, recall and F1. Because nearby trees are spatially autocorrelated and random splits overstate accuracy (Roberts et al., 2017; Ploton et al., 2020), all training and testing use spatial blocks, and confidence intervals are obtained by bootstrap resampling at the block level rather than by treating every crown as independent. Paired comparisons of classification correctness on the same crowns are made with McNemar’s test (Foody, 2004), and paired differences in continuous measures such as intersection-over-union are tested with block-level permutation. A sensor ablation, in which each analysis is repeated with one dataset removed, is used to measure the contribution of each sensor directly rather than infer it. All processing is scripted in Python and R under version control, with product versions, model weights, prompts, thresholds and random seeds recorded for reproducibility.</w:t>
-      </w:r>
-    </w:p>
-    <w:p>
-      <w:pPr>
-        <w:spacing w:after="0" w:line="360"/>
-        <w:ind w:firstLine="720"/>
-        <w:jc w:val="both"/>
-      </w:pPr>
-      <w:r>
-        <w:t xml:space="preserve">The work is organized as a chain in which the output of each stage becomes the input of the next. Data checks and the analysis protocol are completed in months one and two, reference crowns and prompt pilots in months three and four, and the delineation experiment in months five to seven, so that the first question is answered independently of the rest. Species classification and sensor ablation follow in months eight and nine, uncertainty and sensitivity analyses in month ten, and writing and defense in months eleven and twelve.</w:t>
-      </w:r>
-    </w:p>
-    <w:p>
-      <w:pPr>
-        <w:spacing w:after="0" w:line="360"/>
-        <w:ind w:firstLine="720"/>
-        <w:jc w:val="both"/>
-      </w:pPr>
-      <w:r>
-        <w:t xml:space="preserve">The expected contribution to knowledge is threefold. Conceptually, prompt-level fusion is extended from two sensors to three and tested in a setting where it is most likely to fail, so that the conditions under which structural prompts and spectral constraints help or harm foundation models are identified. Empirically, a controlled, spatially independent comparison of supervised crown models and guided foundation models is provided for an open savanna, together with a measurement of how much RGB, LiDAR and hyperspectral data each contribute and of whether better crowns produce better species maps. Methodologically, a documented set of reference crowns and species labels is produced for a site absent from the NEON crown benchmark and is released with the code for reuse. Because the design is controlled, its answer is valuable whether guidance proves helpful, harmful or mixed.</w:t>
-      </w:r>
-    </w:p>
-    <w:p>
-      <w:pPr>
-        <w:spacing w:after="0" w:line="360"/>
-        <w:ind w:firstLine="720"/>
-        <w:jc w:val="both"/>
-      </w:pPr>
-      <w:r>
-        <w:t xml:space="preserve">The practical significance follows from the openness of the data. Tree-level maps of oaks and redcedar can support decisions on cedar removal and prescribed burning at LBJ, and because the same three datasets are collected by NEON at grassland and savanna sites across the United States, the workflow is designed so that it can be tested at other sites affected by woody plant encroachment. The limits of the framework are stated openly. Field records and 2024 imagery may not describe identical trees, the 1 m hyperspectral pixels limit the analysis of very small crowns, the 2022–2025 hyperspectral product is provisional and may be revised, and evidence from a single site cannot by itself demonstrate transfer to other savannas. These limits are addressed through flagging, stratified reporting and proportionate claims, and none of them affects the central test of the framework.</w:t>
+        <w:t xml:space="preserve">Supervised crown models are accurate within their training domain, but they have not been tested in open savanna. DeepForest, a RetinaNet detector (Lin et al., 2017), was pretrained on NEON RGB imagery with labels generated from LiDAR (Weinstein et al., 2019, 2020), and Detectree2, a Mask R-CNN model (He et al., 2017), was developed in tropical forests (Ball et al., 2023). Foundation models are not restricted to one domain, but on remote sensing imagery their output has been found to be uneven and strongly dependent on prompts (Osco et al., 2023). In drone imagery of forests, SAM used without adaptation did not match a trained Mask R-CNN, although its segmentation was improved when elevation data were supplied (Teng et al., 2025). Most directly, LiDAR has already been used with SAM 2 as a filter for box prompts and as a source of point prompts on 592 trees from NEON forest plots, and object-level F1 scores ranged from 35% to 92% depending only on how the prompts were generated (Zhu et al., 2025). The use of LiDAR to prompt foundation models is therefore not new. What has not been established is whether this guidance still works where trees are sparse and the background is grass and soil rather than canopy, whether hyperspectral information adds a further constraint beyond structure, and whether the crowns produced in this way improve the species maps that are ultimately needed. These three unanswered points define the gap that the proposed research will address.</w:t>
+      </w:r>
+    </w:p>
+    <w:p>
+      <w:pPr>
+        <w:spacing w:after="0" w:line="360"/>
+        <w:ind w:firstLine="720"/>
+        <w:jc w:val="both"/>
+      </w:pPr>
+      <w:r>
+        <w:t xml:space="preserve">From this gap, the central proposition of the framework is derived: in a landscape unlike the one a model was trained on, auxiliary sensors are most valuable when they are used to direct a foundation model rather than to replace it or to be added to its input. Each sensor will therefore be assigned to the role for which its physics is best suited. RGB imagery, in which crown edges are best resolved, will be retained as the image to be segmented. LiDAR will be used to tell the model where each tree is, through tree tops converted into point prompts and crown extents converted into box prompts, and to discard objects below an operational height threshold. Hyperspectral imagery will be used to tell the model what is vegetation, through a mask that excludes bare soil and senescent grass. This form of integration can be described as prompt-level fusion, placed between the feature and decision levels of Pohl and van Genderen (1998), and it is proposed here to extend it from two sensors to three. The resulting crowns will then be used at the feature level, where spectral, structural and textural descriptors will be extracted for each crown and combined for species classification. Delineation and classification are thereby linked in a single chain: if crown outlines are more accurate, fewer mixed edge pixels should be included in each crown, and species should be classified more accurately. This link will be tested as part of the framework rather than assumed.</w:t>
+      </w:r>
+    </w:p>
+    <w:p>
+      <w:pPr>
+        <w:spacing w:after="0" w:line="360"/>
+        <w:ind w:firstLine="720"/>
+        <w:jc w:val="both"/>
+      </w:pPr>
+      <w:r>
+        <w:t xml:space="preserve">The variables follow directly from this proposition. For crown delineation, model family and guidance condition (RGB-only, LiDAR prompts, and LiDAR prompts with the hyperspectral constraint) will be treated as independent variables, and stem-based detection rate, precision, recall, F1 score and intersection-over-union as dependent variables. For species classification, sensor combination and crown source (manual reference crowns, guided foundation-model crowns and supervised-model crowns) will be treated as independent variables, and macro-averaged and per-class F1 scores as dependent variables. Crown size, crown isolation and setting (open grassland or woodland) will be treated as moderators, because the effect of guidance is expected to differ where crowns are small, touching or surrounded by grass. Field-to-flight change, co-registration error, shadow and class imbalance will be recorded as potential confounders.</w:t>
+      </w:r>
+    </w:p>
+    <w:p>
+      <w:pPr>
+        <w:spacing w:after="0" w:line="360"/>
+        <w:ind w:firstLine="720"/>
+        <w:jc w:val="both"/>
+      </w:pPr>
+      <w:r>
+        <w:t xml:space="preserve">Two research questions are proposed. The first asks how accurately individual tree crowns can be delineated in an open savanna by supervised deep learning models and by foundation models, and by how much the foundation models can be improved by LiDAR and hyperspectral guidance. Under H1a, RGB-only SAM and SAM 2 are expected to produce lower precision than the best supervised model, because grass patches, shrubs and shadows are likely to be segmented as objects when no height or spectral constraint is applied. Under H1b, LiDAR point and box prompts are expected to improve detection and delineation over RGB-only prompting, because explicit information on tree location and extent is supplied. Under H1c, the addition of the hyperspectral constraint is expected to reduce false positives further in open grassland, but to provide little benefit, or to introduce errors, for small crowns whose 1 m pixels mix tree and background. Under H1d, the gains from guidance are expected to vary with crown size, isolation and setting, and they will therefore be reported by stratum rather than as a single average.</w:t>
+      </w:r>
+    </w:p>
+    <w:p>
+      <w:pPr>
+        <w:spacing w:after="0" w:line="360"/>
+        <w:ind w:firstLine="720"/>
+        <w:jc w:val="both"/>
+      </w:pPr>
+      <w:r>
+        <w:t xml:space="preserve">The second asks which sensor combinations best support species classification, and whether crown quality matters. Under H2a, hyperspectral features are expected to contribute most, because species differences in pigments, water and leaf structure are expressed spectrally (Asner, 1998; Ustin &amp; Gamon, 2010), while LiDAR height and crown shape are expected to add complementary information, particularly for eastern redcedar, whose dense, conical evergreen crowns differ structurally from the broad crowns of the oaks. Under H2b, combined hyperspectral, LiDAR and RGB features are expected to outperform any single sensor, which will be tested by ablation rather than assumed. Under H2c, classification on manually delineated crowns is expected to set an upper bound, and crowns from the best guided foundation model are expected to come closer to that bound than crowns or boxes from the supervised models, because fewer background pixels should be included. Three classifiers will be compared under identical conditions: random forest (Breiman, 2001), support vector machines, which have performed well on high-dimensional hyperspectral data (Melgani &amp; Bruzzone, 2004), and a one-dimensional convolutional neural network, in which features are learned along the spectrum (Hu et al., 2015). This comparison will show whether a deep learning classifier adds value when labeled trees are limited.</w:t>
+      </w:r>
+    </w:p>
+    <w:p>
+      <w:pPr>
+        <w:spacing w:after="0" w:line="360"/>
+        <w:ind w:firstLine="720"/>
+        <w:jc w:val="both"/>
+      </w:pPr>
+      <w:r>
+        <w:t xml:space="preserve">The methodology will be aligned with these questions through a controlled design built entirely on open NEON data. All sensor products will be taken from a single flight year, 2024, so that every crown is imaged under the same conditions by all three sensors: the 10 cm RGB mosaic (DP3.30010.001), the discrete-return LiDAR point cloud (DP1.30003.001) and canopy height model (DP3.30015.001), and hyperspectral surface reflectance (DP3.30006.002), from which water-vapor bands near 1340–1445 nm and 1790–1955 nm will be removed. Ground truth will be taken from NEON vegetation structure records (NEON, 2026), in which 862 live trees at least 2 m tall are recorded in 47 plots, with stem positions available for 517 of them (353 oaks, 69 eastern redcedar and 95 other broadleaf trees, mainly hackberry, cedar elm and winged elm). Stem coordinates will be computed from plot reference points, distances and azimuths, and five plots spanning woodland and grassland will be selected for detailed analysis. Before the full experiment, a feasibility check will be carried out to confirm three-sensor coverage, product release status and co-registration for every selected plot, to count the usable labels per species, and to estimate annotation time. If labels prove too few for four classes, classification will be reduced to the contrast between redcedar and oaks.</w:t>
+      </w:r>
+    </w:p>
+    <w:p>
+      <w:pPr>
+        <w:spacing w:after="0" w:line="360"/>
+        <w:ind w:firstLine="720"/>
+        <w:jc w:val="both"/>
+      </w:pPr>
+      <w:r>
+        <w:t xml:space="preserve">Field stems show where trees are but not the shape of their crowns, so detection against stems and delineation against crown outlines will be treated as separate evaluations. A second reference set of 150 to 300 crowns will be delineated manually on the RGB mosaic with the canopy height model as a guide, stratified by setting, crown size and isolation, and a subset will be delineated by two annotators so that agreement can be reported. Stems whose crowns cannot be matched confidently to the imagery, including trees burned or cleared since the survey, will be flagged and excluded. Information leakage will be prevented by design. The data will be divided into spatial blocks defined by plot before any tuning, and the height threshold, local-maximum window, prompt settings and fine-tuning will be chosen on training blocks only. The hyperspectral mask will be created with a documented spectral rule that uses neither species labels nor test crowns, and the 2 m height threshold will be treated as an operational definition whose effect is examined in a sensitivity analysis.</w:t>
+      </w:r>
+    </w:p>
+    <w:p>
+      <w:pPr>
+        <w:spacing w:after="0" w:line="360"/>
+        <w:ind w:firstLine="720"/>
+        <w:jc w:val="both"/>
+      </w:pPr>
+      <w:r>
+        <w:t xml:space="preserve">For the first question, the same held-out blocks and reference crowns will be used for every method. SAM and SAM 2, accessed through samgeo (Wu &amp; Osco, 2023), will be run with RGB-only automatic prompting, with LiDAR point prompts, with LiDAR box prompts, and with LiDAR prompts plus the hyperspectral constraint. Tree tops will be extracted from the canopy height model by local-maximum filtering with a height-dependent window (Popescu &amp; Wynne, 2004), and crown extents will be taken from LiDAR tree segmentation in lidR (Roussel et al., 2020). DeepForest and Detectree2 will be run with their published weights and, where the number of reference crowns allows, after fine-tuning on training blocks. Predicted crowns will be matched one-to-one to reference crowns with a matching threshold fixed before analysis, following the NEON crown benchmark (Weinstein et al., 2021), with alternative thresholds reported for sensitivity. Errors will be stratified by crown size, isolation and setting, so that H1c and H1d can be tested directly.</w:t>
+      </w:r>
+    </w:p>
+    <w:p>
+      <w:pPr>
+        <w:spacing w:after="0" w:line="360"/>
+        <w:ind w:firstLine="720"/>
+        <w:jc w:val="both"/>
+      </w:pPr>
+      <w:r>
+        <w:t xml:space="preserve">For the second question, each crown will be described by the mean and variability of its reflectance, its principal components and narrow-band vegetation indices, by LiDAR height percentiles and crown area and shape, and by RGB texture. Classifiers will be trained on seven sensor combinations (hyperspectral, LiDAR and RGB alone, in pairs and all together) for post oak, blackjack oak, eastern redcedar and other broadleaf trees. To isolate the effect of crown quality, the same classifier and training protocol will be applied to manual reference crowns, guided foundation-model crowns and supervised-model crowns, so that any difference in accuracy can be attributed to the crown outlines rather than to the classifier.</w:t>
+      </w:r>
+    </w:p>
+    <w:p>
+      <w:pPr>
+        <w:spacing w:after="0" w:line="360"/>
+        <w:ind w:firstLine="720"/>
+        <w:jc w:val="both"/>
+      </w:pPr>
+      <w:r>
+        <w:t xml:space="preserve">Rigor will be secured in the analysis as well as in the design. Accuracy will be measured with confusion-matrix statistics for remotely sensed maps (Congalton, 1991), and kappa will not be used, because it has been shown to be misleading for comparing maps (Pontius &amp; Millones, 2011). Because classes are unbalanced, macro-averaged F1 will be reported alongside overall accuracy and per-class precision, recall and F1. Because nearby trees are spatially autocorrelated and random splits overstate accuracy (Roberts et al., 2017; Ploton et al., 2020), all training and testing will use spatial blocks, and confidence intervals will be obtained by bootstrap resampling at the block level rather than by treating every crown as independent. Paired comparisons of classification correctness on the same crowns will be made with McNemar’s test (Foody, 2004), and paired differences in continuous measures such as intersection-over-union will be tested with block-level permutation. A sensor ablation, in which each analysis is repeated with one dataset removed, will measure the contribution of each sensor directly rather than infer it. All processing will be scripted in Python and R under version control, with product versions, model weights, prompts, thresholds and random seeds recorded for reproducibility.</w:t>
+      </w:r>
+    </w:p>
+    <w:p>
+      <w:pPr>
+        <w:spacing w:after="0" w:line="360"/>
+        <w:ind w:firstLine="720"/>
+        <w:jc w:val="both"/>
+      </w:pPr>
+      <w:r>
+        <w:t xml:space="preserve">The work will be organized as a chain in which the output of each stage becomes the input of the next. Data checks and the analysis protocol are planned for months one and two, reference crowns and prompt pilots for months three and four, and the delineation experiment for months five to seven, so that the first question can be answered independently of the rest. Species classification and sensor ablation will follow in months eight and nine, uncertainty and sensitivity analyses in month ten, and writing and defense in months eleven and twelve.</w:t>
+      </w:r>
+    </w:p>
+    <w:p>
+      <w:pPr>
+        <w:spacing w:after="0" w:line="360"/>
+        <w:ind w:firstLine="720"/>
+        <w:jc w:val="both"/>
+      </w:pPr>
+      <w:r>
+        <w:t xml:space="preserve">The expected contribution to knowledge is threefold. Conceptually, prompt-level fusion will be extended from two sensors to three and tested in a setting where it is most likely to fail, so that the conditions under which structural prompts and spectral constraints help or harm foundation models can be identified. Empirically, the study is expected to provide a controlled, spatially independent comparison of supervised crown models and guided foundation models in an open savanna, together with a measurement of how much RGB, LiDAR and hyperspectral data each contribute and of whether better crowns produce better species maps. Methodologically, a documented set of reference crowns and species labels will be produced for a site absent from the NEON crown benchmark and released with the code for reuse. Because the design is controlled, its answer will be valuable whether guidance proves helpful, harmful or mixed.</w:t>
+      </w:r>
+    </w:p>
+    <w:p>
+      <w:pPr>
+        <w:spacing w:after="0" w:line="360"/>
+        <w:ind w:firstLine="720"/>
+        <w:jc w:val="both"/>
+      </w:pPr>
+      <w:r>
+        <w:t xml:space="preserve">The practical significance follows from the openness of the data. Tree-level maps of oaks and redcedar could support decisions on cedar removal and prescribed burning at LBJ, and because the same three datasets are collected by NEON at grassland and savanna sites across the United States, the workflow will be designed so that it can be tested at other sites affected by woody plant encroachment. The limits of the framework are recognized in advance. Field records and 2024 imagery may not describe identical trees, the 1 m hyperspectral pixels limit the analysis of very small crowns, the 2022–2025 hyperspectral product is provisional and may be revised, and evidence from a single site cannot by itself demonstrate transfer to other savannas. These limits will be addressed through flagging, stratified reporting and proportionate claims, and none of them affects the central test of the framework.</w:t>
       </w:r>
     </w:p>
     <w:p>

</xml_diff>

<commit_message>
Framework: add list of abbreviations
Co-Authored-By: Claude Opus 5.5 <noreply@anthropic.com>
Claude-Session: https://claude.ai/code/session_0132bxCMLAKTHUnyQV3MmGfs
</commit_message>
<xml_diff>
--- a/thesis/Proposed_Research_Framework_Poudel.docx
+++ b/thesis/Proposed_Research_Framework_Poudel.docx
@@ -2,6 +2,1057 @@
 <file path=word/document.xml><?xml version="1.0" encoding="utf-8"?>
 <w:document xmlns:wpc="http://schemas.microsoft.com/office/word/2010/wordprocessingCanvas" xmlns:mc="http://schemas.openxmlformats.org/markup-compatibility/2006" xmlns:o="urn:schemas-microsoft-com:office:office" xmlns:r="http://schemas.openxmlformats.org/officeDocument/2006/relationships" xmlns:m="http://schemas.openxmlformats.org/officeDocument/2006/math" xmlns:v="urn:schemas-microsoft-com:vml" xmlns:wp14="http://schemas.microsoft.com/office/word/2010/wordprocessingDrawing" xmlns:wp="http://schemas.openxmlformats.org/drawingml/2006/wordprocessingDrawing" xmlns:w10="urn:schemas-microsoft-com:office:word" xmlns:w="http://schemas.openxmlformats.org/wordprocessingml/2006/main" xmlns:w14="http://schemas.microsoft.com/office/word/2010/wordml" xmlns:w15="http://schemas.microsoft.com/office/word/2012/wordml" xmlns:wpg="http://schemas.microsoft.com/office/word/2010/wordprocessingGroup" xmlns:wpi="http://schemas.microsoft.com/office/word/2010/wordprocessingInk" xmlns:wne="http://schemas.microsoft.com/office/word/2006/wordml" xmlns:wps="http://schemas.microsoft.com/office/word/2010/wordprocessingShape" xmlns:cx="http://schemas.microsoft.com/office/drawing/2014/chartex" xmlns:cx1="http://schemas.microsoft.com/office/drawing/2015/9/8/chartex" xmlns:cx2="http://schemas.microsoft.com/office/drawing/2015/10/21/chartex" xmlns:cx3="http://schemas.microsoft.com/office/drawing/2016/5/9/chartex" xmlns:cx4="http://schemas.microsoft.com/office/drawing/2016/5/10/chartex" xmlns:cx5="http://schemas.microsoft.com/office/drawing/2016/5/11/chartex" xmlns:cx6="http://schemas.microsoft.com/office/drawing/2016/5/12/chartex" xmlns:cx7="http://schemas.microsoft.com/office/drawing/2016/5/13/chartex" xmlns:cx8="http://schemas.microsoft.com/office/drawing/2016/5/14/chartex" xmlns:aink="http://schemas.microsoft.com/office/drawing/2016/ink" xmlns:am3d="http://schemas.microsoft.com/office/drawing/2017/model3d" xmlns:w16cex="http://schemas.microsoft.com/office/word/2018/wordml/cex" xmlns:w16cid="http://schemas.microsoft.com/office/word/2016/wordml/cid" xmlns:w16="http://schemas.microsoft.com/office/word/2018/wordml" xmlns:w16sdtdh="http://schemas.microsoft.com/office/word/2020/wordml/sdtdatahash" xmlns:w16se="http://schemas.microsoft.com/office/word/2015/wordml/symex" mc:Ignorable="w14 w15 wp14">
   <w:body>
+    <w:p>
+      <w:pPr>
+        <w:spacing w:after="360"/>
+        <w:jc w:val="center"/>
+      </w:pPr>
+      <w:r>
+        <w:rPr>
+          <w:b/>
+          <w:bCs/>
+          <w:sz w:val="24"/>
+          <w:szCs w:val="24"/>
+        </w:rPr>
+        <w:t xml:space="preserve">List of Abbreviations</w:t>
+      </w:r>
+    </w:p>
+    <w:tbl>
+      <w:tblPr>
+        <w:tblW w:type="dxa" w:w="9360"/>
+        <w:tblBorders>
+          <w:top w:val="none" w:color="FFFFFF" w:sz="0"/>
+          <w:left w:val="none" w:color="FFFFFF" w:sz="0"/>
+          <w:bottom w:val="none" w:color="FFFFFF" w:sz="0"/>
+          <w:right w:val="none" w:color="FFFFFF" w:sz="0"/>
+          <w:insideH w:val="none" w:color="FFFFFF" w:sz="0"/>
+          <w:insideV w:val="none" w:color="FFFFFF" w:sz="0"/>
+        </w:tblBorders>
+      </w:tblPr>
+      <w:tblGrid>
+        <w:gridCol w:w="2000"/>
+        <w:gridCol w:w="7360"/>
+      </w:tblGrid>
+      <w:tr>
+        <w:tc>
+          <w:tcPr>
+            <w:tcW w:type="dxa" w:w="2000"/>
+            <w:tcBorders>
+              <w:top w:val="none" w:color="FFFFFF" w:sz="0"/>
+              <w:left w:val="none" w:color="FFFFFF" w:sz="0"/>
+              <w:bottom w:val="none" w:color="FFFFFF" w:sz="0"/>
+              <w:right w:val="none" w:color="FFFFFF" w:sz="0"/>
+            </w:tcBorders>
+          </w:tcPr>
+          <w:p>
+            <w:pPr>
+              <w:spacing w:after="40" w:before="40" w:line="300"/>
+            </w:pPr>
+            <w:r>
+              <w:rPr>
+                <w:b/>
+                <w:bCs/>
+              </w:rPr>
+              <w:t xml:space="preserve">AI</w:t>
+            </w:r>
+          </w:p>
+        </w:tc>
+        <w:tc>
+          <w:tcPr>
+            <w:tcW w:type="dxa" w:w="7360"/>
+            <w:tcBorders>
+              <w:top w:val="none" w:color="FFFFFF" w:sz="0"/>
+              <w:left w:val="none" w:color="FFFFFF" w:sz="0"/>
+              <w:bottom w:val="none" w:color="FFFFFF" w:sz="0"/>
+              <w:right w:val="none" w:color="FFFFFF" w:sz="0"/>
+            </w:tcBorders>
+          </w:tcPr>
+          <w:p>
+            <w:pPr>
+              <w:spacing w:after="40" w:before="40" w:line="300"/>
+            </w:pPr>
+            <w:r>
+              <w:rPr>
+                <w:b w:val="false"/>
+                <w:bCs w:val="false"/>
+              </w:rPr>
+              <w:t xml:space="preserve">Artificial Intelligence</w:t>
+            </w:r>
+          </w:p>
+        </w:tc>
+      </w:tr>
+      <w:tr>
+        <w:tc>
+          <w:tcPr>
+            <w:tcW w:type="dxa" w:w="2000"/>
+            <w:tcBorders>
+              <w:top w:val="none" w:color="FFFFFF" w:sz="0"/>
+              <w:left w:val="none" w:color="FFFFFF" w:sz="0"/>
+              <w:bottom w:val="none" w:color="FFFFFF" w:sz="0"/>
+              <w:right w:val="none" w:color="FFFFFF" w:sz="0"/>
+            </w:tcBorders>
+          </w:tcPr>
+          <w:p>
+            <w:pPr>
+              <w:spacing w:after="40" w:before="40" w:line="300"/>
+            </w:pPr>
+            <w:r>
+              <w:rPr>
+                <w:b/>
+                <w:bCs/>
+              </w:rPr>
+              <w:t xml:space="preserve">CLBJ</w:t>
+            </w:r>
+          </w:p>
+        </w:tc>
+        <w:tc>
+          <w:tcPr>
+            <w:tcW w:type="dxa" w:w="7360"/>
+            <w:tcBorders>
+              <w:top w:val="none" w:color="FFFFFF" w:sz="0"/>
+              <w:left w:val="none" w:color="FFFFFF" w:sz="0"/>
+              <w:bottom w:val="none" w:color="FFFFFF" w:sz="0"/>
+              <w:right w:val="none" w:color="FFFFFF" w:sz="0"/>
+            </w:tcBorders>
+          </w:tcPr>
+          <w:p>
+            <w:pPr>
+              <w:spacing w:after="40" w:before="40" w:line="300"/>
+            </w:pPr>
+            <w:r>
+              <w:rPr>
+                <w:b w:val="false"/>
+                <w:bCs w:val="false"/>
+              </w:rPr>
+              <w:t xml:space="preserve">NEON site code for the LBJ National Grassland</w:t>
+            </w:r>
+          </w:p>
+        </w:tc>
+      </w:tr>
+      <w:tr>
+        <w:tc>
+          <w:tcPr>
+            <w:tcW w:type="dxa" w:w="2000"/>
+            <w:tcBorders>
+              <w:top w:val="none" w:color="FFFFFF" w:sz="0"/>
+              <w:left w:val="none" w:color="FFFFFF" w:sz="0"/>
+              <w:bottom w:val="none" w:color="FFFFFF" w:sz="0"/>
+              <w:right w:val="none" w:color="FFFFFF" w:sz="0"/>
+            </w:tcBorders>
+          </w:tcPr>
+          <w:p>
+            <w:pPr>
+              <w:spacing w:after="40" w:before="40" w:line="300"/>
+            </w:pPr>
+            <w:r>
+              <w:rPr>
+                <w:b/>
+                <w:bCs/>
+              </w:rPr>
+              <w:t xml:space="preserve">cm</w:t>
+            </w:r>
+          </w:p>
+        </w:tc>
+        <w:tc>
+          <w:tcPr>
+            <w:tcW w:type="dxa" w:w="7360"/>
+            <w:tcBorders>
+              <w:top w:val="none" w:color="FFFFFF" w:sz="0"/>
+              <w:left w:val="none" w:color="FFFFFF" w:sz="0"/>
+              <w:bottom w:val="none" w:color="FFFFFF" w:sz="0"/>
+              <w:right w:val="none" w:color="FFFFFF" w:sz="0"/>
+            </w:tcBorders>
+          </w:tcPr>
+          <w:p>
+            <w:pPr>
+              <w:spacing w:after="40" w:before="40" w:line="300"/>
+            </w:pPr>
+            <w:r>
+              <w:rPr>
+                <w:b w:val="false"/>
+                <w:bCs w:val="false"/>
+              </w:rPr>
+              <w:t xml:space="preserve">Centimeter</w:t>
+            </w:r>
+          </w:p>
+        </w:tc>
+      </w:tr>
+      <w:tr>
+        <w:tc>
+          <w:tcPr>
+            <w:tcW w:type="dxa" w:w="2000"/>
+            <w:tcBorders>
+              <w:top w:val="none" w:color="FFFFFF" w:sz="0"/>
+              <w:left w:val="none" w:color="FFFFFF" w:sz="0"/>
+              <w:bottom w:val="none" w:color="FFFFFF" w:sz="0"/>
+              <w:right w:val="none" w:color="FFFFFF" w:sz="0"/>
+            </w:tcBorders>
+          </w:tcPr>
+          <w:p>
+            <w:pPr>
+              <w:spacing w:after="40" w:before="40" w:line="300"/>
+            </w:pPr>
+            <w:r>
+              <w:rPr>
+                <w:b/>
+                <w:bCs/>
+              </w:rPr>
+              <w:t xml:space="preserve">CNN</w:t>
+            </w:r>
+          </w:p>
+        </w:tc>
+        <w:tc>
+          <w:tcPr>
+            <w:tcW w:type="dxa" w:w="7360"/>
+            <w:tcBorders>
+              <w:top w:val="none" w:color="FFFFFF" w:sz="0"/>
+              <w:left w:val="none" w:color="FFFFFF" w:sz="0"/>
+              <w:bottom w:val="none" w:color="FFFFFF" w:sz="0"/>
+              <w:right w:val="none" w:color="FFFFFF" w:sz="0"/>
+            </w:tcBorders>
+          </w:tcPr>
+          <w:p>
+            <w:pPr>
+              <w:spacing w:after="40" w:before="40" w:line="300"/>
+            </w:pPr>
+            <w:r>
+              <w:rPr>
+                <w:b w:val="false"/>
+                <w:bCs w:val="false"/>
+              </w:rPr>
+              <w:t xml:space="preserve">Convolutional Neural Network</w:t>
+            </w:r>
+          </w:p>
+        </w:tc>
+      </w:tr>
+      <w:tr>
+        <w:tc>
+          <w:tcPr>
+            <w:tcW w:type="dxa" w:w="2000"/>
+            <w:tcBorders>
+              <w:top w:val="none" w:color="FFFFFF" w:sz="0"/>
+              <w:left w:val="none" w:color="FFFFFF" w:sz="0"/>
+              <w:bottom w:val="none" w:color="FFFFFF" w:sz="0"/>
+              <w:right w:val="none" w:color="FFFFFF" w:sz="0"/>
+            </w:tcBorders>
+          </w:tcPr>
+          <w:p>
+            <w:pPr>
+              <w:spacing w:after="40" w:before="40" w:line="300"/>
+            </w:pPr>
+            <w:r>
+              <w:rPr>
+                <w:b/>
+                <w:bCs/>
+              </w:rPr>
+              <w:t xml:space="preserve">DP1</w:t>
+            </w:r>
+          </w:p>
+        </w:tc>
+        <w:tc>
+          <w:tcPr>
+            <w:tcW w:type="dxa" w:w="7360"/>
+            <w:tcBorders>
+              <w:top w:val="none" w:color="FFFFFF" w:sz="0"/>
+              <w:left w:val="none" w:color="FFFFFF" w:sz="0"/>
+              <w:bottom w:val="none" w:color="FFFFFF" w:sz="0"/>
+              <w:right w:val="none" w:color="FFFFFF" w:sz="0"/>
+            </w:tcBorders>
+          </w:tcPr>
+          <w:p>
+            <w:pPr>
+              <w:spacing w:after="40" w:before="40" w:line="300"/>
+            </w:pPr>
+            <w:r>
+              <w:rPr>
+                <w:b w:val="false"/>
+                <w:bCs w:val="false"/>
+              </w:rPr>
+              <w:t xml:space="preserve">NEON Level 1 Data Product</w:t>
+            </w:r>
+          </w:p>
+        </w:tc>
+      </w:tr>
+      <w:tr>
+        <w:tc>
+          <w:tcPr>
+            <w:tcW w:type="dxa" w:w="2000"/>
+            <w:tcBorders>
+              <w:top w:val="none" w:color="FFFFFF" w:sz="0"/>
+              <w:left w:val="none" w:color="FFFFFF" w:sz="0"/>
+              <w:bottom w:val="none" w:color="FFFFFF" w:sz="0"/>
+              <w:right w:val="none" w:color="FFFFFF" w:sz="0"/>
+            </w:tcBorders>
+          </w:tcPr>
+          <w:p>
+            <w:pPr>
+              <w:spacing w:after="40" w:before="40" w:line="300"/>
+            </w:pPr>
+            <w:r>
+              <w:rPr>
+                <w:b/>
+                <w:bCs/>
+              </w:rPr>
+              <w:t xml:space="preserve">DP3</w:t>
+            </w:r>
+          </w:p>
+        </w:tc>
+        <w:tc>
+          <w:tcPr>
+            <w:tcW w:type="dxa" w:w="7360"/>
+            <w:tcBorders>
+              <w:top w:val="none" w:color="FFFFFF" w:sz="0"/>
+              <w:left w:val="none" w:color="FFFFFF" w:sz="0"/>
+              <w:bottom w:val="none" w:color="FFFFFF" w:sz="0"/>
+              <w:right w:val="none" w:color="FFFFFF" w:sz="0"/>
+            </w:tcBorders>
+          </w:tcPr>
+          <w:p>
+            <w:pPr>
+              <w:spacing w:after="40" w:before="40" w:line="300"/>
+            </w:pPr>
+            <w:r>
+              <w:rPr>
+                <w:b w:val="false"/>
+                <w:bCs w:val="false"/>
+              </w:rPr>
+              <w:t xml:space="preserve">NEON Level 3 Data Product</w:t>
+            </w:r>
+          </w:p>
+        </w:tc>
+      </w:tr>
+      <w:tr>
+        <w:tc>
+          <w:tcPr>
+            <w:tcW w:type="dxa" w:w="2000"/>
+            <w:tcBorders>
+              <w:top w:val="none" w:color="FFFFFF" w:sz="0"/>
+              <w:left w:val="none" w:color="FFFFFF" w:sz="0"/>
+              <w:bottom w:val="none" w:color="FFFFFF" w:sz="0"/>
+              <w:right w:val="none" w:color="FFFFFF" w:sz="0"/>
+            </w:tcBorders>
+          </w:tcPr>
+          <w:p>
+            <w:pPr>
+              <w:spacing w:after="40" w:before="40" w:line="300"/>
+            </w:pPr>
+            <w:r>
+              <w:rPr>
+                <w:b/>
+                <w:bCs/>
+              </w:rPr>
+              <w:t xml:space="preserve">F1</w:t>
+            </w:r>
+          </w:p>
+        </w:tc>
+        <w:tc>
+          <w:tcPr>
+            <w:tcW w:type="dxa" w:w="7360"/>
+            <w:tcBorders>
+              <w:top w:val="none" w:color="FFFFFF" w:sz="0"/>
+              <w:left w:val="none" w:color="FFFFFF" w:sz="0"/>
+              <w:bottom w:val="none" w:color="FFFFFF" w:sz="0"/>
+              <w:right w:val="none" w:color="FFFFFF" w:sz="0"/>
+            </w:tcBorders>
+          </w:tcPr>
+          <w:p>
+            <w:pPr>
+              <w:spacing w:after="40" w:before="40" w:line="300"/>
+            </w:pPr>
+            <w:r>
+              <w:rPr>
+                <w:b w:val="false"/>
+                <w:bCs w:val="false"/>
+              </w:rPr>
+              <w:t xml:space="preserve">F1 score, the harmonic mean of precision and recall</w:t>
+            </w:r>
+          </w:p>
+        </w:tc>
+      </w:tr>
+      <w:tr>
+        <w:tc>
+          <w:tcPr>
+            <w:tcW w:type="dxa" w:w="2000"/>
+            <w:tcBorders>
+              <w:top w:val="none" w:color="FFFFFF" w:sz="0"/>
+              <w:left w:val="none" w:color="FFFFFF" w:sz="0"/>
+              <w:bottom w:val="none" w:color="FFFFFF" w:sz="0"/>
+              <w:right w:val="none" w:color="FFFFFF" w:sz="0"/>
+            </w:tcBorders>
+          </w:tcPr>
+          <w:p>
+            <w:pPr>
+              <w:spacing w:after="40" w:before="40" w:line="300"/>
+            </w:pPr>
+            <w:r>
+              <w:rPr>
+                <w:b/>
+                <w:bCs/>
+              </w:rPr>
+              <w:t xml:space="preserve">GeoAI</w:t>
+            </w:r>
+          </w:p>
+        </w:tc>
+        <w:tc>
+          <w:tcPr>
+            <w:tcW w:type="dxa" w:w="7360"/>
+            <w:tcBorders>
+              <w:top w:val="none" w:color="FFFFFF" w:sz="0"/>
+              <w:left w:val="none" w:color="FFFFFF" w:sz="0"/>
+              <w:bottom w:val="none" w:color="FFFFFF" w:sz="0"/>
+              <w:right w:val="none" w:color="FFFFFF" w:sz="0"/>
+            </w:tcBorders>
+          </w:tcPr>
+          <w:p>
+            <w:pPr>
+              <w:spacing w:after="40" w:before="40" w:line="300"/>
+            </w:pPr>
+            <w:r>
+              <w:rPr>
+                <w:b w:val="false"/>
+                <w:bCs w:val="false"/>
+              </w:rPr>
+              <w:t xml:space="preserve">Geospatial Artificial Intelligence</w:t>
+            </w:r>
+          </w:p>
+        </w:tc>
+      </w:tr>
+      <w:tr>
+        <w:tc>
+          <w:tcPr>
+            <w:tcW w:type="dxa" w:w="2000"/>
+            <w:tcBorders>
+              <w:top w:val="none" w:color="FFFFFF" w:sz="0"/>
+              <w:left w:val="none" w:color="FFFFFF" w:sz="0"/>
+              <w:bottom w:val="none" w:color="FFFFFF" w:sz="0"/>
+              <w:right w:val="none" w:color="FFFFFF" w:sz="0"/>
+            </w:tcBorders>
+          </w:tcPr>
+          <w:p>
+            <w:pPr>
+              <w:spacing w:after="40" w:before="40" w:line="300"/>
+            </w:pPr>
+            <w:r>
+              <w:rPr>
+                <w:b/>
+                <w:bCs/>
+              </w:rPr>
+              <w:t xml:space="preserve">H1a–H1d</w:t>
+            </w:r>
+          </w:p>
+        </w:tc>
+        <w:tc>
+          <w:tcPr>
+            <w:tcW w:type="dxa" w:w="7360"/>
+            <w:tcBorders>
+              <w:top w:val="none" w:color="FFFFFF" w:sz="0"/>
+              <w:left w:val="none" w:color="FFFFFF" w:sz="0"/>
+              <w:bottom w:val="none" w:color="FFFFFF" w:sz="0"/>
+              <w:right w:val="none" w:color="FFFFFF" w:sz="0"/>
+            </w:tcBorders>
+          </w:tcPr>
+          <w:p>
+            <w:pPr>
+              <w:spacing w:after="40" w:before="40" w:line="300"/>
+            </w:pPr>
+            <w:r>
+              <w:rPr>
+                <w:b w:val="false"/>
+                <w:bCs w:val="false"/>
+              </w:rPr>
+              <w:t xml:space="preserve">Hypotheses for the first research question</w:t>
+            </w:r>
+          </w:p>
+        </w:tc>
+      </w:tr>
+      <w:tr>
+        <w:tc>
+          <w:tcPr>
+            <w:tcW w:type="dxa" w:w="2000"/>
+            <w:tcBorders>
+              <w:top w:val="none" w:color="FFFFFF" w:sz="0"/>
+              <w:left w:val="none" w:color="FFFFFF" w:sz="0"/>
+              <w:bottom w:val="none" w:color="FFFFFF" w:sz="0"/>
+              <w:right w:val="none" w:color="FFFFFF" w:sz="0"/>
+            </w:tcBorders>
+          </w:tcPr>
+          <w:p>
+            <w:pPr>
+              <w:spacing w:after="40" w:before="40" w:line="300"/>
+            </w:pPr>
+            <w:r>
+              <w:rPr>
+                <w:b/>
+                <w:bCs/>
+              </w:rPr>
+              <w:t xml:space="preserve">H2a–H2c</w:t>
+            </w:r>
+          </w:p>
+        </w:tc>
+        <w:tc>
+          <w:tcPr>
+            <w:tcW w:type="dxa" w:w="7360"/>
+            <w:tcBorders>
+              <w:top w:val="none" w:color="FFFFFF" w:sz="0"/>
+              <w:left w:val="none" w:color="FFFFFF" w:sz="0"/>
+              <w:bottom w:val="none" w:color="FFFFFF" w:sz="0"/>
+              <w:right w:val="none" w:color="FFFFFF" w:sz="0"/>
+            </w:tcBorders>
+          </w:tcPr>
+          <w:p>
+            <w:pPr>
+              <w:spacing w:after="40" w:before="40" w:line="300"/>
+            </w:pPr>
+            <w:r>
+              <w:rPr>
+                <w:b w:val="false"/>
+                <w:bCs w:val="false"/>
+              </w:rPr>
+              <w:t xml:space="preserve">Hypotheses for the second research question</w:t>
+            </w:r>
+          </w:p>
+        </w:tc>
+      </w:tr>
+      <w:tr>
+        <w:tc>
+          <w:tcPr>
+            <w:tcW w:type="dxa" w:w="2000"/>
+            <w:tcBorders>
+              <w:top w:val="none" w:color="FFFFFF" w:sz="0"/>
+              <w:left w:val="none" w:color="FFFFFF" w:sz="0"/>
+              <w:bottom w:val="none" w:color="FFFFFF" w:sz="0"/>
+              <w:right w:val="none" w:color="FFFFFF" w:sz="0"/>
+            </w:tcBorders>
+          </w:tcPr>
+          <w:p>
+            <w:pPr>
+              <w:spacing w:after="40" w:before="40" w:line="300"/>
+            </w:pPr>
+            <w:r>
+              <w:rPr>
+                <w:b/>
+                <w:bCs/>
+              </w:rPr>
+              <w:t xml:space="preserve">LBJ</w:t>
+            </w:r>
+          </w:p>
+        </w:tc>
+        <w:tc>
+          <w:tcPr>
+            <w:tcW w:type="dxa" w:w="7360"/>
+            <w:tcBorders>
+              <w:top w:val="none" w:color="FFFFFF" w:sz="0"/>
+              <w:left w:val="none" w:color="FFFFFF" w:sz="0"/>
+              <w:bottom w:val="none" w:color="FFFFFF" w:sz="0"/>
+              <w:right w:val="none" w:color="FFFFFF" w:sz="0"/>
+            </w:tcBorders>
+          </w:tcPr>
+          <w:p>
+            <w:pPr>
+              <w:spacing w:after="40" w:before="40" w:line="300"/>
+            </w:pPr>
+            <w:r>
+              <w:rPr>
+                <w:b w:val="false"/>
+                <w:bCs w:val="false"/>
+              </w:rPr>
+              <w:t xml:space="preserve">Lyndon B. Johnson (National Grassland)</w:t>
+            </w:r>
+          </w:p>
+        </w:tc>
+      </w:tr>
+      <w:tr>
+        <w:tc>
+          <w:tcPr>
+            <w:tcW w:type="dxa" w:w="2000"/>
+            <w:tcBorders>
+              <w:top w:val="none" w:color="FFFFFF" w:sz="0"/>
+              <w:left w:val="none" w:color="FFFFFF" w:sz="0"/>
+              <w:bottom w:val="none" w:color="FFFFFF" w:sz="0"/>
+              <w:right w:val="none" w:color="FFFFFF" w:sz="0"/>
+            </w:tcBorders>
+          </w:tcPr>
+          <w:p>
+            <w:pPr>
+              <w:spacing w:after="40" w:before="40" w:line="300"/>
+            </w:pPr>
+            <w:r>
+              <w:rPr>
+                <w:b/>
+                <w:bCs/>
+              </w:rPr>
+              <w:t xml:space="preserve">LiDAR</w:t>
+            </w:r>
+          </w:p>
+        </w:tc>
+        <w:tc>
+          <w:tcPr>
+            <w:tcW w:type="dxa" w:w="7360"/>
+            <w:tcBorders>
+              <w:top w:val="none" w:color="FFFFFF" w:sz="0"/>
+              <w:left w:val="none" w:color="FFFFFF" w:sz="0"/>
+              <w:bottom w:val="none" w:color="FFFFFF" w:sz="0"/>
+              <w:right w:val="none" w:color="FFFFFF" w:sz="0"/>
+            </w:tcBorders>
+          </w:tcPr>
+          <w:p>
+            <w:pPr>
+              <w:spacing w:after="40" w:before="40" w:line="300"/>
+            </w:pPr>
+            <w:r>
+              <w:rPr>
+                <w:b w:val="false"/>
+                <w:bCs w:val="false"/>
+              </w:rPr>
+              <w:t xml:space="preserve">Light Detection and Ranging</w:t>
+            </w:r>
+          </w:p>
+        </w:tc>
+      </w:tr>
+      <w:tr>
+        <w:tc>
+          <w:tcPr>
+            <w:tcW w:type="dxa" w:w="2000"/>
+            <w:tcBorders>
+              <w:top w:val="none" w:color="FFFFFF" w:sz="0"/>
+              <w:left w:val="none" w:color="FFFFFF" w:sz="0"/>
+              <w:bottom w:val="none" w:color="FFFFFF" w:sz="0"/>
+              <w:right w:val="none" w:color="FFFFFF" w:sz="0"/>
+            </w:tcBorders>
+          </w:tcPr>
+          <w:p>
+            <w:pPr>
+              <w:spacing w:after="40" w:before="40" w:line="300"/>
+            </w:pPr>
+            <w:r>
+              <w:rPr>
+                <w:b/>
+                <w:bCs/>
+              </w:rPr>
+              <w:t xml:space="preserve">m</w:t>
+            </w:r>
+          </w:p>
+        </w:tc>
+        <w:tc>
+          <w:tcPr>
+            <w:tcW w:type="dxa" w:w="7360"/>
+            <w:tcBorders>
+              <w:top w:val="none" w:color="FFFFFF" w:sz="0"/>
+              <w:left w:val="none" w:color="FFFFFF" w:sz="0"/>
+              <w:bottom w:val="none" w:color="FFFFFF" w:sz="0"/>
+              <w:right w:val="none" w:color="FFFFFF" w:sz="0"/>
+            </w:tcBorders>
+          </w:tcPr>
+          <w:p>
+            <w:pPr>
+              <w:spacing w:after="40" w:before="40" w:line="300"/>
+            </w:pPr>
+            <w:r>
+              <w:rPr>
+                <w:b w:val="false"/>
+                <w:bCs w:val="false"/>
+              </w:rPr>
+              <w:t xml:space="preserve">Meter</w:t>
+            </w:r>
+          </w:p>
+        </w:tc>
+      </w:tr>
+      <w:tr>
+        <w:tc>
+          <w:tcPr>
+            <w:tcW w:type="dxa" w:w="2000"/>
+            <w:tcBorders>
+              <w:top w:val="none" w:color="FFFFFF" w:sz="0"/>
+              <w:left w:val="none" w:color="FFFFFF" w:sz="0"/>
+              <w:bottom w:val="none" w:color="FFFFFF" w:sz="0"/>
+              <w:right w:val="none" w:color="FFFFFF" w:sz="0"/>
+            </w:tcBorders>
+          </w:tcPr>
+          <w:p>
+            <w:pPr>
+              <w:spacing w:after="40" w:before="40" w:line="300"/>
+            </w:pPr>
+            <w:r>
+              <w:rPr>
+                <w:b/>
+                <w:bCs/>
+              </w:rPr>
+              <w:t xml:space="preserve">NEON</w:t>
+            </w:r>
+          </w:p>
+        </w:tc>
+        <w:tc>
+          <w:tcPr>
+            <w:tcW w:type="dxa" w:w="7360"/>
+            <w:tcBorders>
+              <w:top w:val="none" w:color="FFFFFF" w:sz="0"/>
+              <w:left w:val="none" w:color="FFFFFF" w:sz="0"/>
+              <w:bottom w:val="none" w:color="FFFFFF" w:sz="0"/>
+              <w:right w:val="none" w:color="FFFFFF" w:sz="0"/>
+            </w:tcBorders>
+          </w:tcPr>
+          <w:p>
+            <w:pPr>
+              <w:spacing w:after="40" w:before="40" w:line="300"/>
+            </w:pPr>
+            <w:r>
+              <w:rPr>
+                <w:b w:val="false"/>
+                <w:bCs w:val="false"/>
+              </w:rPr>
+              <w:t xml:space="preserve">National Ecological Observatory Network</w:t>
+            </w:r>
+          </w:p>
+        </w:tc>
+      </w:tr>
+      <w:tr>
+        <w:tc>
+          <w:tcPr>
+            <w:tcW w:type="dxa" w:w="2000"/>
+            <w:tcBorders>
+              <w:top w:val="none" w:color="FFFFFF" w:sz="0"/>
+              <w:left w:val="none" w:color="FFFFFF" w:sz="0"/>
+              <w:bottom w:val="none" w:color="FFFFFF" w:sz="0"/>
+              <w:right w:val="none" w:color="FFFFFF" w:sz="0"/>
+            </w:tcBorders>
+          </w:tcPr>
+          <w:p>
+            <w:pPr>
+              <w:spacing w:after="40" w:before="40" w:line="300"/>
+            </w:pPr>
+            <w:r>
+              <w:rPr>
+                <w:b/>
+                <w:bCs/>
+              </w:rPr>
+              <w:t xml:space="preserve">nm</w:t>
+            </w:r>
+          </w:p>
+        </w:tc>
+        <w:tc>
+          <w:tcPr>
+            <w:tcW w:type="dxa" w:w="7360"/>
+            <w:tcBorders>
+              <w:top w:val="none" w:color="FFFFFF" w:sz="0"/>
+              <w:left w:val="none" w:color="FFFFFF" w:sz="0"/>
+              <w:bottom w:val="none" w:color="FFFFFF" w:sz="0"/>
+              <w:right w:val="none" w:color="FFFFFF" w:sz="0"/>
+            </w:tcBorders>
+          </w:tcPr>
+          <w:p>
+            <w:pPr>
+              <w:spacing w:after="40" w:before="40" w:line="300"/>
+            </w:pPr>
+            <w:r>
+              <w:rPr>
+                <w:b w:val="false"/>
+                <w:bCs w:val="false"/>
+              </w:rPr>
+              <w:t xml:space="preserve">Nanometer</w:t>
+            </w:r>
+          </w:p>
+        </w:tc>
+      </w:tr>
+      <w:tr>
+        <w:tc>
+          <w:tcPr>
+            <w:tcW w:type="dxa" w:w="2000"/>
+            <w:tcBorders>
+              <w:top w:val="none" w:color="FFFFFF" w:sz="0"/>
+              <w:left w:val="none" w:color="FFFFFF" w:sz="0"/>
+              <w:bottom w:val="none" w:color="FFFFFF" w:sz="0"/>
+              <w:right w:val="none" w:color="FFFFFF" w:sz="0"/>
+            </w:tcBorders>
+          </w:tcPr>
+          <w:p>
+            <w:pPr>
+              <w:spacing w:after="40" w:before="40" w:line="300"/>
+            </w:pPr>
+            <w:r>
+              <w:rPr>
+                <w:b/>
+                <w:bCs/>
+              </w:rPr>
+              <w:t xml:space="preserve">R-CNN</w:t>
+            </w:r>
+          </w:p>
+        </w:tc>
+        <w:tc>
+          <w:tcPr>
+            <w:tcW w:type="dxa" w:w="7360"/>
+            <w:tcBorders>
+              <w:top w:val="none" w:color="FFFFFF" w:sz="0"/>
+              <w:left w:val="none" w:color="FFFFFF" w:sz="0"/>
+              <w:bottom w:val="none" w:color="FFFFFF" w:sz="0"/>
+              <w:right w:val="none" w:color="FFFFFF" w:sz="0"/>
+            </w:tcBorders>
+          </w:tcPr>
+          <w:p>
+            <w:pPr>
+              <w:spacing w:after="40" w:before="40" w:line="300"/>
+            </w:pPr>
+            <w:r>
+              <w:rPr>
+                <w:b w:val="false"/>
+                <w:bCs w:val="false"/>
+              </w:rPr>
+              <w:t xml:space="preserve">Region-based Convolutional Neural Network</w:t>
+            </w:r>
+          </w:p>
+        </w:tc>
+      </w:tr>
+      <w:tr>
+        <w:tc>
+          <w:tcPr>
+            <w:tcW w:type="dxa" w:w="2000"/>
+            <w:tcBorders>
+              <w:top w:val="none" w:color="FFFFFF" w:sz="0"/>
+              <w:left w:val="none" w:color="FFFFFF" w:sz="0"/>
+              <w:bottom w:val="none" w:color="FFFFFF" w:sz="0"/>
+              <w:right w:val="none" w:color="FFFFFF" w:sz="0"/>
+            </w:tcBorders>
+          </w:tcPr>
+          <w:p>
+            <w:pPr>
+              <w:spacing w:after="40" w:before="40" w:line="300"/>
+            </w:pPr>
+            <w:r>
+              <w:rPr>
+                <w:b/>
+                <w:bCs/>
+              </w:rPr>
+              <w:t xml:space="preserve">RGB</w:t>
+            </w:r>
+          </w:p>
+        </w:tc>
+        <w:tc>
+          <w:tcPr>
+            <w:tcW w:type="dxa" w:w="7360"/>
+            <w:tcBorders>
+              <w:top w:val="none" w:color="FFFFFF" w:sz="0"/>
+              <w:left w:val="none" w:color="FFFFFF" w:sz="0"/>
+              <w:bottom w:val="none" w:color="FFFFFF" w:sz="0"/>
+              <w:right w:val="none" w:color="FFFFFF" w:sz="0"/>
+            </w:tcBorders>
+          </w:tcPr>
+          <w:p>
+            <w:pPr>
+              <w:spacing w:after="40" w:before="40" w:line="300"/>
+            </w:pPr>
+            <w:r>
+              <w:rPr>
+                <w:b w:val="false"/>
+                <w:bCs w:val="false"/>
+              </w:rPr>
+              <w:t xml:space="preserve">Red, Green and Blue</w:t>
+            </w:r>
+          </w:p>
+        </w:tc>
+      </w:tr>
+      <w:tr>
+        <w:tc>
+          <w:tcPr>
+            <w:tcW w:type="dxa" w:w="2000"/>
+            <w:tcBorders>
+              <w:top w:val="none" w:color="FFFFFF" w:sz="0"/>
+              <w:left w:val="none" w:color="FFFFFF" w:sz="0"/>
+              <w:bottom w:val="none" w:color="FFFFFF" w:sz="0"/>
+              <w:right w:val="none" w:color="FFFFFF" w:sz="0"/>
+            </w:tcBorders>
+          </w:tcPr>
+          <w:p>
+            <w:pPr>
+              <w:spacing w:after="40" w:before="40" w:line="300"/>
+            </w:pPr>
+            <w:r>
+              <w:rPr>
+                <w:b/>
+                <w:bCs/>
+              </w:rPr>
+              <w:t xml:space="preserve">SAM</w:t>
+            </w:r>
+          </w:p>
+        </w:tc>
+        <w:tc>
+          <w:tcPr>
+            <w:tcW w:type="dxa" w:w="7360"/>
+            <w:tcBorders>
+              <w:top w:val="none" w:color="FFFFFF" w:sz="0"/>
+              <w:left w:val="none" w:color="FFFFFF" w:sz="0"/>
+              <w:bottom w:val="none" w:color="FFFFFF" w:sz="0"/>
+              <w:right w:val="none" w:color="FFFFFF" w:sz="0"/>
+            </w:tcBorders>
+          </w:tcPr>
+          <w:p>
+            <w:pPr>
+              <w:spacing w:after="40" w:before="40" w:line="300"/>
+            </w:pPr>
+            <w:r>
+              <w:rPr>
+                <w:b w:val="false"/>
+                <w:bCs w:val="false"/>
+              </w:rPr>
+              <w:t xml:space="preserve">Segment Anything Model</w:t>
+            </w:r>
+          </w:p>
+        </w:tc>
+      </w:tr>
+      <w:tr>
+        <w:tc>
+          <w:tcPr>
+            <w:tcW w:type="dxa" w:w="2000"/>
+            <w:tcBorders>
+              <w:top w:val="none" w:color="FFFFFF" w:sz="0"/>
+              <w:left w:val="none" w:color="FFFFFF" w:sz="0"/>
+              <w:bottom w:val="none" w:color="FFFFFF" w:sz="0"/>
+              <w:right w:val="none" w:color="FFFFFF" w:sz="0"/>
+            </w:tcBorders>
+          </w:tcPr>
+          <w:p>
+            <w:pPr>
+              <w:spacing w:after="40" w:before="40" w:line="300"/>
+            </w:pPr>
+            <w:r>
+              <w:rPr>
+                <w:b/>
+                <w:bCs/>
+              </w:rPr>
+              <w:t xml:space="preserve">SAM 2</w:t>
+            </w:r>
+          </w:p>
+        </w:tc>
+        <w:tc>
+          <w:tcPr>
+            <w:tcW w:type="dxa" w:w="7360"/>
+            <w:tcBorders>
+              <w:top w:val="none" w:color="FFFFFF" w:sz="0"/>
+              <w:left w:val="none" w:color="FFFFFF" w:sz="0"/>
+              <w:bottom w:val="none" w:color="FFFFFF" w:sz="0"/>
+              <w:right w:val="none" w:color="FFFFFF" w:sz="0"/>
+            </w:tcBorders>
+          </w:tcPr>
+          <w:p>
+            <w:pPr>
+              <w:spacing w:after="40" w:before="40" w:line="300"/>
+            </w:pPr>
+            <w:r>
+              <w:rPr>
+                <w:b w:val="false"/>
+                <w:bCs w:val="false"/>
+              </w:rPr>
+              <w:t xml:space="preserve">Segment Anything Model 2</w:t>
+            </w:r>
+          </w:p>
+        </w:tc>
+      </w:tr>
+      <w:tr>
+        <w:tc>
+          <w:tcPr>
+            <w:tcW w:type="dxa" w:w="2000"/>
+            <w:tcBorders>
+              <w:top w:val="none" w:color="FFFFFF" w:sz="0"/>
+              <w:left w:val="none" w:color="FFFFFF" w:sz="0"/>
+              <w:bottom w:val="none" w:color="FFFFFF" w:sz="0"/>
+              <w:right w:val="none" w:color="FFFFFF" w:sz="0"/>
+            </w:tcBorders>
+          </w:tcPr>
+          <w:p>
+            <w:pPr>
+              <w:spacing w:after="40" w:before="40" w:line="300"/>
+            </w:pPr>
+            <w:r>
+              <w:rPr>
+                <w:b/>
+                <w:bCs/>
+              </w:rPr>
+              <w:t xml:space="preserve">US</w:t>
+            </w:r>
+          </w:p>
+        </w:tc>
+        <w:tc>
+          <w:tcPr>
+            <w:tcW w:type="dxa" w:w="7360"/>
+            <w:tcBorders>
+              <w:top w:val="none" w:color="FFFFFF" w:sz="0"/>
+              <w:left w:val="none" w:color="FFFFFF" w:sz="0"/>
+              <w:bottom w:val="none" w:color="FFFFFF" w:sz="0"/>
+              <w:right w:val="none" w:color="FFFFFF" w:sz="0"/>
+            </w:tcBorders>
+          </w:tcPr>
+          <w:p>
+            <w:pPr>
+              <w:spacing w:after="40" w:before="40" w:line="300"/>
+            </w:pPr>
+            <w:r>
+              <w:rPr>
+                <w:b w:val="false"/>
+                <w:bCs w:val="false"/>
+              </w:rPr>
+              <w:t xml:space="preserve">United States</w:t>
+            </w:r>
+          </w:p>
+        </w:tc>
+      </w:tr>
+      <w:tr>
+        <w:tc>
+          <w:tcPr>
+            <w:tcW w:type="dxa" w:w="2000"/>
+            <w:tcBorders>
+              <w:top w:val="none" w:color="FFFFFF" w:sz="0"/>
+              <w:left w:val="none" w:color="FFFFFF" w:sz="0"/>
+              <w:bottom w:val="none" w:color="FFFFFF" w:sz="0"/>
+              <w:right w:val="none" w:color="FFFFFF" w:sz="0"/>
+            </w:tcBorders>
+          </w:tcPr>
+          <w:p>
+            <w:pPr>
+              <w:spacing w:after="40" w:before="40" w:line="300"/>
+            </w:pPr>
+            <w:r>
+              <w:rPr>
+                <w:b/>
+                <w:bCs/>
+              </w:rPr>
+              <w:t xml:space="preserve">USDA</w:t>
+            </w:r>
+          </w:p>
+        </w:tc>
+        <w:tc>
+          <w:tcPr>
+            <w:tcW w:type="dxa" w:w="7360"/>
+            <w:tcBorders>
+              <w:top w:val="none" w:color="FFFFFF" w:sz="0"/>
+              <w:left w:val="none" w:color="FFFFFF" w:sz="0"/>
+              <w:bottom w:val="none" w:color="FFFFFF" w:sz="0"/>
+              <w:right w:val="none" w:color="FFFFFF" w:sz="0"/>
+            </w:tcBorders>
+          </w:tcPr>
+          <w:p>
+            <w:pPr>
+              <w:spacing w:after="40" w:before="40" w:line="300"/>
+            </w:pPr>
+            <w:r>
+              <w:rPr>
+                <w:b w:val="false"/>
+                <w:bCs w:val="false"/>
+              </w:rPr>
+              <w:t xml:space="preserve">United States Department of Agriculture</w:t>
+            </w:r>
+          </w:p>
+        </w:tc>
+      </w:tr>
+    </w:tbl>
+    <w:p>
+      <w:pPr>
+        <w:sectPr>
+          <w:footerReference w:type="default" r:id="rId7"/>
+          <w:pgSz w:w="12240" w:h="15840" w:orient="portrait"/>
+          <w:pgMar w:top="1440" w:right="1440" w:bottom="1440" w:left="1440" w:header="708" w:footer="708" w:gutter="0"/>
+          <w:pgNumType w:start="1" w:fmt="lowerRoman"/>
+          <w:docGrid w:linePitch="360"/>
+        </w:sectPr>
+      </w:pPr>
+    </w:p>
     <w:p>
       <w:pPr>
         <w:spacing w:after="120" w:line="360"/>
@@ -661,10 +1712,10 @@
       </w:r>
     </w:p>
     <w:sectPr>
-      <w:footerReference w:type="default" r:id="rId7"/>
+      <w:footerReference w:type="default" r:id="rId8"/>
       <w:pgSz w:w="12240" w:h="15840" w:orient="portrait"/>
       <w:pgMar w:top="1440" w:right="1440" w:bottom="1440" w:left="1440" w:header="708" w:footer="708" w:gutter="0"/>
-      <w:pgNumType/>
+      <w:pgNumType w:start="1" w:fmt="decimal"/>
       <w:docGrid w:linePitch="360"/>
     </w:sectPr>
   </w:body>
@@ -713,6 +1764,26 @@
 </file>
 
 <file path=word/footer1.xml><?xml version="1.0" encoding="utf-8"?>
+<w:ftr xmlns:wpc="http://schemas.microsoft.com/office/word/2010/wordprocessingCanvas" xmlns:mc="http://schemas.openxmlformats.org/markup-compatibility/2006" xmlns:o="urn:schemas-microsoft-com:office:office" xmlns:r="http://schemas.openxmlformats.org/officeDocument/2006/relationships" xmlns:m="http://schemas.openxmlformats.org/officeDocument/2006/math" xmlns:v="urn:schemas-microsoft-com:vml" xmlns:wp14="http://schemas.microsoft.com/office/word/2010/wordprocessingDrawing" xmlns:wp="http://schemas.openxmlformats.org/drawingml/2006/wordprocessingDrawing" xmlns:w10="urn:schemas-microsoft-com:office:word" xmlns:w="http://schemas.openxmlformats.org/wordprocessingml/2006/main" xmlns:w14="http://schemas.microsoft.com/office/word/2010/wordml" xmlns:w15="http://schemas.microsoft.com/office/word/2012/wordml" xmlns:wpg="http://schemas.microsoft.com/office/word/2010/wordprocessingGroup" xmlns:wpi="http://schemas.microsoft.com/office/word/2010/wordprocessingInk" xmlns:wne="http://schemas.microsoft.com/office/word/2006/wordml" xmlns:wps="http://schemas.microsoft.com/office/word/2010/wordprocessingShape">
+  <w:p>
+    <w:pPr>
+      <w:jc w:val="center"/>
+    </w:pPr>
+    <w:r>
+      <w:rPr>
+        <w:sz w:val="20"/>
+        <w:szCs w:val="20"/>
+      </w:rPr>
+      <w:fldChar w:fldCharType="begin"/>
+      <w:instrText xml:space="preserve">PAGE</w:instrText>
+      <w:fldChar w:fldCharType="separate"/>
+      <w:fldChar w:fldCharType="end"/>
+    </w:r>
+  </w:p>
+</w:ftr>
+</file>
+
+<file path=word/footer2.xml><?xml version="1.0" encoding="utf-8"?>
 <w:ftr xmlns:wpc="http://schemas.microsoft.com/office/word/2010/wordprocessingCanvas" xmlns:mc="http://schemas.openxmlformats.org/markup-compatibility/2006" xmlns:o="urn:schemas-microsoft-com:office:office" xmlns:r="http://schemas.openxmlformats.org/officeDocument/2006/relationships" xmlns:m="http://schemas.openxmlformats.org/officeDocument/2006/math" xmlns:v="urn:schemas-microsoft-com:vml" xmlns:wp14="http://schemas.microsoft.com/office/word/2010/wordprocessingDrawing" xmlns:wp="http://schemas.openxmlformats.org/drawingml/2006/wordprocessingDrawing" xmlns:w10="urn:schemas-microsoft-com:office:word" xmlns:w="http://schemas.openxmlformats.org/wordprocessingml/2006/main" xmlns:w14="http://schemas.microsoft.com/office/word/2010/wordml" xmlns:w15="http://schemas.microsoft.com/office/word/2012/wordml" xmlns:wpg="http://schemas.microsoft.com/office/word/2010/wordprocessingGroup" xmlns:wpi="http://schemas.microsoft.com/office/word/2010/wordprocessingInk" xmlns:wne="http://schemas.microsoft.com/office/word/2006/wordml" xmlns:wps="http://schemas.microsoft.com/office/word/2010/wordprocessingShape">
   <w:p>
     <w:pPr>

</xml_diff>